<commit_message>
Start each main section on a new page; remove contribution appendix
Co-Authored-By: Claude Opus 5.5 <noreply@anthropic.com>
Claude-Session: https://claude.ai/code/session_0174ASkiVUfb5uMqZ6D8cKUt
</commit_message>
<xml_diff>
--- a/Bao_cao_cuoi_ky_Employee_Attrition.docx
+++ b/Bao_cao_cuoi_ky_Employee_Attrition.docx
@@ -1266,7 +1266,7 @@
         </w:rPr>
         <w:t xml:space="preserve">2. Mô tả dữ liệu</w:t>
         <w:tab/>
-        <w:t xml:space="preserve">8</w:t>
+        <w:t xml:space="preserve">9</w:t>
       </w:r>
     </w:p>
     <w:p>
@@ -1286,7 +1286,7 @@
         </w:rPr>
         <w:t xml:space="preserve">2.1. Nguồn và bản chất dữ liệu</w:t>
         <w:tab/>
-        <w:t xml:space="preserve">8</w:t>
+        <w:t xml:space="preserve">9</w:t>
       </w:r>
     </w:p>
     <w:p>
@@ -1306,7 +1306,7 @@
         </w:rPr>
         <w:t xml:space="preserve">2.2. Nhóm biến chính</w:t>
         <w:tab/>
-        <w:t xml:space="preserve">8</w:t>
+        <w:t xml:space="preserve">9</w:t>
       </w:r>
     </w:p>
     <w:p>
@@ -1326,7 +1326,7 @@
         </w:rPr>
         <w:t xml:space="preserve">2.3. Thống kê mô tả ban đầu</w:t>
         <w:tab/>
-        <w:t xml:space="preserve">9</w:t>
+        <w:t xml:space="preserve">10</w:t>
       </w:r>
     </w:p>
     <w:p>
@@ -1348,7 +1348,7 @@
         </w:rPr>
         <w:t xml:space="preserve">3. Tiền xử lý, làm sạch và mô hình hóa dữ liệu</w:t>
         <w:tab/>
-        <w:t xml:space="preserve">9</w:t>
+        <w:t xml:space="preserve">11</w:t>
       </w:r>
     </w:p>
     <w:p>
@@ -1368,7 +1368,7 @@
         </w:rPr>
         <w:t xml:space="preserve">3.1. Kiểm tra chất lượng dữ liệu</w:t>
         <w:tab/>
-        <w:t xml:space="preserve">9</w:t>
+        <w:t xml:space="preserve">11</w:t>
       </w:r>
     </w:p>
     <w:p>
@@ -1388,7 +1388,7 @@
         </w:rPr>
         <w:t xml:space="preserve">3.2. Biến đổi và tạo biến mới (feature engineering)</w:t>
         <w:tab/>
-        <w:t xml:space="preserve">10</w:t>
+        <w:t xml:space="preserve">11</w:t>
       </w:r>
     </w:p>
     <w:p>
@@ -1408,7 +1408,7 @@
         </w:rPr>
         <w:t xml:space="preserve">3.3. Mô hình dữ liệu trong Power BI</w:t>
         <w:tab/>
-        <w:t xml:space="preserve">11</w:t>
+        <w:t xml:space="preserve">12</w:t>
       </w:r>
     </w:p>
     <w:p>
@@ -1428,7 +1428,7 @@
         </w:rPr>
         <w:t xml:space="preserve">3.4. Các measure DAX chính</w:t>
         <w:tab/>
-        <w:t xml:space="preserve">11</w:t>
+        <w:t xml:space="preserve">13</w:t>
       </w:r>
     </w:p>
     <w:p>
@@ -1450,7 +1450,7 @@
         </w:rPr>
         <w:t xml:space="preserve">4. Trực quan hóa dữ liệu: thiết kế dashboard Power BI</w:t>
         <w:tab/>
-        <w:t xml:space="preserve">12</w:t>
+        <w:t xml:space="preserve">15</w:t>
       </w:r>
     </w:p>
     <w:p>
@@ -1470,7 +1470,7 @@
         </w:rPr>
         <w:t xml:space="preserve">4.1. Nguyên tắc thiết kế</w:t>
         <w:tab/>
-        <w:t xml:space="preserve">13</w:t>
+        <w:t xml:space="preserve">15</w:t>
       </w:r>
     </w:p>
     <w:p>
@@ -1490,7 +1490,7 @@
         </w:rPr>
         <w:t xml:space="preserve">4.2. Cấu trúc 6 trang</w:t>
         <w:tab/>
-        <w:t xml:space="preserve">13</w:t>
+        <w:t xml:space="preserve">15</w:t>
       </w:r>
     </w:p>
     <w:p>
@@ -1510,7 +1510,7 @@
         </w:rPr>
         <w:t xml:space="preserve">4.3. Tương tác</w:t>
         <w:tab/>
-        <w:t xml:space="preserve">16</w:t>
+        <w:t xml:space="preserve">18</w:t>
       </w:r>
     </w:p>
     <w:p>
@@ -1532,7 +1532,7 @@
         </w:rPr>
         <w:t xml:space="preserve">5. Khai thác dữ liệu: kết quả phân tích khám phá</w:t>
         <w:tab/>
-        <w:t xml:space="preserve">16</w:t>
+        <w:t xml:space="preserve">19</w:t>
       </w:r>
     </w:p>
     <w:p>
@@ -1552,7 +1552,7 @@
         </w:rPr>
         <w:t xml:space="preserve">5.1. Tổng quan: vấn đề nằm ở tuyến đầu</w:t>
         <w:tab/>
-        <w:t xml:space="preserve">16</w:t>
+        <w:t xml:space="preserve">19</w:t>
       </w:r>
     </w:p>
     <w:p>
@@ -1572,7 +1572,7 @@
         </w:rPr>
         <w:t xml:space="preserve">5.2. Chân dung người nghỉ: trẻ, mới vào, cấp thấp, độc thân</w:t>
         <w:tab/>
-        <w:t xml:space="preserve">17</w:t>
+        <w:t xml:space="preserve">19</w:t>
       </w:r>
     </w:p>
     <w:p>
@@ -1592,7 +1592,7 @@
         </w:rPr>
         <w:t xml:space="preserve">5.3. Điều kiện làm việc: làm thêm giờ là yếu tố mạnh nhất</w:t>
         <w:tab/>
-        <w:t xml:space="preserve">18</w:t>
+        <w:t xml:space="preserve">20</w:t>
       </w:r>
     </w:p>
     <w:p>
@@ -1612,7 +1612,7 @@
         </w:rPr>
         <w:t xml:space="preserve">5.4. Lương và đãi ngộ: tiền quan trọng, nhưng không theo cách nhiều người nghĩ</w:t>
         <w:tab/>
-        <w:t xml:space="preserve">19</w:t>
+        <w:t xml:space="preserve">21</w:t>
       </w:r>
     </w:p>
     <w:p>
@@ -1632,7 +1632,7 @@
         </w:rPr>
         <w:t xml:space="preserve">5.5. Hài lòng, gắn kết và phát triển</w:t>
         <w:tab/>
-        <w:t xml:space="preserve">19</w:t>
+        <w:t xml:space="preserve">21</w:t>
       </w:r>
     </w:p>
     <w:p>
@@ -1652,7 +1652,7 @@
         </w:rPr>
         <w:t xml:space="preserve">5.6. Rủi ro cộng dồn</w:t>
         <w:tab/>
-        <w:t xml:space="preserve">20</w:t>
+        <w:t xml:space="preserve">22</w:t>
       </w:r>
     </w:p>
     <w:p>
@@ -1674,7 +1674,7 @@
         </w:rPr>
         <w:t xml:space="preserve">6. Mô hình hóa và kiểm định giả thuyết</w:t>
         <w:tab/>
-        <w:t xml:space="preserve">20</w:t>
+        <w:t xml:space="preserve">23</w:t>
       </w:r>
     </w:p>
     <w:p>
@@ -1694,7 +1694,7 @@
         </w:rPr>
         <w:t xml:space="preserve">6.1. Phương pháp</w:t>
         <w:tab/>
-        <w:t xml:space="preserve">20</w:t>
+        <w:t xml:space="preserve">23</w:t>
       </w:r>
     </w:p>
     <w:p>
@@ -1714,7 +1714,7 @@
         </w:rPr>
         <w:t xml:space="preserve">6.2. Kết quả kiểm định giả thuyết</w:t>
         <w:tab/>
-        <w:t xml:space="preserve">21</w:t>
+        <w:t xml:space="preserve">23</w:t>
       </w:r>
     </w:p>
     <w:p>
@@ -1734,7 +1734,7 @@
         </w:rPr>
         <w:t xml:space="preserve">6.3. Đánh giá mô hình</w:t>
         <w:tab/>
-        <w:t xml:space="preserve">22</w:t>
+        <w:t xml:space="preserve">25</w:t>
       </w:r>
     </w:p>
     <w:p>
@@ -1754,7 +1754,7 @@
         </w:rPr>
         <w:t xml:space="preserve">6.4. Cây quyết định: quy tắc dễ dùng cho HR</w:t>
         <w:tab/>
-        <w:t xml:space="preserve">23</w:t>
+        <w:t xml:space="preserve">26</w:t>
       </w:r>
     </w:p>
     <w:p>
@@ -1774,7 +1774,7 @@
         </w:rPr>
         <w:t xml:space="preserve">6.5. Mô phỏng tác động: giới hạn làm thêm giờ</w:t>
         <w:tab/>
-        <w:t xml:space="preserve">24</w:t>
+        <w:t xml:space="preserve">27</w:t>
       </w:r>
     </w:p>
     <w:p>
@@ -1796,7 +1796,7 @@
         </w:rPr>
         <w:t xml:space="preserve">7. Đề xuất giải pháp cho tổ chức</w:t>
         <w:tab/>
-        <w:t xml:space="preserve">24</w:t>
+        <w:t xml:space="preserve">28</w:t>
       </w:r>
     </w:p>
     <w:p>
@@ -1816,7 +1816,7 @@
         </w:rPr>
         <w:t xml:space="preserve">7.1. Kế hoạch hành động ưu tiên</w:t>
         <w:tab/>
-        <w:t xml:space="preserve">25</w:t>
+        <w:t xml:space="preserve">28</w:t>
       </w:r>
     </w:p>
     <w:p>
@@ -1836,7 +1836,7 @@
         </w:rPr>
         <w:t xml:space="preserve">7.2. Hệ thống cảnh báo sớm</w:t>
         <w:tab/>
-        <w:t xml:space="preserve">25</w:t>
+        <w:t xml:space="preserve">29</w:t>
       </w:r>
     </w:p>
     <w:p>
@@ -1856,7 +1856,7 @@
         </w:rPr>
         <w:t xml:space="preserve">7.3. Mục tiêu đề xuất</w:t>
         <w:tab/>
-        <w:t xml:space="preserve">26</w:t>
+        <w:t xml:space="preserve">29</w:t>
       </w:r>
     </w:p>
     <w:p>
@@ -1878,7 +1878,7 @@
         </w:rPr>
         <w:t xml:space="preserve">8. Kết luận, hạn chế và hướng phát triển</w:t>
         <w:tab/>
-        <w:t xml:space="preserve">26</w:t>
+        <w:t xml:space="preserve">30</w:t>
       </w:r>
     </w:p>
     <w:p>
@@ -1898,7 +1898,7 @@
         </w:rPr>
         <w:t xml:space="preserve">8.1. Kết luận</w:t>
         <w:tab/>
-        <w:t xml:space="preserve">26</w:t>
+        <w:t xml:space="preserve">30</w:t>
       </w:r>
     </w:p>
     <w:p>
@@ -1918,7 +1918,7 @@
         </w:rPr>
         <w:t xml:space="preserve">8.2. Hạn chế</w:t>
         <w:tab/>
-        <w:t xml:space="preserve">26</w:t>
+        <w:t xml:space="preserve">30</w:t>
       </w:r>
     </w:p>
     <w:p>
@@ -1938,7 +1938,7 @@
         </w:rPr>
         <w:t xml:space="preserve">8.3. Hướng phát triển</w:t>
         <w:tab/>
-        <w:t xml:space="preserve">27</w:t>
+        <w:t xml:space="preserve">31</w:t>
       </w:r>
     </w:p>
     <w:p>
@@ -1960,29 +1960,7 @@
         </w:rPr>
         <w:t xml:space="preserve">9. Tài liệu tham khảo</w:t>
         <w:tab/>
-        <w:t xml:space="preserve">27</w:t>
-      </w:r>
-    </w:p>
-    <w:p>
-      <w:pPr>
-        <w:tabs>
-          <w:tab w:val="right" w:leader="dot" w:pos="9360"/>
-        </w:tabs>
-        <w:spacing w:before="60" w:after="80" w:line="240" w:lineRule="auto"/>
-        <w:ind w:left="0" w:firstLine="0"/>
-        <w:jc w:val="left"/>
-      </w:pPr>
-      <w:r>
-        <w:rPr>
-          <w:rFonts w:ascii="Times New Roman" w:hAnsi="Times New Roman" w:cs="Times New Roman" w:eastAsia="Times New Roman"/>
-          <w:b/>
-          <w:bCs/>
-          <w:sz w:val="26"/>
-          <w:szCs w:val="26"/>
-        </w:rPr>
-        <w:t xml:space="preserve">Phụ lục. Phân công công việc và mức độ đóng góp của các thành viên</w:t>
-        <w:tab/>
-        <w:t xml:space="preserve">28</w:t>
+        <w:t xml:space="preserve">32</w:t>
       </w:r>
       <w:r>
         <w:fldChar w:fldCharType="end"/>
@@ -2043,7 +2021,7 @@
         </w:rPr>
         <w:t xml:space="preserve">Bảng 2.1. Các nhóm biến chính trong bộ dữ liệu</w:t>
         <w:tab/>
-        <w:t xml:space="preserve">8</w:t>
+        <w:t xml:space="preserve">9</w:t>
       </w:r>
     </w:p>
     <w:p>
@@ -2063,7 +2041,7 @@
         </w:rPr>
         <w:t xml:space="preserve">Bảng 2.2. Thống kê mô tả: người nghỉ và người ở lại</w:t>
         <w:tab/>
-        <w:t xml:space="preserve">9</w:t>
+        <w:t xml:space="preserve">10</w:t>
       </w:r>
     </w:p>
     <w:p>
@@ -2083,7 +2061,7 @@
         </w:rPr>
         <w:t xml:space="preserve">Bảng 3.1. Kết quả kiểm tra chất lượng dữ liệu</w:t>
         <w:tab/>
-        <w:t xml:space="preserve">9</w:t>
+        <w:t xml:space="preserve">11</w:t>
       </w:r>
     </w:p>
     <w:p>
@@ -2103,7 +2081,7 @@
         </w:rPr>
         <w:t xml:space="preserve">Bảng 3.2. Các cột dẫn xuất được tạo trong quá trình tiền xử lý</w:t>
         <w:tab/>
-        <w:t xml:space="preserve">10</w:t>
+        <w:t xml:space="preserve">11</w:t>
       </w:r>
     </w:p>
     <w:p>
@@ -2123,7 +2101,7 @@
         </w:rPr>
         <w:t xml:space="preserve">Bảng 3.3. Các measure DAX chính trong mô hình</w:t>
         <w:tab/>
-        <w:t xml:space="preserve">12</w:t>
+        <w:t xml:space="preserve">13</w:t>
       </w:r>
     </w:p>
     <w:p>
@@ -2143,7 +2121,7 @@
         </w:rPr>
         <w:t xml:space="preserve">Bảng 4.1. Cấu trúc sáu trang dashboard</w:t>
         <w:tab/>
-        <w:t xml:space="preserve">13</w:t>
+        <w:t xml:space="preserve">15</w:t>
       </w:r>
     </w:p>
     <w:p>
@@ -2163,7 +2141,7 @@
         </w:rPr>
         <w:t xml:space="preserve">Bảng 5.1. Tỷ lệ nghỉ việc theo đặc điểm nhân khẩu học</w:t>
         <w:tab/>
-        <w:t xml:space="preserve">17</w:t>
+        <w:t xml:space="preserve">19</w:t>
       </w:r>
     </w:p>
     <w:p>
@@ -2183,7 +2161,7 @@
         </w:rPr>
         <w:t xml:space="preserve">Bảng 5.2. Tỷ lệ nghỉ việc theo các điều kiện làm việc khác</w:t>
         <w:tab/>
-        <w:t xml:space="preserve">18</w:t>
+        <w:t xml:space="preserve">21</w:t>
       </w:r>
     </w:p>
     <w:p>
@@ -2203,7 +2181,7 @@
         </w:rPr>
         <w:t xml:space="preserve">Bảng 5.3. Tỷ lệ nghỉ việc theo mức của năm thang hài lòng – gắn kết</w:t>
         <w:tab/>
-        <w:t xml:space="preserve">19</w:t>
+        <w:t xml:space="preserve">21</w:t>
       </w:r>
     </w:p>
     <w:p>
@@ -2223,7 +2201,7 @@
         </w:rPr>
         <w:t xml:space="preserve">Bảng 5.4. Tỷ lệ nghỉ việc theo nhóm rủi ro cộng dồn</w:t>
         <w:tab/>
-        <w:t xml:space="preserve">20</w:t>
+        <w:t xml:space="preserve">22</w:t>
       </w:r>
     </w:p>
     <w:p>
@@ -2243,7 +2221,7 @@
         </w:rPr>
         <w:t xml:space="preserve">Bảng 6.1. Tổng hợp kết quả kiểm định giả thuyết</w:t>
         <w:tab/>
-        <w:t xml:space="preserve">21</w:t>
+        <w:t xml:space="preserve">23</w:t>
       </w:r>
     </w:p>
     <w:p>
@@ -2263,7 +2241,7 @@
         </w:rPr>
         <w:t xml:space="preserve">Bảng 6.2. Kết quả đánh giá mô hình trên tập kiểm tra</w:t>
         <w:tab/>
-        <w:t xml:space="preserve">22</w:t>
+        <w:t xml:space="preserve">25</w:t>
       </w:r>
     </w:p>
     <w:p>
@@ -2283,7 +2261,24 @@
         </w:rPr>
         <w:t xml:space="preserve">Bảng 7.1. Kế hoạch hành động ưu tiên</w:t>
         <w:tab/>
-        <w:t xml:space="preserve">25</w:t>
+        <w:t xml:space="preserve">28</w:t>
+      </w:r>
+    </w:p>
+    <w:p>
+      <w:pPr>
+        <w:spacing w:before="240" w:after="240" w:line="240" w:lineRule="auto"/>
+        <w:ind w:left="0" w:firstLine="0"/>
+        <w:jc w:val="center"/>
+      </w:pPr>
+      <w:r>
+        <w:rPr>
+          <w:rFonts w:ascii="Times New Roman" w:hAnsi="Times New Roman" w:cs="Times New Roman" w:eastAsia="Times New Roman"/>
+          <w:b/>
+          <w:bCs/>
+          <w:sz w:val="26"/>
+          <w:szCs w:val="26"/>
+        </w:rPr>
+        <w:t xml:space="preserve">DANH MỤC HÌNH</w:t>
       </w:r>
     </w:p>
     <w:p>
@@ -2301,26 +2296,9 @@
           <w:sz w:val="26"/>
           <w:szCs w:val="26"/>
         </w:rPr>
-        <w:t xml:space="preserve">Bảng PL.1. Phân công công việc và mức độ đóng góp</w:t>
+        <w:t xml:space="preserve">Hình 1.1. Khung khái niệm nghiên cứu</w:t>
         <w:tab/>
-        <w:t xml:space="preserve">28</w:t>
-      </w:r>
-    </w:p>
-    <w:p>
-      <w:pPr>
-        <w:spacing w:before="240" w:after="240" w:line="240" w:lineRule="auto"/>
-        <w:ind w:left="0" w:firstLine="0"/>
-        <w:jc w:val="center"/>
-      </w:pPr>
-      <w:r>
-        <w:rPr>
-          <w:rFonts w:ascii="Times New Roman" w:hAnsi="Times New Roman" w:cs="Times New Roman" w:eastAsia="Times New Roman"/>
-          <w:b/>
-          <w:bCs/>
-          <w:sz w:val="26"/>
-          <w:szCs w:val="26"/>
-        </w:rPr>
-        <w:t xml:space="preserve">DANH MỤC HÌNH</w:t>
+        <w:t xml:space="preserve">6</w:t>
       </w:r>
     </w:p>
     <w:p>
@@ -2338,9 +2316,9 @@
           <w:sz w:val="26"/>
           <w:szCs w:val="26"/>
         </w:rPr>
-        <w:t xml:space="preserve">Hình 1.1. Khung khái niệm nghiên cứu</w:t>
+        <w:t xml:space="preserve">Hình 3.1. Mô hình dữ liệu trong file Power BI</w:t>
         <w:tab/>
-        <w:t xml:space="preserve">6</w:t>
+        <w:t xml:space="preserve">13</w:t>
       </w:r>
     </w:p>
     <w:p>
@@ -2358,9 +2336,9 @@
           <w:sz w:val="26"/>
           <w:szCs w:val="26"/>
         </w:rPr>
-        <w:t xml:space="preserve">Hình 3.1. Mô hình dữ liệu trong file Power BI</w:t>
+        <w:t xml:space="preserve">Hình 4.1. Dashboard Trang 1 – Tổng quan</w:t>
         <w:tab/>
-        <w:t xml:space="preserve">11</w:t>
+        <w:t xml:space="preserve">16</w:t>
       </w:r>
     </w:p>
     <w:p>
@@ -2378,9 +2356,9 @@
           <w:sz w:val="26"/>
           <w:szCs w:val="26"/>
         </w:rPr>
-        <w:t xml:space="preserve">Hình 4.1. Dashboard Trang 1 – Tổng quan</w:t>
+        <w:t xml:space="preserve">Hình 4.2. Dashboard Trang 2 – Chân dung người nghỉ việc</w:t>
         <w:tab/>
-        <w:t xml:space="preserve">14</w:t>
+        <w:t xml:space="preserve">16</w:t>
       </w:r>
     </w:p>
     <w:p>
@@ -2398,9 +2376,9 @@
           <w:sz w:val="26"/>
           <w:szCs w:val="26"/>
         </w:rPr>
-        <w:t xml:space="preserve">Hình 4.2. Dashboard Trang 2 – Chân dung người nghỉ việc</w:t>
+        <w:t xml:space="preserve">Hình 4.3. Dashboard Trang 3 – Điều kiện làm việc</w:t>
         <w:tab/>
-        <w:t xml:space="preserve">14</w:t>
+        <w:t xml:space="preserve">17</w:t>
       </w:r>
     </w:p>
     <w:p>
@@ -2418,9 +2396,9 @@
           <w:sz w:val="26"/>
           <w:szCs w:val="26"/>
         </w:rPr>
-        <w:t xml:space="preserve">Hình 4.3. Dashboard Trang 3 – Điều kiện làm việc</w:t>
+        <w:t xml:space="preserve">Hình 4.4. Dashboard Trang 4 – Lương và đãi ngộ</w:t>
         <w:tab/>
-        <w:t xml:space="preserve">15</w:t>
+        <w:t xml:space="preserve">17</w:t>
       </w:r>
     </w:p>
     <w:p>
@@ -2438,9 +2416,9 @@
           <w:sz w:val="26"/>
           <w:szCs w:val="26"/>
         </w:rPr>
-        <w:t xml:space="preserve">Hình 4.4. Dashboard Trang 4 – Lương và đãi ngộ</w:t>
+        <w:t xml:space="preserve">Hình 4.5. Dashboard Trang 5 – Hài lòng và gắn kết</w:t>
         <w:tab/>
-        <w:t xml:space="preserve">15</w:t>
+        <w:t xml:space="preserve">17</w:t>
       </w:r>
     </w:p>
     <w:p>
@@ -2458,9 +2436,9 @@
           <w:sz w:val="26"/>
           <w:szCs w:val="26"/>
         </w:rPr>
-        <w:t xml:space="preserve">Hình 4.5. Dashboard Trang 5 – Hài lòng và gắn kết</w:t>
+        <w:t xml:space="preserve">Hình 4.6. Dashboard Trang 6 – Rủi ro và hành động</w:t>
         <w:tab/>
-        <w:t xml:space="preserve">15</w:t>
+        <w:t xml:space="preserve">18</w:t>
       </w:r>
     </w:p>
     <w:p>
@@ -2478,9 +2456,9 @@
           <w:sz w:val="26"/>
           <w:szCs w:val="26"/>
         </w:rPr>
-        <w:t xml:space="preserve">Hình 4.6. Dashboard Trang 6 – Rủi ro và hành động</w:t>
+        <w:t xml:space="preserve">Hình 5.1. Tỷ lệ nghỉ việc theo vị trí công việc</w:t>
         <w:tab/>
-        <w:t xml:space="preserve">16</w:t>
+        <w:t xml:space="preserve">19</w:t>
       </w:r>
     </w:p>
     <w:p>
@@ -2498,9 +2476,9 @@
           <w:sz w:val="26"/>
           <w:szCs w:val="26"/>
         </w:rPr>
-        <w:t xml:space="preserve">Hình 5.1. Tỷ lệ nghỉ việc theo vị trí công việc</w:t>
+        <w:t xml:space="preserve">Hình 5.2. Tỷ lệ nghỉ việc theo cấp bậc và làm thêm giờ</w:t>
         <w:tab/>
-        <w:t xml:space="preserve">17</w:t>
+        <w:t xml:space="preserve">20</w:t>
       </w:r>
     </w:p>
     <w:p>
@@ -2518,9 +2496,9 @@
           <w:sz w:val="26"/>
           <w:szCs w:val="26"/>
         </w:rPr>
-        <w:t xml:space="preserve">Hình 5.2. Tỷ lệ nghỉ việc theo cấp bậc và làm thêm giờ</w:t>
+        <w:t xml:space="preserve">Hình 6.1. Odds ratio và khoảng tin cậy 95% của mô hình hồi quy logistic</w:t>
         <w:tab/>
-        <w:t xml:space="preserve">18</w:t>
+        <w:t xml:space="preserve">25</w:t>
       </w:r>
     </w:p>
     <w:p>
@@ -2538,29 +2516,9 @@
           <w:sz w:val="26"/>
           <w:szCs w:val="26"/>
         </w:rPr>
-        <w:t xml:space="preserve">Hình 6.1. Odds ratio và khoảng tin cậy 95% của mô hình hồi quy logistic</w:t>
-        <w:tab/>
-        <w:t xml:space="preserve">22</w:t>
-      </w:r>
-    </w:p>
-    <w:p>
-      <w:pPr>
-        <w:tabs>
-          <w:tab w:val="right" w:leader="dot" w:pos="9360"/>
-        </w:tabs>
-        <w:spacing w:before="0" w:after="80" w:line="240" w:lineRule="auto"/>
-        <w:ind w:left="0" w:firstLine="0"/>
-        <w:jc w:val="left"/>
-      </w:pPr>
-      <w:r>
-        <w:rPr>
-          <w:rFonts w:ascii="Times New Roman" w:hAnsi="Times New Roman" w:cs="Times New Roman" w:eastAsia="Times New Roman"/>
-          <w:sz w:val="26"/>
-          <w:szCs w:val="26"/>
-        </w:rPr>
         <w:t xml:space="preserve">Hình 6.2. Cây quyết định ba tầng dự báo nghỉ việc</w:t>
         <w:tab/>
-        <w:t xml:space="preserve">24</w:t>
+        <w:t xml:space="preserve">27</w:t>
       </w:r>
     </w:p>
     <w:p>
@@ -3136,7 +3094,7 @@
         <w:keepNext/>
         <w:keepLines/>
         <w:pageBreakBefore/>
-        <w:spacing w:before="240" w:after="240" w:line="240" w:lineRule="auto"/>
+        <w:spacing w:before="0" w:after="240" w:line="240" w:lineRule="auto"/>
         <w:ind w:left="0" w:firstLine="0"/>
         <w:jc w:val="left"/>
       </w:pPr>
@@ -3171,7 +3129,7 @@
         <w:pStyle w:val="Heading2"/>
         <w:keepNext/>
         <w:keepLines/>
-        <w:spacing w:before="0" w:after="240" w:line="240" w:lineRule="auto"/>
+        <w:spacing w:before="120" w:after="240" w:line="240" w:lineRule="auto"/>
         <w:ind w:left="0" w:firstLine="0"/>
         <w:jc w:val="left"/>
       </w:pPr>
@@ -3221,7 +3179,7 @@
         <w:pStyle w:val="Heading2"/>
         <w:keepNext/>
         <w:keepLines/>
-        <w:spacing w:before="0" w:after="240" w:line="240" w:lineRule="auto"/>
+        <w:spacing w:before="120" w:after="240" w:line="240" w:lineRule="auto"/>
         <w:ind w:left="0" w:firstLine="0"/>
         <w:jc w:val="left"/>
       </w:pPr>
@@ -3433,7 +3391,7 @@
         <w:pStyle w:val="Heading2"/>
         <w:keepNext/>
         <w:keepLines/>
-        <w:spacing w:before="0" w:after="240" w:line="240" w:lineRule="auto"/>
+        <w:spacing w:before="120" w:after="240" w:line="240" w:lineRule="auto"/>
         <w:ind w:left="0" w:firstLine="0"/>
         <w:jc w:val="left"/>
       </w:pPr>
@@ -3698,7 +3656,7 @@
         <w:pStyle w:val="Heading2"/>
         <w:keepNext/>
         <w:keepLines/>
-        <w:spacing w:before="0" w:after="240" w:line="240" w:lineRule="auto"/>
+        <w:spacing w:before="120" w:after="240" w:line="240" w:lineRule="auto"/>
         <w:ind w:left="0" w:firstLine="0"/>
         <w:jc w:val="left"/>
       </w:pPr>
@@ -4410,7 +4368,7 @@
         <w:pStyle w:val="Heading2"/>
         <w:keepNext/>
         <w:keepLines/>
-        <w:spacing w:before="0" w:after="240" w:line="240" w:lineRule="auto"/>
+        <w:spacing w:before="120" w:after="240" w:line="240" w:lineRule="auto"/>
         <w:ind w:left="0" w:firstLine="0"/>
         <w:jc w:val="left"/>
       </w:pPr>
@@ -4580,6 +4538,42 @@
         <w:pStyle w:val="Heading2"/>
         <w:keepNext/>
         <w:keepLines/>
+        <w:spacing w:before="120" w:after="240" w:line="240" w:lineRule="auto"/>
+        <w:ind w:left="0" w:firstLine="0"/>
+        <w:jc w:val="left"/>
+      </w:pPr>
+      <w:r>
+        <w:rPr>
+          <w:rFonts w:ascii="Times New Roman" w:hAnsi="Times New Roman" w:cs="Times New Roman" w:eastAsia="Times New Roman"/>
+          <w:b/>
+          <w:bCs/>
+          <w:sz w:val="26"/>
+          <w:szCs w:val="26"/>
+        </w:rPr>
+        <w:t xml:space="preserve">1.6. Kết cấu báo cáo</w:t>
+      </w:r>
+    </w:p>
+    <w:p>
+      <w:pPr>
+        <w:spacing w:before="0" w:after="240" w:line="240" w:lineRule="auto"/>
+        <w:ind w:left="0" w:firstLine="720"/>
+        <w:jc w:val="both"/>
+      </w:pPr>
+      <w:r>
+        <w:rPr>
+          <w:rFonts w:ascii="Times New Roman" w:hAnsi="Times New Roman" w:cs="Times New Roman" w:eastAsia="Times New Roman"/>
+          <w:sz w:val="26"/>
+          <w:szCs w:val="26"/>
+        </w:rPr>
+        <w:t xml:space="preserve">Ngoài danh mục và tài liệu tham khảo, báo cáo gồm tám phần. Phần 1 trình bày bối cảnh, vấn đề và giả thuyết. Phần 2 mô tả dữ liệu. Phần 3 trình bày quá trình tiền xử lý và mô hình dữ liệu. Phần 4 mô tả thiết kế dashboard. Phần 5 trình bày kết quả phân tích khám phá. Phần 6 trình bày kiểm định giả thuyết và mô hình. Phần 7 đề xuất giải pháp. Phần 8 nêu kết luận, hạn chế và hướng phát triển.</w:t>
+      </w:r>
+    </w:p>
+    <w:p>
+      <w:pPr>
+        <w:pStyle w:val="Heading1"/>
+        <w:keepNext/>
+        <w:keepLines/>
+        <w:pageBreakBefore/>
         <w:spacing w:before="0" w:after="240" w:line="240" w:lineRule="auto"/>
         <w:ind w:left="0" w:firstLine="0"/>
         <w:jc w:val="left"/>
@@ -4592,7 +4586,7 @@
           <w:sz w:val="26"/>
           <w:szCs w:val="26"/>
         </w:rPr>
-        <w:t xml:space="preserve">1.6. Kết cấu báo cáo</w:t>
+        <w:t xml:space="preserve">2. Mô tả dữ liệu</w:t>
       </w:r>
     </w:p>
     <w:p>
@@ -4607,15 +4601,51 @@
           <w:sz w:val="26"/>
           <w:szCs w:val="26"/>
         </w:rPr>
-        <w:t xml:space="preserve">Ngoài danh mục và tài liệu tham khảo, báo cáo gồm tám phần. Phần 1 trình bày bối cảnh, vấn đề và giả thuyết. Phần 2 mô tả dữ liệu. Phần 3 trình bày quá trình tiền xử lý và mô hình dữ liệu. Phần 4 mô tả thiết kế dashboard. Phần 5 trình bày kết quả phân tích khám phá. Phần 6 trình bày kiểm định giả thuyết và mô hình. Phần 7 đề xuất giải pháp. Phần 8 nêu kết luận, hạn chế và hướng phát triển.</w:t>
-      </w:r>
-    </w:p>
-    <w:p>
-      <w:pPr>
-        <w:pStyle w:val="Heading1"/>
+        <w:t xml:space="preserve">Bộ dữ liệu gồm 1.470 nhân viên và 34 cột trong file </w:t>
+      </w:r>
+      <w:r>
+        <w:rPr>
+          <w:rFonts w:ascii="Times New Roman" w:hAnsi="Times New Roman" w:cs="Times New Roman" w:eastAsia="Times New Roman"/>
+          <w:i/>
+          <w:iCs/>
+          <w:sz w:val="26"/>
+          <w:szCs w:val="26"/>
+        </w:rPr>
+        <w:t xml:space="preserve">02_Employee Attrition.xlsx</w:t>
+      </w:r>
+      <w:r>
+        <w:rPr>
+          <w:rFonts w:ascii="Times New Roman" w:hAnsi="Times New Roman" w:cs="Times New Roman" w:eastAsia="Times New Roman"/>
+          <w:sz w:val="26"/>
+          <w:szCs w:val="26"/>
+        </w:rPr>
+        <w:t xml:space="preserve"> (sheet Data), mỗi dòng là một nhân viên với mã duy nhất (Employee Number). Biến mục tiêu là </w:t>
+      </w:r>
+      <w:r>
+        <w:rPr>
+          <w:rFonts w:ascii="Times New Roman" w:hAnsi="Times New Roman" w:cs="Times New Roman" w:eastAsia="Times New Roman"/>
+          <w:b/>
+          <w:bCs/>
+          <w:sz w:val="26"/>
+          <w:szCs w:val="26"/>
+        </w:rPr>
+        <w:t xml:space="preserve">Attrition</w:t>
+      </w:r>
+      <w:r>
+        <w:rPr>
+          <w:rFonts w:ascii="Times New Roman" w:hAnsi="Times New Roman" w:cs="Times New Roman" w:eastAsia="Times New Roman"/>
+          <w:sz w:val="26"/>
+          <w:szCs w:val="26"/>
+        </w:rPr>
+        <w:t xml:space="preserve"> (Yes/No): 237 người đã nghỉ (16,1%) và 1.233 người ở lại (83,9%), tức dữ liệu mất cân bằng khoảng 1:5,2.</w:t>
+      </w:r>
+    </w:p>
+    <w:p>
+      <w:pPr>
+        <w:pStyle w:val="Heading2"/>
         <w:keepNext/>
         <w:keepLines/>
-        <w:spacing w:before="240" w:after="240" w:line="240" w:lineRule="auto"/>
+        <w:spacing w:before="120" w:after="240" w:line="240" w:lineRule="auto"/>
         <w:ind w:left="0" w:firstLine="0"/>
         <w:jc w:val="left"/>
       </w:pPr>
@@ -4627,7 +4657,7 @@
           <w:sz w:val="26"/>
           <w:szCs w:val="26"/>
         </w:rPr>
-        <w:t xml:space="preserve">2. Mô tả dữ liệu</w:t>
+        <w:t xml:space="preserve">2.1. Nguồn và bản chất dữ liệu</w:t>
       </w:r>
     </w:p>
     <w:p>
@@ -4642,43 +4672,7 @@
           <w:sz w:val="26"/>
           <w:szCs w:val="26"/>
         </w:rPr>
-        <w:t xml:space="preserve">Bộ dữ liệu gồm 1.470 nhân viên và 34 cột trong file </w:t>
-      </w:r>
-      <w:r>
-        <w:rPr>
-          <w:rFonts w:ascii="Times New Roman" w:hAnsi="Times New Roman" w:cs="Times New Roman" w:eastAsia="Times New Roman"/>
-          <w:i/>
-          <w:iCs/>
-          <w:sz w:val="26"/>
-          <w:szCs w:val="26"/>
-        </w:rPr>
-        <w:t xml:space="preserve">02_Employee Attrition.xlsx</w:t>
-      </w:r>
-      <w:r>
-        <w:rPr>
-          <w:rFonts w:ascii="Times New Roman" w:hAnsi="Times New Roman" w:cs="Times New Roman" w:eastAsia="Times New Roman"/>
-          <w:sz w:val="26"/>
-          <w:szCs w:val="26"/>
-        </w:rPr>
-        <w:t xml:space="preserve"> (sheet Data), mỗi dòng là một nhân viên với mã duy nhất (Employee Number). Biến mục tiêu là </w:t>
-      </w:r>
-      <w:r>
-        <w:rPr>
-          <w:rFonts w:ascii="Times New Roman" w:hAnsi="Times New Roman" w:cs="Times New Roman" w:eastAsia="Times New Roman"/>
-          <w:b/>
-          <w:bCs/>
-          <w:sz w:val="26"/>
-          <w:szCs w:val="26"/>
-        </w:rPr>
-        <w:t xml:space="preserve">Attrition</w:t>
-      </w:r>
-      <w:r>
-        <w:rPr>
-          <w:rFonts w:ascii="Times New Roman" w:hAnsi="Times New Roman" w:cs="Times New Roman" w:eastAsia="Times New Roman"/>
-          <w:sz w:val="26"/>
-          <w:szCs w:val="26"/>
-        </w:rPr>
-        <w:t xml:space="preserve"> (Yes/No): 237 người đã nghỉ (16,1%) và 1.233 người ở lại (83,9%), tức dữ liệu mất cân bằng khoảng 1:5,2.</w:t>
+        <w:t xml:space="preserve">Dữ liệu là ảnh chụp tại một thời điểm (cross-sectional), không có ngày vào – ngày nghỉ. Vì vậy báo cáo chỉ so sánh tỷ lệ nghỉ giữa các nhóm, không phân tích xu hướng theo thời gian. Các thang hài lòng là khảo sát tự đánh giá 1–4; thu nhập tính theo USD/tháng.</w:t>
       </w:r>
     </w:p>
     <w:p>
@@ -4686,42 +4680,7 @@
         <w:pStyle w:val="Heading2"/>
         <w:keepNext/>
         <w:keepLines/>
-        <w:spacing w:before="0" w:after="240" w:line="240" w:lineRule="auto"/>
-        <w:ind w:left="0" w:firstLine="0"/>
-        <w:jc w:val="left"/>
-      </w:pPr>
-      <w:r>
-        <w:rPr>
-          <w:rFonts w:ascii="Times New Roman" w:hAnsi="Times New Roman" w:cs="Times New Roman" w:eastAsia="Times New Roman"/>
-          <w:b/>
-          <w:bCs/>
-          <w:sz w:val="26"/>
-          <w:szCs w:val="26"/>
-        </w:rPr>
-        <w:t xml:space="preserve">2.1. Nguồn và bản chất dữ liệu</w:t>
-      </w:r>
-    </w:p>
-    <w:p>
-      <w:pPr>
-        <w:spacing w:before="0" w:after="240" w:line="240" w:lineRule="auto"/>
-        <w:ind w:left="0" w:firstLine="720"/>
-        <w:jc w:val="both"/>
-      </w:pPr>
-      <w:r>
-        <w:rPr>
-          <w:rFonts w:ascii="Times New Roman" w:hAnsi="Times New Roman" w:cs="Times New Roman" w:eastAsia="Times New Roman"/>
-          <w:sz w:val="26"/>
-          <w:szCs w:val="26"/>
-        </w:rPr>
-        <w:t xml:space="preserve">Dữ liệu là ảnh chụp tại một thời điểm (cross-sectional), không có ngày vào – ngày nghỉ. Vì vậy báo cáo chỉ so sánh tỷ lệ nghỉ giữa các nhóm, không phân tích xu hướng theo thời gian. Các thang hài lòng là khảo sát tự đánh giá 1–4; thu nhập tính theo USD/tháng.</w:t>
-      </w:r>
-    </w:p>
-    <w:p>
-      <w:pPr>
-        <w:pStyle w:val="Heading2"/>
-        <w:keepNext/>
-        <w:keepLines/>
-        <w:spacing w:before="0" w:after="240" w:line="240" w:lineRule="auto"/>
+        <w:spacing w:before="120" w:after="240" w:line="240" w:lineRule="auto"/>
         <w:ind w:left="0" w:firstLine="0"/>
         <w:jc w:val="left"/>
       </w:pPr>
@@ -5537,7 +5496,7 @@
         <w:pStyle w:val="Heading2"/>
         <w:keepNext/>
         <w:keepLines/>
-        <w:spacing w:before="0" w:after="240" w:line="240" w:lineRule="auto"/>
+        <w:spacing w:before="120" w:after="240" w:line="240" w:lineRule="auto"/>
         <w:ind w:left="0" w:firstLine="0"/>
         <w:jc w:val="left"/>
       </w:pPr>
@@ -6196,7 +6155,8 @@
         <w:pStyle w:val="Heading1"/>
         <w:keepNext/>
         <w:keepLines/>
-        <w:spacing w:before="240" w:after="240" w:line="240" w:lineRule="auto"/>
+        <w:pageBreakBefore/>
+        <w:spacing w:before="0" w:after="240" w:line="240" w:lineRule="auto"/>
         <w:ind w:left="0" w:firstLine="0"/>
         <w:jc w:val="left"/>
       </w:pPr>
@@ -6231,7 +6191,7 @@
         <w:pStyle w:val="Heading2"/>
         <w:keepNext/>
         <w:keepLines/>
-        <w:spacing w:before="0" w:after="240" w:line="240" w:lineRule="auto"/>
+        <w:spacing w:before="120" w:after="240" w:line="240" w:lineRule="auto"/>
         <w:ind w:left="0" w:firstLine="0"/>
         <w:jc w:val="left"/>
       </w:pPr>
@@ -6875,7 +6835,7 @@
         <w:pStyle w:val="Heading2"/>
         <w:keepNext/>
         <w:keepLines/>
-        <w:spacing w:before="0" w:after="240" w:line="240" w:lineRule="auto"/>
+        <w:spacing w:before="120" w:after="240" w:line="240" w:lineRule="auto"/>
         <w:ind w:left="0" w:firstLine="0"/>
         <w:jc w:val="left"/>
       </w:pPr>
@@ -8010,7 +7970,7 @@
         <w:pStyle w:val="Heading2"/>
         <w:keepNext/>
         <w:keepLines/>
-        <w:spacing w:before="0" w:after="240" w:line="240" w:lineRule="auto"/>
+        <w:spacing w:before="120" w:after="240" w:line="240" w:lineRule="auto"/>
         <w:ind w:left="0" w:firstLine="0"/>
         <w:jc w:val="left"/>
       </w:pPr>
@@ -8196,7 +8156,7 @@
         <w:pStyle w:val="Heading2"/>
         <w:keepNext/>
         <w:keepLines/>
-        <w:spacing w:before="0" w:after="240" w:line="240" w:lineRule="auto"/>
+        <w:spacing w:before="120" w:after="240" w:line="240" w:lineRule="auto"/>
         <w:ind w:left="0" w:firstLine="0"/>
         <w:jc w:val="left"/>
       </w:pPr>
@@ -9405,7 +9365,8 @@
         <w:pStyle w:val="Heading1"/>
         <w:keepNext/>
         <w:keepLines/>
-        <w:spacing w:before="240" w:after="240" w:line="240" w:lineRule="auto"/>
+        <w:pageBreakBefore/>
+        <w:spacing w:before="0" w:after="240" w:line="240" w:lineRule="auto"/>
         <w:ind w:left="0" w:firstLine="0"/>
         <w:jc w:val="left"/>
       </w:pPr>
@@ -9458,7 +9419,7 @@
         <w:pStyle w:val="Heading2"/>
         <w:keepNext/>
         <w:keepLines/>
-        <w:spacing w:before="0" w:after="240" w:line="240" w:lineRule="auto"/>
+        <w:spacing w:before="120" w:after="240" w:line="240" w:lineRule="auto"/>
         <w:ind w:left="0" w:firstLine="0"/>
         <w:jc w:val="left"/>
       </w:pPr>
@@ -9704,7 +9665,7 @@
         <w:pStyle w:val="Heading2"/>
         <w:keepNext/>
         <w:keepLines/>
-        <w:spacing w:before="0" w:after="240" w:line="240" w:lineRule="auto"/>
+        <w:spacing w:before="120" w:after="240" w:line="240" w:lineRule="auto"/>
         <w:ind w:left="0" w:firstLine="0"/>
         <w:jc w:val="left"/>
       </w:pPr>
@@ -10974,6 +10935,60 @@
         <w:pStyle w:val="Heading2"/>
         <w:keepNext/>
         <w:keepLines/>
+        <w:spacing w:before="120" w:after="240" w:line="240" w:lineRule="auto"/>
+        <w:ind w:left="0" w:firstLine="0"/>
+        <w:jc w:val="left"/>
+      </w:pPr>
+      <w:r>
+        <w:rPr>
+          <w:rFonts w:ascii="Times New Roman" w:hAnsi="Times New Roman" w:cs="Times New Roman" w:eastAsia="Times New Roman"/>
+          <w:b/>
+          <w:bCs/>
+          <w:sz w:val="26"/>
+          <w:szCs w:val="26"/>
+        </w:rPr>
+        <w:t xml:space="preserve">4.3. Tương tác</w:t>
+      </w:r>
+    </w:p>
+    <w:p>
+      <w:pPr>
+        <w:spacing w:before="0" w:after="240" w:line="240" w:lineRule="auto"/>
+        <w:ind w:left="0" w:firstLine="720"/>
+        <w:jc w:val="both"/>
+      </w:pPr>
+      <w:r>
+        <w:rPr>
+          <w:rFonts w:ascii="Times New Roman" w:hAnsi="Times New Roman" w:cs="Times New Roman" w:eastAsia="Times New Roman"/>
+          <w:sz w:val="26"/>
+          <w:szCs w:val="26"/>
+        </w:rPr>
+        <w:t xml:space="preserve">Bản Power BI cho phép người dùng HR tự đặt câu hỏi phụ. Ví dụ: chọn Department = Sales và OverTime = Yes để xem nhóm này nghỉ bao nhiêu; kéo slicer </w:t>
+      </w:r>
+      <w:r>
+        <w:rPr>
+          <w:rFonts w:ascii="Times New Roman" w:hAnsi="Times New Roman" w:cs="Times New Roman" w:eastAsia="Times New Roman"/>
+          <w:i/>
+          <w:iCs/>
+          <w:sz w:val="26"/>
+          <w:szCs w:val="26"/>
+        </w:rPr>
+        <w:t xml:space="preserve">Replacement Cost</w:t>
+      </w:r>
+      <w:r>
+        <w:rPr>
+          <w:rFonts w:ascii="Times New Roman" w:hAnsi="Times New Roman" w:cs="Times New Roman" w:eastAsia="Times New Roman"/>
+          <w:sz w:val="26"/>
+          <w:szCs w:val="26"/>
+        </w:rPr>
+        <w:t xml:space="preserve"> từ 25% lên 150% để thấy chi phí thay thế và khoản tiết kiệm thay đổi theo giả định. Các trang cùng kích thước 1280 × 720 và chế độ Fit to page để trình chiếu.</w:t>
+      </w:r>
+    </w:p>
+    <w:p>
+      <w:pPr>
+        <w:pStyle w:val="Heading1"/>
+        <w:keepNext/>
+        <w:keepLines/>
+        <w:pageBreakBefore/>
         <w:spacing w:before="0" w:after="240" w:line="240" w:lineRule="auto"/>
         <w:ind w:left="0" w:firstLine="0"/>
         <w:jc w:val="left"/>
@@ -10986,7 +11001,7 @@
           <w:sz w:val="26"/>
           <w:szCs w:val="26"/>
         </w:rPr>
-        <w:t xml:space="preserve">4.3. Tương tác</w:t>
+        <w:t xml:space="preserve">5. Khai thác dữ liệu: kết quả phân tích khám phá</w:t>
       </w:r>
     </w:p>
     <w:p>
@@ -11001,59 +11016,6 @@
           <w:sz w:val="26"/>
           <w:szCs w:val="26"/>
         </w:rPr>
-        <w:t xml:space="preserve">Bản Power BI cho phép người dùng HR tự đặt câu hỏi phụ. Ví dụ: chọn Department = Sales và OverTime = Yes để xem nhóm này nghỉ bao nhiêu; kéo slicer </w:t>
-      </w:r>
-      <w:r>
-        <w:rPr>
-          <w:rFonts w:ascii="Times New Roman" w:hAnsi="Times New Roman" w:cs="Times New Roman" w:eastAsia="Times New Roman"/>
-          <w:i/>
-          <w:iCs/>
-          <w:sz w:val="26"/>
-          <w:szCs w:val="26"/>
-        </w:rPr>
-        <w:t xml:space="preserve">Replacement Cost</w:t>
-      </w:r>
-      <w:r>
-        <w:rPr>
-          <w:rFonts w:ascii="Times New Roman" w:hAnsi="Times New Roman" w:cs="Times New Roman" w:eastAsia="Times New Roman"/>
-          <w:sz w:val="26"/>
-          <w:szCs w:val="26"/>
-        </w:rPr>
-        <w:t xml:space="preserve"> từ 25% lên 150% để thấy chi phí thay thế và khoản tiết kiệm thay đổi theo giả định. Các trang cùng kích thước 1280 × 720 và chế độ Fit to page để trình chiếu.</w:t>
-      </w:r>
-    </w:p>
-    <w:p>
-      <w:pPr>
-        <w:pStyle w:val="Heading1"/>
-        <w:keepNext/>
-        <w:keepLines/>
-        <w:spacing w:before="240" w:after="240" w:line="240" w:lineRule="auto"/>
-        <w:ind w:left="0" w:firstLine="0"/>
-        <w:jc w:val="left"/>
-      </w:pPr>
-      <w:r>
-        <w:rPr>
-          <w:rFonts w:ascii="Times New Roman" w:hAnsi="Times New Roman" w:cs="Times New Roman" w:eastAsia="Times New Roman"/>
-          <w:b/>
-          <w:bCs/>
-          <w:sz w:val="26"/>
-          <w:szCs w:val="26"/>
-        </w:rPr>
-        <w:t xml:space="preserve">5. Khai thác dữ liệu: kết quả phân tích khám phá</w:t>
-      </w:r>
-    </w:p>
-    <w:p>
-      <w:pPr>
-        <w:spacing w:before="0" w:after="240" w:line="240" w:lineRule="auto"/>
-        <w:ind w:left="0" w:firstLine="720"/>
-        <w:jc w:val="both"/>
-      </w:pPr>
-      <w:r>
-        <w:rPr>
-          <w:rFonts w:ascii="Times New Roman" w:hAnsi="Times New Roman" w:cs="Times New Roman" w:eastAsia="Times New Roman"/>
-          <w:sz w:val="26"/>
-          <w:szCs w:val="26"/>
-        </w:rPr>
         <w:t xml:space="preserve">Nghỉ việc không phân bố đều: nó dồn vào nhóm tuyến đầu, cấp thấp, mới vào và phải làm thêm giờ. Phần này đi theo thứ tự 6 trang dashboard; mọi con số là số toàn công ty.</w:t>
       </w:r>
     </w:p>
@@ -11062,7 +11024,7 @@
         <w:pStyle w:val="Heading2"/>
         <w:keepNext/>
         <w:keepLines/>
-        <w:spacing w:before="0" w:after="240" w:line="240" w:lineRule="auto"/>
+        <w:spacing w:before="120" w:after="240" w:line="240" w:lineRule="auto"/>
         <w:ind w:left="0" w:firstLine="0"/>
         <w:jc w:val="left"/>
       </w:pPr>
@@ -11246,7 +11208,7 @@
         <w:pStyle w:val="Heading2"/>
         <w:keepNext/>
         <w:keepLines/>
-        <w:spacing w:before="0" w:after="240" w:line="240" w:lineRule="auto"/>
+        <w:spacing w:before="120" w:after="240" w:line="240" w:lineRule="auto"/>
         <w:ind w:left="0" w:firstLine="0"/>
         <w:jc w:val="left"/>
       </w:pPr>
@@ -12139,7 +12101,7 @@
         <w:pStyle w:val="Heading2"/>
         <w:keepNext/>
         <w:keepLines/>
-        <w:spacing w:before="0" w:after="240" w:line="240" w:lineRule="auto"/>
+        <w:spacing w:before="120" w:after="240" w:line="240" w:lineRule="auto"/>
         <w:ind w:left="0" w:firstLine="0"/>
         <w:jc w:val="left"/>
       </w:pPr>
@@ -12657,7 +12619,7 @@
         <w:pStyle w:val="Heading2"/>
         <w:keepNext/>
         <w:keepLines/>
-        <w:spacing w:before="0" w:after="240" w:line="240" w:lineRule="auto"/>
+        <w:spacing w:before="120" w:after="240" w:line="240" w:lineRule="auto"/>
         <w:ind w:left="0" w:firstLine="0"/>
         <w:jc w:val="left"/>
       </w:pPr>
@@ -12867,7 +12829,7 @@
         <w:pStyle w:val="Heading2"/>
         <w:keepNext/>
         <w:keepLines/>
-        <w:spacing w:before="0" w:after="240" w:line="240" w:lineRule="auto"/>
+        <w:spacing w:before="120" w:after="240" w:line="240" w:lineRule="auto"/>
         <w:ind w:left="0" w:firstLine="0"/>
         <w:jc w:val="left"/>
       </w:pPr>
@@ -13809,7 +13771,7 @@
         <w:pStyle w:val="Heading2"/>
         <w:keepNext/>
         <w:keepLines/>
-        <w:spacing w:before="0" w:after="240" w:line="240" w:lineRule="auto"/>
+        <w:spacing w:before="120" w:after="240" w:line="240" w:lineRule="auto"/>
         <w:ind w:left="0" w:firstLine="0"/>
         <w:jc w:val="left"/>
       </w:pPr>
@@ -14299,7 +14261,8 @@
         <w:pStyle w:val="Heading1"/>
         <w:keepNext/>
         <w:keepLines/>
-        <w:spacing w:before="240" w:after="240" w:line="240" w:lineRule="auto"/>
+        <w:pageBreakBefore/>
+        <w:spacing w:before="0" w:after="240" w:line="240" w:lineRule="auto"/>
         <w:ind w:left="0" w:firstLine="0"/>
         <w:jc w:val="left"/>
       </w:pPr>
@@ -14334,7 +14297,7 @@
         <w:pStyle w:val="Heading2"/>
         <w:keepNext/>
         <w:keepLines/>
-        <w:spacing w:before="0" w:after="240" w:line="240" w:lineRule="auto"/>
+        <w:spacing w:before="120" w:after="240" w:line="240" w:lineRule="auto"/>
         <w:ind w:left="0" w:firstLine="0"/>
         <w:jc w:val="left"/>
       </w:pPr>
@@ -14740,7 +14703,7 @@
         <w:pStyle w:val="Heading2"/>
         <w:keepNext/>
         <w:keepLines/>
-        <w:spacing w:before="0" w:after="240" w:line="240" w:lineRule="auto"/>
+        <w:spacing w:before="120" w:after="240" w:line="240" w:lineRule="auto"/>
         <w:ind w:left="0" w:firstLine="0"/>
         <w:jc w:val="left"/>
       </w:pPr>
@@ -15761,7 +15724,7 @@
         <w:pStyle w:val="Heading2"/>
         <w:keepNext/>
         <w:keepLines/>
-        <w:spacing w:before="0" w:after="240" w:line="240" w:lineRule="auto"/>
+        <w:spacing w:before="120" w:after="240" w:line="240" w:lineRule="auto"/>
         <w:ind w:left="0" w:firstLine="0"/>
         <w:jc w:val="left"/>
       </w:pPr>
@@ -16317,7 +16280,7 @@
         <w:pStyle w:val="Heading2"/>
         <w:keepNext/>
         <w:keepLines/>
-        <w:spacing w:before="0" w:after="240" w:line="240" w:lineRule="auto"/>
+        <w:spacing w:before="120" w:after="240" w:line="240" w:lineRule="auto"/>
         <w:ind w:left="0" w:firstLine="0"/>
         <w:jc w:val="left"/>
       </w:pPr>
@@ -16486,6 +16449,96 @@
         <w:pStyle w:val="Heading2"/>
         <w:keepNext/>
         <w:keepLines/>
+        <w:spacing w:before="120" w:after="240" w:line="240" w:lineRule="auto"/>
+        <w:ind w:left="0" w:firstLine="0"/>
+        <w:jc w:val="left"/>
+      </w:pPr>
+      <w:r>
+        <w:rPr>
+          <w:rFonts w:ascii="Times New Roman" w:hAnsi="Times New Roman" w:cs="Times New Roman" w:eastAsia="Times New Roman"/>
+          <w:b/>
+          <w:bCs/>
+          <w:sz w:val="26"/>
+          <w:szCs w:val="26"/>
+        </w:rPr>
+        <w:t xml:space="preserve">6.5. Mô phỏng tác động: giới hạn làm thêm giờ</w:t>
+      </w:r>
+    </w:p>
+    <w:p>
+      <w:pPr>
+        <w:spacing w:before="0" w:after="240" w:line="240" w:lineRule="auto"/>
+        <w:ind w:left="0" w:firstLine="720"/>
+        <w:jc w:val="both"/>
+      </w:pPr>
+      <w:r>
+        <w:rPr>
+          <w:rFonts w:ascii="Times New Roman" w:hAnsi="Times New Roman" w:cs="Times New Roman" w:eastAsia="Times New Roman"/>
+          <w:sz w:val="26"/>
+          <w:szCs w:val="26"/>
+        </w:rPr>
+        <w:t xml:space="preserve">Nếu người làm thêm giờ nghỉ theo đúng tỷ lệ của người không làm thêm cùng cấp bậc, công ty tránh được khoảng </w:t>
+      </w:r>
+      <w:r>
+        <w:rPr>
+          <w:rFonts w:ascii="Times New Roman" w:hAnsi="Times New Roman" w:cs="Times New Roman" w:eastAsia="Times New Roman"/>
+          <w:b/>
+          <w:bCs/>
+          <w:sz w:val="26"/>
+          <w:szCs w:val="26"/>
+        </w:rPr>
+        <w:t xml:space="preserve">83 ca nghỉ (35%)</w:t>
+      </w:r>
+      <w:r>
+        <w:rPr>
+          <w:rFonts w:ascii="Times New Roman" w:hAnsi="Times New Roman" w:cs="Times New Roman" w:eastAsia="Times New Roman"/>
+          <w:sz w:val="26"/>
+          <w:szCs w:val="26"/>
+        </w:rPr>
+        <w:t xml:space="preserve">, tỷ lệ nghỉ giảm từ 16,1% xuống khoảng </w:t>
+      </w:r>
+      <w:r>
+        <w:rPr>
+          <w:rFonts w:ascii="Times New Roman" w:hAnsi="Times New Roman" w:cs="Times New Roman" w:eastAsia="Times New Roman"/>
+          <w:b/>
+          <w:bCs/>
+          <w:sz w:val="26"/>
+          <w:szCs w:val="26"/>
+        </w:rPr>
+        <w:t xml:space="preserve">10,5%</w:t>
+      </w:r>
+      <w:r>
+        <w:rPr>
+          <w:rFonts w:ascii="Times New Roman" w:hAnsi="Times New Roman" w:cs="Times New Roman" w:eastAsia="Times New Roman"/>
+          <w:sz w:val="26"/>
+          <w:szCs w:val="26"/>
+        </w:rPr>
+        <w:t xml:space="preserve">. Với chi phí thay thế 50% lương năm, khoản tiết kiệm ước tính là </w:t>
+      </w:r>
+      <w:r>
+        <w:rPr>
+          <w:rFonts w:ascii="Times New Roman" w:hAnsi="Times New Roman" w:cs="Times New Roman" w:eastAsia="Times New Roman"/>
+          <w:b/>
+          <w:bCs/>
+          <w:sz w:val="26"/>
+          <w:szCs w:val="26"/>
+        </w:rPr>
+        <w:t xml:space="preserve">2,23 triệu USD</w:t>
+      </w:r>
+      <w:r>
+        <w:rPr>
+          <w:rFonts w:ascii="Times New Roman" w:hAnsi="Times New Roman" w:cs="Times New Roman" w:eastAsia="Times New Roman"/>
+          <w:sz w:val="26"/>
+          <w:szCs w:val="26"/>
+        </w:rPr>
+        <w:t xml:space="preserve">. Đây là cận trên, với giả định làm thêm giờ là nguyên nhân; dữ liệu cắt ngang chỉ chứng minh được mối liên hệ, chưa chứng minh được nhân quả.</w:t>
+      </w:r>
+    </w:p>
+    <w:p>
+      <w:pPr>
+        <w:pStyle w:val="Heading1"/>
+        <w:keepNext/>
+        <w:keepLines/>
+        <w:pageBreakBefore/>
         <w:spacing w:before="0" w:after="240" w:line="240" w:lineRule="auto"/>
         <w:ind w:left="0" w:firstLine="0"/>
         <w:jc w:val="left"/>
@@ -16498,7 +16551,7 @@
           <w:sz w:val="26"/>
           <w:szCs w:val="26"/>
         </w:rPr>
-        <w:t xml:space="preserve">6.5. Mô phỏng tác động: giới hạn làm thêm giờ</w:t>
+        <w:t xml:space="preserve">7. Đề xuất giải pháp cho tổ chức</w:t>
       </w:r>
     </w:p>
     <w:p>
@@ -16513,95 +16566,6 @@
           <w:sz w:val="26"/>
           <w:szCs w:val="26"/>
         </w:rPr>
-        <w:t xml:space="preserve">Nếu người làm thêm giờ nghỉ theo đúng tỷ lệ của người không làm thêm cùng cấp bậc, công ty tránh được khoảng </w:t>
-      </w:r>
-      <w:r>
-        <w:rPr>
-          <w:rFonts w:ascii="Times New Roman" w:hAnsi="Times New Roman" w:cs="Times New Roman" w:eastAsia="Times New Roman"/>
-          <w:b/>
-          <w:bCs/>
-          <w:sz w:val="26"/>
-          <w:szCs w:val="26"/>
-        </w:rPr>
-        <w:t xml:space="preserve">83 ca nghỉ (35%)</w:t>
-      </w:r>
-      <w:r>
-        <w:rPr>
-          <w:rFonts w:ascii="Times New Roman" w:hAnsi="Times New Roman" w:cs="Times New Roman" w:eastAsia="Times New Roman"/>
-          <w:sz w:val="26"/>
-          <w:szCs w:val="26"/>
-        </w:rPr>
-        <w:t xml:space="preserve">, tỷ lệ nghỉ giảm từ 16,1% xuống khoảng </w:t>
-      </w:r>
-      <w:r>
-        <w:rPr>
-          <w:rFonts w:ascii="Times New Roman" w:hAnsi="Times New Roman" w:cs="Times New Roman" w:eastAsia="Times New Roman"/>
-          <w:b/>
-          <w:bCs/>
-          <w:sz w:val="26"/>
-          <w:szCs w:val="26"/>
-        </w:rPr>
-        <w:t xml:space="preserve">10,5%</w:t>
-      </w:r>
-      <w:r>
-        <w:rPr>
-          <w:rFonts w:ascii="Times New Roman" w:hAnsi="Times New Roman" w:cs="Times New Roman" w:eastAsia="Times New Roman"/>
-          <w:sz w:val="26"/>
-          <w:szCs w:val="26"/>
-        </w:rPr>
-        <w:t xml:space="preserve">. Với chi phí thay thế 50% lương năm, khoản tiết kiệm ước tính là </w:t>
-      </w:r>
-      <w:r>
-        <w:rPr>
-          <w:rFonts w:ascii="Times New Roman" w:hAnsi="Times New Roman" w:cs="Times New Roman" w:eastAsia="Times New Roman"/>
-          <w:b/>
-          <w:bCs/>
-          <w:sz w:val="26"/>
-          <w:szCs w:val="26"/>
-        </w:rPr>
-        <w:t xml:space="preserve">2,23 triệu USD</w:t>
-      </w:r>
-      <w:r>
-        <w:rPr>
-          <w:rFonts w:ascii="Times New Roman" w:hAnsi="Times New Roman" w:cs="Times New Roman" w:eastAsia="Times New Roman"/>
-          <w:sz w:val="26"/>
-          <w:szCs w:val="26"/>
-        </w:rPr>
-        <w:t xml:space="preserve">. Đây là cận trên, với giả định làm thêm giờ là nguyên nhân; dữ liệu cắt ngang chỉ chứng minh được mối liên hệ, chưa chứng minh được nhân quả.</w:t>
-      </w:r>
-    </w:p>
-    <w:p>
-      <w:pPr>
-        <w:pStyle w:val="Heading1"/>
-        <w:keepNext/>
-        <w:keepLines/>
-        <w:spacing w:before="240" w:after="240" w:line="240" w:lineRule="auto"/>
-        <w:ind w:left="0" w:firstLine="0"/>
-        <w:jc w:val="left"/>
-      </w:pPr>
-      <w:r>
-        <w:rPr>
-          <w:rFonts w:ascii="Times New Roman" w:hAnsi="Times New Roman" w:cs="Times New Roman" w:eastAsia="Times New Roman"/>
-          <w:b/>
-          <w:bCs/>
-          <w:sz w:val="26"/>
-          <w:szCs w:val="26"/>
-        </w:rPr>
-        <w:t xml:space="preserve">7. Đề xuất giải pháp cho tổ chức</w:t>
-      </w:r>
-    </w:p>
-    <w:p>
-      <w:pPr>
-        <w:spacing w:before="0" w:after="240" w:line="240" w:lineRule="auto"/>
-        <w:ind w:left="0" w:firstLine="720"/>
-        <w:jc w:val="both"/>
-      </w:pPr>
-      <w:r>
-        <w:rPr>
-          <w:rFonts w:ascii="Times New Roman" w:hAnsi="Times New Roman" w:cs="Times New Roman" w:eastAsia="Times New Roman"/>
-          <w:sz w:val="26"/>
-          <w:szCs w:val="26"/>
-        </w:rPr>
         <w:t xml:space="preserve">Ưu tiên số 1 là giới hạn làm thêm giờ cho Level 1 và nhân viên mới: đây là yếu tố mạnh nhất, công ty kiểm soát được, và gần như không tốn tiền. Các giải pháp dưới đây được xếp theo tác động ước tính và mức độ kiểm soát được, không theo độ lớn của chênh lệch tỷ lệ.</w:t>
       </w:r>
     </w:p>
@@ -16610,7 +16574,7 @@
         <w:pStyle w:val="Heading2"/>
         <w:keepNext/>
         <w:keepLines/>
-        <w:spacing w:before="0" w:after="240" w:line="240" w:lineRule="auto"/>
+        <w:spacing w:before="120" w:after="240" w:line="240" w:lineRule="auto"/>
         <w:ind w:left="0" w:firstLine="0"/>
         <w:jc w:val="left"/>
       </w:pPr>
@@ -17770,7 +17734,7 @@
         <w:pStyle w:val="Heading2"/>
         <w:keepNext/>
         <w:keepLines/>
-        <w:spacing w:before="0" w:after="240" w:line="240" w:lineRule="auto"/>
+        <w:spacing w:before="120" w:after="240" w:line="240" w:lineRule="auto"/>
         <w:ind w:left="0" w:firstLine="0"/>
         <w:jc w:val="left"/>
       </w:pPr>
@@ -17935,6 +17899,42 @@
         <w:pStyle w:val="Heading2"/>
         <w:keepNext/>
         <w:keepLines/>
+        <w:spacing w:before="120" w:after="240" w:line="240" w:lineRule="auto"/>
+        <w:ind w:left="0" w:firstLine="0"/>
+        <w:jc w:val="left"/>
+      </w:pPr>
+      <w:r>
+        <w:rPr>
+          <w:rFonts w:ascii="Times New Roman" w:hAnsi="Times New Roman" w:cs="Times New Roman" w:eastAsia="Times New Roman"/>
+          <w:b/>
+          <w:bCs/>
+          <w:sz w:val="26"/>
+          <w:szCs w:val="26"/>
+        </w:rPr>
+        <w:t xml:space="preserve">7.3. Mục tiêu đề xuất</w:t>
+      </w:r>
+    </w:p>
+    <w:p>
+      <w:pPr>
+        <w:spacing w:before="0" w:after="240" w:line="240" w:lineRule="auto"/>
+        <w:ind w:left="0" w:firstLine="720"/>
+        <w:jc w:val="both"/>
+      </w:pPr>
+      <w:r>
+        <w:rPr>
+          <w:rFonts w:ascii="Times New Roman" w:hAnsi="Times New Roman" w:cs="Times New Roman" w:eastAsia="Times New Roman"/>
+          <w:sz w:val="26"/>
+          <w:szCs w:val="26"/>
+        </w:rPr>
+        <w:t xml:space="preserve">Trong 12 tháng, mục tiêu là đưa tỷ lệ nghỉ từ 16,1% xuống dưới 12%, tương đương giảm khoảng 60 ca nghỉ mỗi năm. Mục tiêu này thận trọng hơn con số mô phỏng 10,5%, vì mô phỏng giả định làm thêm giờ là nguyên nhân trực tiếp. Giải pháp 3 (cổ phiếu) nên triển khai dưới dạng thí điểm có nhóm đối chứng để kiểm chứng hiệu quả trước khi mở rộng.</w:t>
+      </w:r>
+    </w:p>
+    <w:p>
+      <w:pPr>
+        <w:pStyle w:val="Heading1"/>
+        <w:keepNext/>
+        <w:keepLines/>
+        <w:pageBreakBefore/>
         <w:spacing w:before="0" w:after="240" w:line="240" w:lineRule="auto"/>
         <w:ind w:left="0" w:firstLine="0"/>
         <w:jc w:val="left"/>
@@ -17947,41 +17947,6 @@
           <w:sz w:val="26"/>
           <w:szCs w:val="26"/>
         </w:rPr>
-        <w:t xml:space="preserve">7.3. Mục tiêu đề xuất</w:t>
-      </w:r>
-    </w:p>
-    <w:p>
-      <w:pPr>
-        <w:spacing w:before="0" w:after="240" w:line="240" w:lineRule="auto"/>
-        <w:ind w:left="0" w:firstLine="720"/>
-        <w:jc w:val="both"/>
-      </w:pPr>
-      <w:r>
-        <w:rPr>
-          <w:rFonts w:ascii="Times New Roman" w:hAnsi="Times New Roman" w:cs="Times New Roman" w:eastAsia="Times New Roman"/>
-          <w:sz w:val="26"/>
-          <w:szCs w:val="26"/>
-        </w:rPr>
-        <w:t xml:space="preserve">Trong 12 tháng, mục tiêu là đưa tỷ lệ nghỉ từ 16,1% xuống dưới 12%, tương đương giảm khoảng 60 ca nghỉ mỗi năm. Mục tiêu này thận trọng hơn con số mô phỏng 10,5%, vì mô phỏng giả định làm thêm giờ là nguyên nhân trực tiếp. Giải pháp 3 (cổ phiếu) nên triển khai dưới dạng thí điểm có nhóm đối chứng để kiểm chứng hiệu quả trước khi mở rộng.</w:t>
-      </w:r>
-    </w:p>
-    <w:p>
-      <w:pPr>
-        <w:pStyle w:val="Heading1"/>
-        <w:keepNext/>
-        <w:keepLines/>
-        <w:spacing w:before="240" w:after="240" w:line="240" w:lineRule="auto"/>
-        <w:ind w:left="0" w:firstLine="0"/>
-        <w:jc w:val="left"/>
-      </w:pPr>
-      <w:r>
-        <w:rPr>
-          <w:rFonts w:ascii="Times New Roman" w:hAnsi="Times New Roman" w:cs="Times New Roman" w:eastAsia="Times New Roman"/>
-          <w:b/>
-          <w:bCs/>
-          <w:sz w:val="26"/>
-          <w:szCs w:val="26"/>
-        </w:rPr>
         <w:t xml:space="preserve">8. Kết luận, hạn chế và hướng phát triển</w:t>
       </w:r>
     </w:p>
@@ -17990,7 +17955,7 @@
         <w:pStyle w:val="Heading2"/>
         <w:keepNext/>
         <w:keepLines/>
-        <w:spacing w:before="0" w:after="240" w:line="240" w:lineRule="auto"/>
+        <w:spacing w:before="120" w:after="240" w:line="240" w:lineRule="auto"/>
         <w:ind w:left="0" w:firstLine="0"/>
         <w:jc w:val="left"/>
       </w:pPr>
@@ -18177,7 +18142,7 @@
         <w:pStyle w:val="Heading2"/>
         <w:keepNext/>
         <w:keepLines/>
-        <w:spacing w:before="0" w:after="240" w:line="240" w:lineRule="auto"/>
+        <w:spacing w:before="120" w:after="240" w:line="240" w:lineRule="auto"/>
         <w:ind w:left="0" w:firstLine="0"/>
         <w:jc w:val="left"/>
       </w:pPr>
@@ -18425,7 +18390,7 @@
         <w:pStyle w:val="Heading2"/>
         <w:keepNext/>
         <w:keepLines/>
-        <w:spacing w:before="0" w:after="240" w:line="240" w:lineRule="auto"/>
+        <w:spacing w:before="120" w:after="240" w:line="240" w:lineRule="auto"/>
         <w:ind w:left="0" w:firstLine="0"/>
         <w:jc w:val="left"/>
       </w:pPr>
@@ -18557,7 +18522,8 @@
         <w:pStyle w:val="Heading1"/>
         <w:keepNext/>
         <w:keepLines/>
-        <w:spacing w:before="240" w:after="240" w:line="240" w:lineRule="auto"/>
+        <w:pageBreakBefore/>
+        <w:spacing w:before="0" w:after="240" w:line="240" w:lineRule="auto"/>
         <w:ind w:left="0" w:firstLine="0"/>
         <w:jc w:val="left"/>
       </w:pPr>
@@ -18850,614 +18816,6 @@
           <w:szCs w:val="26"/>
         </w:rPr>
         <w:t xml:space="preserve">, 62(2), pp. 237–240.</w:t>
-      </w:r>
-    </w:p>
-    <w:p>
-      <w:pPr>
-        <w:pStyle w:val="Heading1"/>
-        <w:keepNext/>
-        <w:keepLines/>
-        <w:spacing w:before="240" w:after="240" w:line="240" w:lineRule="auto"/>
-        <w:ind w:left="0" w:firstLine="0"/>
-        <w:jc w:val="left"/>
-      </w:pPr>
-      <w:r>
-        <w:rPr>
-          <w:rFonts w:ascii="Times New Roman" w:hAnsi="Times New Roman" w:cs="Times New Roman" w:eastAsia="Times New Roman"/>
-          <w:b/>
-          <w:bCs/>
-          <w:sz w:val="26"/>
-          <w:szCs w:val="26"/>
-        </w:rPr>
-        <w:t xml:space="preserve">Phụ lục. Phân công công việc và mức độ đóng góp của các thành viên</w:t>
-      </w:r>
-    </w:p>
-    <w:p>
-      <w:pPr>
-        <w:keepNext/>
-        <w:keepLines/>
-        <w:spacing w:before="0" w:after="120" w:line="240" w:lineRule="auto"/>
-        <w:ind w:left="0" w:firstLine="0"/>
-        <w:jc w:val="center"/>
-      </w:pPr>
-      <w:r>
-        <w:rPr>
-          <w:rFonts w:ascii="Times New Roman" w:hAnsi="Times New Roman" w:cs="Times New Roman" w:eastAsia="Times New Roman"/>
-          <w:b/>
-          <w:bCs/>
-          <w:sz w:val="24"/>
-          <w:szCs w:val="24"/>
-        </w:rPr>
-        <w:t xml:space="preserve">Bảng PL.1.</w:t>
-      </w:r>
-      <w:r>
-        <w:rPr>
-          <w:rFonts w:ascii="Times New Roman" w:hAnsi="Times New Roman" w:cs="Times New Roman" w:eastAsia="Times New Roman"/>
-          <w:sz w:val="24"/>
-          <w:szCs w:val="24"/>
-        </w:rPr>
-        <w:t xml:space="preserve"> Phân công công việc và mức độ đóng góp</w:t>
-      </w:r>
-    </w:p>
-    <w:tbl>
-      <w:tblPr>
-        <w:tblW w:w="9360" w:type="dxa"/>
-        <w:jc w:val="center"/>
-        <w:tblBorders>
-          <w:top w:val="single" w:sz="4" w:space="0" w:color="000000"/>
-          <w:left w:val="single" w:sz="4" w:space="0" w:color="000000"/>
-          <w:bottom w:val="single" w:sz="4" w:space="0" w:color="000000"/>
-          <w:right w:val="single" w:sz="4" w:space="0" w:color="000000"/>
-          <w:insideH w:val="single" w:sz="4" w:space="0" w:color="000000"/>
-          <w:insideV w:val="single" w:sz="4" w:space="0" w:color="000000"/>
-        </w:tblBorders>
-        <w:tblLayout w:type="fixed"/>
-        <w:tblCellMar>
-          <w:top w:w="40" w:type="dxa"/>
-          <w:left w:w="80" w:type="dxa"/>
-          <w:bottom w:w="40" w:type="dxa"/>
-          <w:right w:w="80" w:type="dxa"/>
-        </w:tblCellMar>
-      </w:tblPr>
-      <w:tblGrid>
-        <w:gridCol w:w="749"/>
-        <w:gridCol w:w="2527"/>
-        <w:gridCol w:w="1685"/>
-        <w:gridCol w:w="2995"/>
-        <w:gridCol w:w="1404"/>
-      </w:tblGrid>
-      <w:tr>
-        <w:trPr>
-          <w:cantSplit/>
-          <w:tblHeader/>
-        </w:trPr>
-        <w:tc>
-          <w:tcPr>
-            <w:tcW w:w="749" w:type="dxa"/>
-            <w:shd w:val="clear" w:color="auto" w:fill="F2F2F2"/>
-            <w:vAlign w:val="center"/>
-          </w:tcPr>
-          <w:p>
-            <w:pPr>
-              <w:spacing w:before="0" w:after="0" w:line="240" w:lineRule="auto"/>
-              <w:ind w:left="0" w:firstLine="0"/>
-              <w:jc w:val="center"/>
-            </w:pPr>
-            <w:r>
-              <w:rPr>
-                <w:rFonts w:ascii="Times New Roman" w:hAnsi="Times New Roman" w:cs="Times New Roman" w:eastAsia="Times New Roman"/>
-                <w:b/>
-                <w:bCs/>
-                <w:sz w:val="22"/>
-                <w:szCs w:val="22"/>
-              </w:rPr>
-              <w:t xml:space="preserve">STT</w:t>
-            </w:r>
-          </w:p>
-        </w:tc>
-        <w:tc>
-          <w:tcPr>
-            <w:tcW w:w="2527" w:type="dxa"/>
-            <w:shd w:val="clear" w:color="auto" w:fill="F2F2F2"/>
-            <w:vAlign w:val="center"/>
-          </w:tcPr>
-          <w:p>
-            <w:pPr>
-              <w:spacing w:before="0" w:after="0" w:line="240" w:lineRule="auto"/>
-              <w:ind w:left="0" w:firstLine="0"/>
-              <w:jc w:val="center"/>
-            </w:pPr>
-            <w:r>
-              <w:rPr>
-                <w:rFonts w:ascii="Times New Roman" w:hAnsi="Times New Roman" w:cs="Times New Roman" w:eastAsia="Times New Roman"/>
-                <w:b/>
-                <w:bCs/>
-                <w:sz w:val="22"/>
-                <w:szCs w:val="22"/>
-              </w:rPr>
-              <w:t xml:space="preserve">Họ và tên</w:t>
-            </w:r>
-          </w:p>
-        </w:tc>
-        <w:tc>
-          <w:tcPr>
-            <w:tcW w:w="1685" w:type="dxa"/>
-            <w:shd w:val="clear" w:color="auto" w:fill="F2F2F2"/>
-            <w:vAlign w:val="center"/>
-          </w:tcPr>
-          <w:p>
-            <w:pPr>
-              <w:spacing w:before="0" w:after="0" w:line="240" w:lineRule="auto"/>
-              <w:ind w:left="0" w:firstLine="0"/>
-              <w:jc w:val="center"/>
-            </w:pPr>
-            <w:r>
-              <w:rPr>
-                <w:rFonts w:ascii="Times New Roman" w:hAnsi="Times New Roman" w:cs="Times New Roman" w:eastAsia="Times New Roman"/>
-                <w:b/>
-                <w:bCs/>
-                <w:sz w:val="22"/>
-                <w:szCs w:val="22"/>
-              </w:rPr>
-              <w:t xml:space="preserve">Mã sinh viên</w:t>
-            </w:r>
-          </w:p>
-        </w:tc>
-        <w:tc>
-          <w:tcPr>
-            <w:tcW w:w="2995" w:type="dxa"/>
-            <w:shd w:val="clear" w:color="auto" w:fill="F2F2F2"/>
-            <w:vAlign w:val="center"/>
-          </w:tcPr>
-          <w:p>
-            <w:pPr>
-              <w:spacing w:before="0" w:after="0" w:line="240" w:lineRule="auto"/>
-              <w:ind w:left="0" w:firstLine="0"/>
-              <w:jc w:val="center"/>
-            </w:pPr>
-            <w:r>
-              <w:rPr>
-                <w:rFonts w:ascii="Times New Roman" w:hAnsi="Times New Roman" w:cs="Times New Roman" w:eastAsia="Times New Roman"/>
-                <w:b/>
-                <w:bCs/>
-                <w:sz w:val="22"/>
-                <w:szCs w:val="22"/>
-              </w:rPr>
-              <w:t xml:space="preserve">Nhiệm vụ chính</w:t>
-            </w:r>
-          </w:p>
-        </w:tc>
-        <w:tc>
-          <w:tcPr>
-            <w:tcW w:w="1404" w:type="dxa"/>
-            <w:shd w:val="clear" w:color="auto" w:fill="F2F2F2"/>
-            <w:vAlign w:val="center"/>
-          </w:tcPr>
-          <w:p>
-            <w:pPr>
-              <w:spacing w:before="0" w:after="0" w:line="240" w:lineRule="auto"/>
-              <w:ind w:left="0" w:firstLine="0"/>
-              <w:jc w:val="center"/>
-            </w:pPr>
-            <w:r>
-              <w:rPr>
-                <w:rFonts w:ascii="Times New Roman" w:hAnsi="Times New Roman" w:cs="Times New Roman" w:eastAsia="Times New Roman"/>
-                <w:b/>
-                <w:bCs/>
-                <w:sz w:val="22"/>
-                <w:szCs w:val="22"/>
-              </w:rPr>
-              <w:t xml:space="preserve">Mức đóng góp (%)</w:t>
-            </w:r>
-          </w:p>
-        </w:tc>
-      </w:tr>
-      <w:tr>
-        <w:trPr>
-          <w:cantSplit/>
-        </w:trPr>
-        <w:tc>
-          <w:tcPr>
-            <w:tcW w:w="749" w:type="dxa"/>
-            <w:vAlign w:val="center"/>
-          </w:tcPr>
-          <w:p>
-            <w:pPr>
-              <w:spacing w:before="0" w:after="0" w:line="240" w:lineRule="auto"/>
-              <w:ind w:left="0" w:firstLine="0"/>
-              <w:jc w:val="left"/>
-            </w:pPr>
-            <w:r>
-              <w:rPr>
-                <w:rFonts w:ascii="Times New Roman" w:hAnsi="Times New Roman" w:cs="Times New Roman" w:eastAsia="Times New Roman"/>
-                <w:sz w:val="22"/>
-                <w:szCs w:val="22"/>
-              </w:rPr>
-              <w:t xml:space="preserve">1</w:t>
-            </w:r>
-          </w:p>
-        </w:tc>
-        <w:tc>
-          <w:tcPr>
-            <w:tcW w:w="2527" w:type="dxa"/>
-            <w:vAlign w:val="center"/>
-          </w:tcPr>
-          <w:p>
-            <w:pPr>
-              <w:spacing w:before="0" w:after="0" w:line="240" w:lineRule="auto"/>
-              <w:ind w:left="0" w:firstLine="0"/>
-              <w:jc w:val="left"/>
-            </w:pPr>
-          </w:p>
-        </w:tc>
-        <w:tc>
-          <w:tcPr>
-            <w:tcW w:w="1685" w:type="dxa"/>
-            <w:vAlign w:val="center"/>
-          </w:tcPr>
-          <w:p>
-            <w:pPr>
-              <w:spacing w:before="0" w:after="0" w:line="240" w:lineRule="auto"/>
-              <w:ind w:left="0" w:firstLine="0"/>
-              <w:jc w:val="left"/>
-            </w:pPr>
-          </w:p>
-        </w:tc>
-        <w:tc>
-          <w:tcPr>
-            <w:tcW w:w="2995" w:type="dxa"/>
-            <w:vAlign w:val="center"/>
-          </w:tcPr>
-          <w:p>
-            <w:pPr>
-              <w:spacing w:before="0" w:after="0" w:line="240" w:lineRule="auto"/>
-              <w:ind w:left="0" w:firstLine="0"/>
-              <w:jc w:val="left"/>
-            </w:pPr>
-          </w:p>
-        </w:tc>
-        <w:tc>
-          <w:tcPr>
-            <w:tcW w:w="1404" w:type="dxa"/>
-            <w:vAlign w:val="center"/>
-          </w:tcPr>
-          <w:p>
-            <w:pPr>
-              <w:spacing w:before="0" w:after="0" w:line="240" w:lineRule="auto"/>
-              <w:ind w:left="0" w:firstLine="0"/>
-              <w:jc w:val="left"/>
-            </w:pPr>
-          </w:p>
-        </w:tc>
-      </w:tr>
-      <w:tr>
-        <w:trPr>
-          <w:cantSplit/>
-        </w:trPr>
-        <w:tc>
-          <w:tcPr>
-            <w:tcW w:w="749" w:type="dxa"/>
-            <w:vAlign w:val="center"/>
-          </w:tcPr>
-          <w:p>
-            <w:pPr>
-              <w:spacing w:before="0" w:after="0" w:line="240" w:lineRule="auto"/>
-              <w:ind w:left="0" w:firstLine="0"/>
-              <w:jc w:val="left"/>
-            </w:pPr>
-            <w:r>
-              <w:rPr>
-                <w:rFonts w:ascii="Times New Roman" w:hAnsi="Times New Roman" w:cs="Times New Roman" w:eastAsia="Times New Roman"/>
-                <w:sz w:val="22"/>
-                <w:szCs w:val="22"/>
-              </w:rPr>
-              <w:t xml:space="preserve">2</w:t>
-            </w:r>
-          </w:p>
-        </w:tc>
-        <w:tc>
-          <w:tcPr>
-            <w:tcW w:w="2527" w:type="dxa"/>
-            <w:vAlign w:val="center"/>
-          </w:tcPr>
-          <w:p>
-            <w:pPr>
-              <w:spacing w:before="0" w:after="0" w:line="240" w:lineRule="auto"/>
-              <w:ind w:left="0" w:firstLine="0"/>
-              <w:jc w:val="left"/>
-            </w:pPr>
-          </w:p>
-        </w:tc>
-        <w:tc>
-          <w:tcPr>
-            <w:tcW w:w="1685" w:type="dxa"/>
-            <w:vAlign w:val="center"/>
-          </w:tcPr>
-          <w:p>
-            <w:pPr>
-              <w:spacing w:before="0" w:after="0" w:line="240" w:lineRule="auto"/>
-              <w:ind w:left="0" w:firstLine="0"/>
-              <w:jc w:val="left"/>
-            </w:pPr>
-          </w:p>
-        </w:tc>
-        <w:tc>
-          <w:tcPr>
-            <w:tcW w:w="2995" w:type="dxa"/>
-            <w:vAlign w:val="center"/>
-          </w:tcPr>
-          <w:p>
-            <w:pPr>
-              <w:spacing w:before="0" w:after="0" w:line="240" w:lineRule="auto"/>
-              <w:ind w:left="0" w:firstLine="0"/>
-              <w:jc w:val="left"/>
-            </w:pPr>
-          </w:p>
-        </w:tc>
-        <w:tc>
-          <w:tcPr>
-            <w:tcW w:w="1404" w:type="dxa"/>
-            <w:vAlign w:val="center"/>
-          </w:tcPr>
-          <w:p>
-            <w:pPr>
-              <w:spacing w:before="0" w:after="0" w:line="240" w:lineRule="auto"/>
-              <w:ind w:left="0" w:firstLine="0"/>
-              <w:jc w:val="left"/>
-            </w:pPr>
-          </w:p>
-        </w:tc>
-      </w:tr>
-      <w:tr>
-        <w:trPr>
-          <w:cantSplit/>
-        </w:trPr>
-        <w:tc>
-          <w:tcPr>
-            <w:tcW w:w="749" w:type="dxa"/>
-            <w:vAlign w:val="center"/>
-          </w:tcPr>
-          <w:p>
-            <w:pPr>
-              <w:spacing w:before="0" w:after="0" w:line="240" w:lineRule="auto"/>
-              <w:ind w:left="0" w:firstLine="0"/>
-              <w:jc w:val="left"/>
-            </w:pPr>
-            <w:r>
-              <w:rPr>
-                <w:rFonts w:ascii="Times New Roman" w:hAnsi="Times New Roman" w:cs="Times New Roman" w:eastAsia="Times New Roman"/>
-                <w:sz w:val="22"/>
-                <w:szCs w:val="22"/>
-              </w:rPr>
-              <w:t xml:space="preserve">3</w:t>
-            </w:r>
-          </w:p>
-        </w:tc>
-        <w:tc>
-          <w:tcPr>
-            <w:tcW w:w="2527" w:type="dxa"/>
-            <w:vAlign w:val="center"/>
-          </w:tcPr>
-          <w:p>
-            <w:pPr>
-              <w:spacing w:before="0" w:after="0" w:line="240" w:lineRule="auto"/>
-              <w:ind w:left="0" w:firstLine="0"/>
-              <w:jc w:val="left"/>
-            </w:pPr>
-          </w:p>
-        </w:tc>
-        <w:tc>
-          <w:tcPr>
-            <w:tcW w:w="1685" w:type="dxa"/>
-            <w:vAlign w:val="center"/>
-          </w:tcPr>
-          <w:p>
-            <w:pPr>
-              <w:spacing w:before="0" w:after="0" w:line="240" w:lineRule="auto"/>
-              <w:ind w:left="0" w:firstLine="0"/>
-              <w:jc w:val="left"/>
-            </w:pPr>
-          </w:p>
-        </w:tc>
-        <w:tc>
-          <w:tcPr>
-            <w:tcW w:w="2995" w:type="dxa"/>
-            <w:vAlign w:val="center"/>
-          </w:tcPr>
-          <w:p>
-            <w:pPr>
-              <w:spacing w:before="0" w:after="0" w:line="240" w:lineRule="auto"/>
-              <w:ind w:left="0" w:firstLine="0"/>
-              <w:jc w:val="left"/>
-            </w:pPr>
-          </w:p>
-        </w:tc>
-        <w:tc>
-          <w:tcPr>
-            <w:tcW w:w="1404" w:type="dxa"/>
-            <w:vAlign w:val="center"/>
-          </w:tcPr>
-          <w:p>
-            <w:pPr>
-              <w:spacing w:before="0" w:after="0" w:line="240" w:lineRule="auto"/>
-              <w:ind w:left="0" w:firstLine="0"/>
-              <w:jc w:val="left"/>
-            </w:pPr>
-          </w:p>
-        </w:tc>
-      </w:tr>
-      <w:tr>
-        <w:trPr>
-          <w:cantSplit/>
-        </w:trPr>
-        <w:tc>
-          <w:tcPr>
-            <w:tcW w:w="749" w:type="dxa"/>
-            <w:vAlign w:val="center"/>
-          </w:tcPr>
-          <w:p>
-            <w:pPr>
-              <w:spacing w:before="0" w:after="0" w:line="240" w:lineRule="auto"/>
-              <w:ind w:left="0" w:firstLine="0"/>
-              <w:jc w:val="left"/>
-            </w:pPr>
-            <w:r>
-              <w:rPr>
-                <w:rFonts w:ascii="Times New Roman" w:hAnsi="Times New Roman" w:cs="Times New Roman" w:eastAsia="Times New Roman"/>
-                <w:sz w:val="22"/>
-                <w:szCs w:val="22"/>
-              </w:rPr>
-              <w:t xml:space="preserve">4</w:t>
-            </w:r>
-          </w:p>
-        </w:tc>
-        <w:tc>
-          <w:tcPr>
-            <w:tcW w:w="2527" w:type="dxa"/>
-            <w:vAlign w:val="center"/>
-          </w:tcPr>
-          <w:p>
-            <w:pPr>
-              <w:spacing w:before="0" w:after="0" w:line="240" w:lineRule="auto"/>
-              <w:ind w:left="0" w:firstLine="0"/>
-              <w:jc w:val="left"/>
-            </w:pPr>
-          </w:p>
-        </w:tc>
-        <w:tc>
-          <w:tcPr>
-            <w:tcW w:w="1685" w:type="dxa"/>
-            <w:vAlign w:val="center"/>
-          </w:tcPr>
-          <w:p>
-            <w:pPr>
-              <w:spacing w:before="0" w:after="0" w:line="240" w:lineRule="auto"/>
-              <w:ind w:left="0" w:firstLine="0"/>
-              <w:jc w:val="left"/>
-            </w:pPr>
-          </w:p>
-        </w:tc>
-        <w:tc>
-          <w:tcPr>
-            <w:tcW w:w="2995" w:type="dxa"/>
-            <w:vAlign w:val="center"/>
-          </w:tcPr>
-          <w:p>
-            <w:pPr>
-              <w:spacing w:before="0" w:after="0" w:line="240" w:lineRule="auto"/>
-              <w:ind w:left="0" w:firstLine="0"/>
-              <w:jc w:val="left"/>
-            </w:pPr>
-          </w:p>
-        </w:tc>
-        <w:tc>
-          <w:tcPr>
-            <w:tcW w:w="1404" w:type="dxa"/>
-            <w:vAlign w:val="center"/>
-          </w:tcPr>
-          <w:p>
-            <w:pPr>
-              <w:spacing w:before="0" w:after="0" w:line="240" w:lineRule="auto"/>
-              <w:ind w:left="0" w:firstLine="0"/>
-              <w:jc w:val="left"/>
-            </w:pPr>
-          </w:p>
-        </w:tc>
-      </w:tr>
-      <w:tr>
-        <w:trPr>
-          <w:cantSplit/>
-        </w:trPr>
-        <w:tc>
-          <w:tcPr>
-            <w:tcW w:w="749" w:type="dxa"/>
-            <w:vAlign w:val="center"/>
-          </w:tcPr>
-          <w:p>
-            <w:pPr>
-              <w:spacing w:before="0" w:after="0" w:line="240" w:lineRule="auto"/>
-              <w:ind w:left="0" w:firstLine="0"/>
-              <w:jc w:val="left"/>
-            </w:pPr>
-            <w:r>
-              <w:rPr>
-                <w:rFonts w:ascii="Times New Roman" w:hAnsi="Times New Roman" w:cs="Times New Roman" w:eastAsia="Times New Roman"/>
-                <w:sz w:val="22"/>
-                <w:szCs w:val="22"/>
-              </w:rPr>
-              <w:t xml:space="preserve">5</w:t>
-            </w:r>
-          </w:p>
-        </w:tc>
-        <w:tc>
-          <w:tcPr>
-            <w:tcW w:w="2527" w:type="dxa"/>
-            <w:vAlign w:val="center"/>
-          </w:tcPr>
-          <w:p>
-            <w:pPr>
-              <w:spacing w:before="0" w:after="0" w:line="240" w:lineRule="auto"/>
-              <w:ind w:left="0" w:firstLine="0"/>
-              <w:jc w:val="left"/>
-            </w:pPr>
-          </w:p>
-        </w:tc>
-        <w:tc>
-          <w:tcPr>
-            <w:tcW w:w="1685" w:type="dxa"/>
-            <w:vAlign w:val="center"/>
-          </w:tcPr>
-          <w:p>
-            <w:pPr>
-              <w:spacing w:before="0" w:after="0" w:line="240" w:lineRule="auto"/>
-              <w:ind w:left="0" w:firstLine="0"/>
-              <w:jc w:val="left"/>
-            </w:pPr>
-          </w:p>
-        </w:tc>
-        <w:tc>
-          <w:tcPr>
-            <w:tcW w:w="2995" w:type="dxa"/>
-            <w:vAlign w:val="center"/>
-          </w:tcPr>
-          <w:p>
-            <w:pPr>
-              <w:spacing w:before="0" w:after="0" w:line="240" w:lineRule="auto"/>
-              <w:ind w:left="0" w:firstLine="0"/>
-              <w:jc w:val="left"/>
-            </w:pPr>
-          </w:p>
-        </w:tc>
-        <w:tc>
-          <w:tcPr>
-            <w:tcW w:w="1404" w:type="dxa"/>
-            <w:vAlign w:val="center"/>
-          </w:tcPr>
-          <w:p>
-            <w:pPr>
-              <w:spacing w:before="0" w:after="0" w:line="240" w:lineRule="auto"/>
-              <w:ind w:left="0" w:firstLine="0"/>
-              <w:jc w:val="left"/>
-            </w:pPr>
-          </w:p>
-        </w:tc>
-      </w:tr>
-    </w:tbl>
-    <w:p>
-      <w:pPr>
-        <w:spacing w:before="0" w:after="240" w:line="240" w:lineRule="auto"/>
-        <w:ind w:left="0" w:firstLine="0"/>
-        <w:jc w:val="left"/>
-      </w:pPr>
-      <w:r>
-        <w:rPr>
-          <w:rFonts w:ascii="Times New Roman" w:hAnsi="Times New Roman" w:cs="Times New Roman" w:eastAsia="Times New Roman"/>
-          <w:i/>
-          <w:iCs/>
-          <w:sz w:val="22"/>
-          <w:szCs w:val="22"/>
-        </w:rPr>
-        <w:t xml:space="preserve">Nguồn: Nhóm tác giả.</w:t>
       </w:r>
     </w:p>
     <w:sectPr>

</xml_diff>

<commit_message>
Remove dashboard figure placeholders; condense main content to 20 pages
Co-Authored-By: Claude Opus 5.5 <noreply@anthropic.com>
Claude-Session: https://claude.ai/code/session_0174ASkiVUfb5uMqZ6D8cKUt
</commit_message>
<xml_diff>
--- a/Bao_cao_cuoi_ky_Employee_Attrition.docx
+++ b/Bao_cao_cuoi_ky_Employee_Attrition.docx
@@ -1204,7 +1204,7 @@
         </w:rPr>
         <w:t xml:space="preserve">1.4. Giả thuyết nghiên cứu</w:t>
         <w:tab/>
-        <w:t xml:space="preserve">7</w:t>
+        <w:t xml:space="preserve">6</w:t>
       </w:r>
     </w:p>
     <w:p>
@@ -1232,6 +1232,28 @@
         <w:tabs>
           <w:tab w:val="right" w:leader="dot" w:pos="9360"/>
         </w:tabs>
+        <w:spacing w:before="60" w:after="80" w:line="240" w:lineRule="auto"/>
+        <w:ind w:left="0" w:firstLine="0"/>
+        <w:jc w:val="left"/>
+      </w:pPr>
+      <w:r>
+        <w:rPr>
+          <w:rFonts w:ascii="Times New Roman" w:hAnsi="Times New Roman" w:cs="Times New Roman" w:eastAsia="Times New Roman"/>
+          <w:b/>
+          <w:bCs/>
+          <w:sz w:val="26"/>
+          <w:szCs w:val="26"/>
+        </w:rPr>
+        <w:t xml:space="preserve">2. Mô tả dữ liệu</w:t>
+        <w:tab/>
+        <w:t xml:space="preserve">8</w:t>
+      </w:r>
+    </w:p>
+    <w:p>
+      <w:pPr>
+        <w:tabs>
+          <w:tab w:val="right" w:leader="dot" w:pos="9360"/>
+        </w:tabs>
         <w:spacing w:before="0" w:after="60" w:line="240" w:lineRule="auto"/>
         <w:ind w:left="360" w:firstLine="0"/>
         <w:jc w:val="left"/>
@@ -1242,9 +1264,49 @@
           <w:sz w:val="26"/>
           <w:szCs w:val="26"/>
         </w:rPr>
-        <w:t xml:space="preserve">1.6. Kết cấu báo cáo</w:t>
+        <w:t xml:space="preserve">2.1. Nguồn và bản chất dữ liệu</w:t>
         <w:tab/>
         <w:t xml:space="preserve">8</w:t>
+      </w:r>
+    </w:p>
+    <w:p>
+      <w:pPr>
+        <w:tabs>
+          <w:tab w:val="right" w:leader="dot" w:pos="9360"/>
+        </w:tabs>
+        <w:spacing w:before="0" w:after="60" w:line="240" w:lineRule="auto"/>
+        <w:ind w:left="360" w:firstLine="0"/>
+        <w:jc w:val="left"/>
+      </w:pPr>
+      <w:r>
+        <w:rPr>
+          <w:rFonts w:ascii="Times New Roman" w:hAnsi="Times New Roman" w:cs="Times New Roman" w:eastAsia="Times New Roman"/>
+          <w:sz w:val="26"/>
+          <w:szCs w:val="26"/>
+        </w:rPr>
+        <w:t xml:space="preserve">2.2. Nhóm biến chính</w:t>
+        <w:tab/>
+        <w:t xml:space="preserve">8</w:t>
+      </w:r>
+    </w:p>
+    <w:p>
+      <w:pPr>
+        <w:tabs>
+          <w:tab w:val="right" w:leader="dot" w:pos="9360"/>
+        </w:tabs>
+        <w:spacing w:before="0" w:after="60" w:line="240" w:lineRule="auto"/>
+        <w:ind w:left="360" w:firstLine="0"/>
+        <w:jc w:val="left"/>
+      </w:pPr>
+      <w:r>
+        <w:rPr>
+          <w:rFonts w:ascii="Times New Roman" w:hAnsi="Times New Roman" w:cs="Times New Roman" w:eastAsia="Times New Roman"/>
+          <w:sz w:val="26"/>
+          <w:szCs w:val="26"/>
+        </w:rPr>
+        <w:t xml:space="preserve">2.3. Thống kê mô tả ban đầu</w:t>
+        <w:tab/>
+        <w:t xml:space="preserve">9</w:t>
       </w:r>
     </w:p>
     <w:p>
@@ -1264,9 +1326,9 @@
           <w:sz w:val="26"/>
           <w:szCs w:val="26"/>
         </w:rPr>
-        <w:t xml:space="preserve">2. Mô tả dữ liệu</w:t>
+        <w:t xml:space="preserve">3. Tiền xử lý, làm sạch và mô hình hóa dữ liệu</w:t>
         <w:tab/>
-        <w:t xml:space="preserve">9</w:t>
+        <w:t xml:space="preserve">10</w:t>
       </w:r>
     </w:p>
     <w:p>
@@ -1284,9 +1346,9 @@
           <w:sz w:val="26"/>
           <w:szCs w:val="26"/>
         </w:rPr>
-        <w:t xml:space="preserve">2.1. Nguồn và bản chất dữ liệu</w:t>
+        <w:t xml:space="preserve">3.1. Kiểm tra chất lượng dữ liệu</w:t>
         <w:tab/>
-        <w:t xml:space="preserve">9</w:t>
+        <w:t xml:space="preserve">10</w:t>
       </w:r>
     </w:p>
     <w:p>
@@ -1304,9 +1366,9 @@
           <w:sz w:val="26"/>
           <w:szCs w:val="26"/>
         </w:rPr>
-        <w:t xml:space="preserve">2.2. Nhóm biến chính</w:t>
+        <w:t xml:space="preserve">3.2. Biến đổi và tạo biến mới (feature engineering)</w:t>
         <w:tab/>
-        <w:t xml:space="preserve">9</w:t>
+        <w:t xml:space="preserve">10</w:t>
       </w:r>
     </w:p>
     <w:p>
@@ -1324,9 +1386,29 @@
           <w:sz w:val="26"/>
           <w:szCs w:val="26"/>
         </w:rPr>
-        <w:t xml:space="preserve">2.3. Thống kê mô tả ban đầu</w:t>
+        <w:t xml:space="preserve">3.3. Mô hình dữ liệu trong Power BI</w:t>
         <w:tab/>
-        <w:t xml:space="preserve">10</w:t>
+        <w:t xml:space="preserve">11</w:t>
+      </w:r>
+    </w:p>
+    <w:p>
+      <w:pPr>
+        <w:tabs>
+          <w:tab w:val="right" w:leader="dot" w:pos="9360"/>
+        </w:tabs>
+        <w:spacing w:before="0" w:after="60" w:line="240" w:lineRule="auto"/>
+        <w:ind w:left="360" w:firstLine="0"/>
+        <w:jc w:val="left"/>
+      </w:pPr>
+      <w:r>
+        <w:rPr>
+          <w:rFonts w:ascii="Times New Roman" w:hAnsi="Times New Roman" w:cs="Times New Roman" w:eastAsia="Times New Roman"/>
+          <w:sz w:val="26"/>
+          <w:szCs w:val="26"/>
+        </w:rPr>
+        <w:t xml:space="preserve">3.4. Các measure DAX chính</w:t>
+        <w:tab/>
+        <w:t xml:space="preserve">12</w:t>
       </w:r>
     </w:p>
     <w:p>
@@ -1346,9 +1428,9 @@
           <w:sz w:val="26"/>
           <w:szCs w:val="26"/>
         </w:rPr>
-        <w:t xml:space="preserve">3. Tiền xử lý, làm sạch và mô hình hóa dữ liệu</w:t>
+        <w:t xml:space="preserve">4. Trực quan hóa dữ liệu: thiết kế dashboard Power BI</w:t>
         <w:tab/>
-        <w:t xml:space="preserve">11</w:t>
+        <w:t xml:space="preserve">13</w:t>
       </w:r>
     </w:p>
     <w:p>
@@ -1366,9 +1448,9 @@
           <w:sz w:val="26"/>
           <w:szCs w:val="26"/>
         </w:rPr>
-        <w:t xml:space="preserve">3.1. Kiểm tra chất lượng dữ liệu</w:t>
+        <w:t xml:space="preserve">4.1. Nguyên tắc thiết kế</w:t>
         <w:tab/>
-        <w:t xml:space="preserve">11</w:t>
+        <w:t xml:space="preserve">13</w:t>
       </w:r>
     </w:p>
     <w:p>
@@ -1386,9 +1468,31 @@
           <w:sz w:val="26"/>
           <w:szCs w:val="26"/>
         </w:rPr>
-        <w:t xml:space="preserve">3.2. Biến đổi và tạo biến mới (feature engineering)</w:t>
+        <w:t xml:space="preserve">4.2. Cấu trúc 6 trang</w:t>
         <w:tab/>
-        <w:t xml:space="preserve">11</w:t>
+        <w:t xml:space="preserve">13</w:t>
+      </w:r>
+    </w:p>
+    <w:p>
+      <w:pPr>
+        <w:tabs>
+          <w:tab w:val="right" w:leader="dot" w:pos="9360"/>
+        </w:tabs>
+        <w:spacing w:before="60" w:after="80" w:line="240" w:lineRule="auto"/>
+        <w:ind w:left="0" w:firstLine="0"/>
+        <w:jc w:val="left"/>
+      </w:pPr>
+      <w:r>
+        <w:rPr>
+          <w:rFonts w:ascii="Times New Roman" w:hAnsi="Times New Roman" w:cs="Times New Roman" w:eastAsia="Times New Roman"/>
+          <w:b/>
+          <w:bCs/>
+          <w:sz w:val="26"/>
+          <w:szCs w:val="26"/>
+        </w:rPr>
+        <w:t xml:space="preserve">5. Khai thác dữ liệu: kết quả phân tích khám phá</w:t>
+        <w:tab/>
+        <w:t xml:space="preserve">14</w:t>
       </w:r>
     </w:p>
     <w:p>
@@ -1406,9 +1510,9 @@
           <w:sz w:val="26"/>
           <w:szCs w:val="26"/>
         </w:rPr>
-        <w:t xml:space="preserve">3.3. Mô hình dữ liệu trong Power BI</w:t>
+        <w:t xml:space="preserve">5.1. Tổng quan: vấn đề nằm ở tuyến đầu</w:t>
         <w:tab/>
-        <w:t xml:space="preserve">12</w:t>
+        <w:t xml:space="preserve">14</w:t>
       </w:r>
     </w:p>
     <w:p>
@@ -1426,9 +1530,89 @@
           <w:sz w:val="26"/>
           <w:szCs w:val="26"/>
         </w:rPr>
-        <w:t xml:space="preserve">3.4. Các measure DAX chính</w:t>
+        <w:t xml:space="preserve">5.2. Chân dung người nghỉ: trẻ, mới vào, cấp thấp, độc thân</w:t>
         <w:tab/>
-        <w:t xml:space="preserve">13</w:t>
+        <w:t xml:space="preserve">14</w:t>
+      </w:r>
+    </w:p>
+    <w:p>
+      <w:pPr>
+        <w:tabs>
+          <w:tab w:val="right" w:leader="dot" w:pos="9360"/>
+        </w:tabs>
+        <w:spacing w:before="0" w:after="60" w:line="240" w:lineRule="auto"/>
+        <w:ind w:left="360" w:firstLine="0"/>
+        <w:jc w:val="left"/>
+      </w:pPr>
+      <w:r>
+        <w:rPr>
+          <w:rFonts w:ascii="Times New Roman" w:hAnsi="Times New Roman" w:cs="Times New Roman" w:eastAsia="Times New Roman"/>
+          <w:sz w:val="26"/>
+          <w:szCs w:val="26"/>
+        </w:rPr>
+        <w:t xml:space="preserve">5.3. Điều kiện làm việc: làm thêm giờ là yếu tố mạnh nhất</w:t>
+        <w:tab/>
+        <w:t xml:space="preserve">15</w:t>
+      </w:r>
+    </w:p>
+    <w:p>
+      <w:pPr>
+        <w:tabs>
+          <w:tab w:val="right" w:leader="dot" w:pos="9360"/>
+        </w:tabs>
+        <w:spacing w:before="0" w:after="60" w:line="240" w:lineRule="auto"/>
+        <w:ind w:left="360" w:firstLine="0"/>
+        <w:jc w:val="left"/>
+      </w:pPr>
+      <w:r>
+        <w:rPr>
+          <w:rFonts w:ascii="Times New Roman" w:hAnsi="Times New Roman" w:cs="Times New Roman" w:eastAsia="Times New Roman"/>
+          <w:sz w:val="26"/>
+          <w:szCs w:val="26"/>
+        </w:rPr>
+        <w:t xml:space="preserve">5.4. Lương và đãi ngộ: tiền quan trọng, nhưng không theo cách nhiều người nghĩ</w:t>
+        <w:tab/>
+        <w:t xml:space="preserve">16</w:t>
+      </w:r>
+    </w:p>
+    <w:p>
+      <w:pPr>
+        <w:tabs>
+          <w:tab w:val="right" w:leader="dot" w:pos="9360"/>
+        </w:tabs>
+        <w:spacing w:before="0" w:after="60" w:line="240" w:lineRule="auto"/>
+        <w:ind w:left="360" w:firstLine="0"/>
+        <w:jc w:val="left"/>
+      </w:pPr>
+      <w:r>
+        <w:rPr>
+          <w:rFonts w:ascii="Times New Roman" w:hAnsi="Times New Roman" w:cs="Times New Roman" w:eastAsia="Times New Roman"/>
+          <w:sz w:val="26"/>
+          <w:szCs w:val="26"/>
+        </w:rPr>
+        <w:t xml:space="preserve">5.5. Hài lòng, gắn kết và phát triển</w:t>
+        <w:tab/>
+        <w:t xml:space="preserve">16</w:t>
+      </w:r>
+    </w:p>
+    <w:p>
+      <w:pPr>
+        <w:tabs>
+          <w:tab w:val="right" w:leader="dot" w:pos="9360"/>
+        </w:tabs>
+        <w:spacing w:before="0" w:after="60" w:line="240" w:lineRule="auto"/>
+        <w:ind w:left="360" w:firstLine="0"/>
+        <w:jc w:val="left"/>
+      </w:pPr>
+      <w:r>
+        <w:rPr>
+          <w:rFonts w:ascii="Times New Roman" w:hAnsi="Times New Roman" w:cs="Times New Roman" w:eastAsia="Times New Roman"/>
+          <w:sz w:val="26"/>
+          <w:szCs w:val="26"/>
+        </w:rPr>
+        <w:t xml:space="preserve">5.6. Rủi ro cộng dồn</w:t>
+        <w:tab/>
+        <w:t xml:space="preserve">17</w:t>
       </w:r>
     </w:p>
     <w:p>
@@ -1448,9 +1632,9 @@
           <w:sz w:val="26"/>
           <w:szCs w:val="26"/>
         </w:rPr>
-        <w:t xml:space="preserve">4. Trực quan hóa dữ liệu: thiết kế dashboard Power BI</w:t>
+        <w:t xml:space="preserve">6. Mô hình hóa và kiểm định giả thuyết</w:t>
         <w:tab/>
-        <w:t xml:space="preserve">15</w:t>
+        <w:t xml:space="preserve">18</w:t>
       </w:r>
     </w:p>
     <w:p>
@@ -1468,9 +1652,9 @@
           <w:sz w:val="26"/>
           <w:szCs w:val="26"/>
         </w:rPr>
-        <w:t xml:space="preserve">4.1. Nguyên tắc thiết kế</w:t>
+        <w:t xml:space="preserve">6.1. Phương pháp</w:t>
         <w:tab/>
-        <w:t xml:space="preserve">15</w:t>
+        <w:t xml:space="preserve">18</w:t>
       </w:r>
     </w:p>
     <w:p>
@@ -1488,9 +1672,9 @@
           <w:sz w:val="26"/>
           <w:szCs w:val="26"/>
         </w:rPr>
-        <w:t xml:space="preserve">4.2. Cấu trúc 6 trang</w:t>
+        <w:t xml:space="preserve">6.2. Kết quả kiểm định giả thuyết</w:t>
         <w:tab/>
-        <w:t xml:space="preserve">15</w:t>
+        <w:t xml:space="preserve">18</w:t>
       </w:r>
     </w:p>
     <w:p>
@@ -1508,9 +1692,49 @@
           <w:sz w:val="26"/>
           <w:szCs w:val="26"/>
         </w:rPr>
-        <w:t xml:space="preserve">4.3. Tương tác</w:t>
+        <w:t xml:space="preserve">6.3. Đánh giá mô hình</w:t>
         <w:tab/>
-        <w:t xml:space="preserve">18</w:t>
+        <w:t xml:space="preserve">20</w:t>
+      </w:r>
+    </w:p>
+    <w:p>
+      <w:pPr>
+        <w:tabs>
+          <w:tab w:val="right" w:leader="dot" w:pos="9360"/>
+        </w:tabs>
+        <w:spacing w:before="0" w:after="60" w:line="240" w:lineRule="auto"/>
+        <w:ind w:left="360" w:firstLine="0"/>
+        <w:jc w:val="left"/>
+      </w:pPr>
+      <w:r>
+        <w:rPr>
+          <w:rFonts w:ascii="Times New Roman" w:hAnsi="Times New Roman" w:cs="Times New Roman" w:eastAsia="Times New Roman"/>
+          <w:sz w:val="26"/>
+          <w:szCs w:val="26"/>
+        </w:rPr>
+        <w:t xml:space="preserve">6.4. Cây quyết định: quy tắc dễ dùng cho HR</w:t>
+        <w:tab/>
+        <w:t xml:space="preserve">21</w:t>
+      </w:r>
+    </w:p>
+    <w:p>
+      <w:pPr>
+        <w:tabs>
+          <w:tab w:val="right" w:leader="dot" w:pos="9360"/>
+        </w:tabs>
+        <w:spacing w:before="0" w:after="60" w:line="240" w:lineRule="auto"/>
+        <w:ind w:left="360" w:firstLine="0"/>
+        <w:jc w:val="left"/>
+      </w:pPr>
+      <w:r>
+        <w:rPr>
+          <w:rFonts w:ascii="Times New Roman" w:hAnsi="Times New Roman" w:cs="Times New Roman" w:eastAsia="Times New Roman"/>
+          <w:sz w:val="26"/>
+          <w:szCs w:val="26"/>
+        </w:rPr>
+        <w:t xml:space="preserve">6.5. Mô phỏng tác động: giới hạn làm thêm giờ</w:t>
+        <w:tab/>
+        <w:t xml:space="preserve">21</w:t>
       </w:r>
     </w:p>
     <w:p>
@@ -1530,9 +1754,9 @@
           <w:sz w:val="26"/>
           <w:szCs w:val="26"/>
         </w:rPr>
-        <w:t xml:space="preserve">5. Khai thác dữ liệu: kết quả phân tích khám phá</w:t>
+        <w:t xml:space="preserve">7. Đề xuất giải pháp cho tổ chức</w:t>
         <w:tab/>
-        <w:t xml:space="preserve">19</w:t>
+        <w:t xml:space="preserve">22</w:t>
       </w:r>
     </w:p>
     <w:p>
@@ -1550,9 +1774,9 @@
           <w:sz w:val="26"/>
           <w:szCs w:val="26"/>
         </w:rPr>
-        <w:t xml:space="preserve">5.1. Tổng quan: vấn đề nằm ở tuyến đầu</w:t>
+        <w:t xml:space="preserve">7.1. Kế hoạch hành động ưu tiên</w:t>
         <w:tab/>
-        <w:t xml:space="preserve">19</w:t>
+        <w:t xml:space="preserve">22</w:t>
       </w:r>
     </w:p>
     <w:p>
@@ -1570,9 +1794,9 @@
           <w:sz w:val="26"/>
           <w:szCs w:val="26"/>
         </w:rPr>
-        <w:t xml:space="preserve">5.2. Chân dung người nghỉ: trẻ, mới vào, cấp thấp, độc thân</w:t>
+        <w:t xml:space="preserve">7.2. Hệ thống cảnh báo sớm</w:t>
         <w:tab/>
-        <w:t xml:space="preserve">19</w:t>
+        <w:t xml:space="preserve">23</w:t>
       </w:r>
     </w:p>
     <w:p>
@@ -1590,9 +1814,31 @@
           <w:sz w:val="26"/>
           <w:szCs w:val="26"/>
         </w:rPr>
-        <w:t xml:space="preserve">5.3. Điều kiện làm việc: làm thêm giờ là yếu tố mạnh nhất</w:t>
+        <w:t xml:space="preserve">7.3. Mục tiêu đề xuất</w:t>
         <w:tab/>
-        <w:t xml:space="preserve">20</w:t>
+        <w:t xml:space="preserve">23</w:t>
+      </w:r>
+    </w:p>
+    <w:p>
+      <w:pPr>
+        <w:tabs>
+          <w:tab w:val="right" w:leader="dot" w:pos="9360"/>
+        </w:tabs>
+        <w:spacing w:before="60" w:after="80" w:line="240" w:lineRule="auto"/>
+        <w:ind w:left="0" w:firstLine="0"/>
+        <w:jc w:val="left"/>
+      </w:pPr>
+      <w:r>
+        <w:rPr>
+          <w:rFonts w:ascii="Times New Roman" w:hAnsi="Times New Roman" w:cs="Times New Roman" w:eastAsia="Times New Roman"/>
+          <w:b/>
+          <w:bCs/>
+          <w:sz w:val="26"/>
+          <w:szCs w:val="26"/>
+        </w:rPr>
+        <w:t xml:space="preserve">8. Kết luận, hạn chế và hướng phát triển</w:t>
+        <w:tab/>
+        <w:t xml:space="preserve">24</w:t>
       </w:r>
     </w:p>
     <w:p>
@@ -1610,9 +1856,9 @@
           <w:sz w:val="26"/>
           <w:szCs w:val="26"/>
         </w:rPr>
-        <w:t xml:space="preserve">5.4. Lương và đãi ngộ: tiền quan trọng, nhưng không theo cách nhiều người nghĩ</w:t>
+        <w:t xml:space="preserve">8.1. Kết luận</w:t>
         <w:tab/>
-        <w:t xml:space="preserve">21</w:t>
+        <w:t xml:space="preserve">24</w:t>
       </w:r>
     </w:p>
     <w:p>
@@ -1630,9 +1876,9 @@
           <w:sz w:val="26"/>
           <w:szCs w:val="26"/>
         </w:rPr>
-        <w:t xml:space="preserve">5.5. Hài lòng, gắn kết và phát triển</w:t>
+        <w:t xml:space="preserve">8.2. Hạn chế</w:t>
         <w:tab/>
-        <w:t xml:space="preserve">21</w:t>
+        <w:t xml:space="preserve">24</w:t>
       </w:r>
     </w:p>
     <w:p>
@@ -1650,9 +1896,9 @@
           <w:sz w:val="26"/>
           <w:szCs w:val="26"/>
         </w:rPr>
-        <w:t xml:space="preserve">5.6. Rủi ro cộng dồn</w:t>
+        <w:t xml:space="preserve">8.3. Hướng phát triển</w:t>
         <w:tab/>
-        <w:t xml:space="preserve">22</w:t>
+        <w:t xml:space="preserve">24</w:t>
       </w:r>
     </w:p>
     <w:p>
@@ -1672,295 +1918,9 @@
           <w:sz w:val="26"/>
           <w:szCs w:val="26"/>
         </w:rPr>
-        <w:t xml:space="preserve">6. Mô hình hóa và kiểm định giả thuyết</w:t>
-        <w:tab/>
-        <w:t xml:space="preserve">23</w:t>
-      </w:r>
-    </w:p>
-    <w:p>
-      <w:pPr>
-        <w:tabs>
-          <w:tab w:val="right" w:leader="dot" w:pos="9360"/>
-        </w:tabs>
-        <w:spacing w:before="0" w:after="60" w:line="240" w:lineRule="auto"/>
-        <w:ind w:left="360" w:firstLine="0"/>
-        <w:jc w:val="left"/>
-      </w:pPr>
-      <w:r>
-        <w:rPr>
-          <w:rFonts w:ascii="Times New Roman" w:hAnsi="Times New Roman" w:cs="Times New Roman" w:eastAsia="Times New Roman"/>
-          <w:sz w:val="26"/>
-          <w:szCs w:val="26"/>
-        </w:rPr>
-        <w:t xml:space="preserve">6.1. Phương pháp</w:t>
-        <w:tab/>
-        <w:t xml:space="preserve">23</w:t>
-      </w:r>
-    </w:p>
-    <w:p>
-      <w:pPr>
-        <w:tabs>
-          <w:tab w:val="right" w:leader="dot" w:pos="9360"/>
-        </w:tabs>
-        <w:spacing w:before="0" w:after="60" w:line="240" w:lineRule="auto"/>
-        <w:ind w:left="360" w:firstLine="0"/>
-        <w:jc w:val="left"/>
-      </w:pPr>
-      <w:r>
-        <w:rPr>
-          <w:rFonts w:ascii="Times New Roman" w:hAnsi="Times New Roman" w:cs="Times New Roman" w:eastAsia="Times New Roman"/>
-          <w:sz w:val="26"/>
-          <w:szCs w:val="26"/>
-        </w:rPr>
-        <w:t xml:space="preserve">6.2. Kết quả kiểm định giả thuyết</w:t>
-        <w:tab/>
-        <w:t xml:space="preserve">23</w:t>
-      </w:r>
-    </w:p>
-    <w:p>
-      <w:pPr>
-        <w:tabs>
-          <w:tab w:val="right" w:leader="dot" w:pos="9360"/>
-        </w:tabs>
-        <w:spacing w:before="0" w:after="60" w:line="240" w:lineRule="auto"/>
-        <w:ind w:left="360" w:firstLine="0"/>
-        <w:jc w:val="left"/>
-      </w:pPr>
-      <w:r>
-        <w:rPr>
-          <w:rFonts w:ascii="Times New Roman" w:hAnsi="Times New Roman" w:cs="Times New Roman" w:eastAsia="Times New Roman"/>
-          <w:sz w:val="26"/>
-          <w:szCs w:val="26"/>
-        </w:rPr>
-        <w:t xml:space="preserve">6.3. Đánh giá mô hình</w:t>
+        <w:t xml:space="preserve">9. Tài liệu tham khảo</w:t>
         <w:tab/>
         <w:t xml:space="preserve">25</w:t>
-      </w:r>
-    </w:p>
-    <w:p>
-      <w:pPr>
-        <w:tabs>
-          <w:tab w:val="right" w:leader="dot" w:pos="9360"/>
-        </w:tabs>
-        <w:spacing w:before="0" w:after="60" w:line="240" w:lineRule="auto"/>
-        <w:ind w:left="360" w:firstLine="0"/>
-        <w:jc w:val="left"/>
-      </w:pPr>
-      <w:r>
-        <w:rPr>
-          <w:rFonts w:ascii="Times New Roman" w:hAnsi="Times New Roman" w:cs="Times New Roman" w:eastAsia="Times New Roman"/>
-          <w:sz w:val="26"/>
-          <w:szCs w:val="26"/>
-        </w:rPr>
-        <w:t xml:space="preserve">6.4. Cây quyết định: quy tắc dễ dùng cho HR</w:t>
-        <w:tab/>
-        <w:t xml:space="preserve">26</w:t>
-      </w:r>
-    </w:p>
-    <w:p>
-      <w:pPr>
-        <w:tabs>
-          <w:tab w:val="right" w:leader="dot" w:pos="9360"/>
-        </w:tabs>
-        <w:spacing w:before="0" w:after="60" w:line="240" w:lineRule="auto"/>
-        <w:ind w:left="360" w:firstLine="0"/>
-        <w:jc w:val="left"/>
-      </w:pPr>
-      <w:r>
-        <w:rPr>
-          <w:rFonts w:ascii="Times New Roman" w:hAnsi="Times New Roman" w:cs="Times New Roman" w:eastAsia="Times New Roman"/>
-          <w:sz w:val="26"/>
-          <w:szCs w:val="26"/>
-        </w:rPr>
-        <w:t xml:space="preserve">6.5. Mô phỏng tác động: giới hạn làm thêm giờ</w:t>
-        <w:tab/>
-        <w:t xml:space="preserve">27</w:t>
-      </w:r>
-    </w:p>
-    <w:p>
-      <w:pPr>
-        <w:tabs>
-          <w:tab w:val="right" w:leader="dot" w:pos="9360"/>
-        </w:tabs>
-        <w:spacing w:before="60" w:after="80" w:line="240" w:lineRule="auto"/>
-        <w:ind w:left="0" w:firstLine="0"/>
-        <w:jc w:val="left"/>
-      </w:pPr>
-      <w:r>
-        <w:rPr>
-          <w:rFonts w:ascii="Times New Roman" w:hAnsi="Times New Roman" w:cs="Times New Roman" w:eastAsia="Times New Roman"/>
-          <w:b/>
-          <w:bCs/>
-          <w:sz w:val="26"/>
-          <w:szCs w:val="26"/>
-        </w:rPr>
-        <w:t xml:space="preserve">7. Đề xuất giải pháp cho tổ chức</w:t>
-        <w:tab/>
-        <w:t xml:space="preserve">28</w:t>
-      </w:r>
-    </w:p>
-    <w:p>
-      <w:pPr>
-        <w:tabs>
-          <w:tab w:val="right" w:leader="dot" w:pos="9360"/>
-        </w:tabs>
-        <w:spacing w:before="0" w:after="60" w:line="240" w:lineRule="auto"/>
-        <w:ind w:left="360" w:firstLine="0"/>
-        <w:jc w:val="left"/>
-      </w:pPr>
-      <w:r>
-        <w:rPr>
-          <w:rFonts w:ascii="Times New Roman" w:hAnsi="Times New Roman" w:cs="Times New Roman" w:eastAsia="Times New Roman"/>
-          <w:sz w:val="26"/>
-          <w:szCs w:val="26"/>
-        </w:rPr>
-        <w:t xml:space="preserve">7.1. Kế hoạch hành động ưu tiên</w:t>
-        <w:tab/>
-        <w:t xml:space="preserve">28</w:t>
-      </w:r>
-    </w:p>
-    <w:p>
-      <w:pPr>
-        <w:tabs>
-          <w:tab w:val="right" w:leader="dot" w:pos="9360"/>
-        </w:tabs>
-        <w:spacing w:before="0" w:after="60" w:line="240" w:lineRule="auto"/>
-        <w:ind w:left="360" w:firstLine="0"/>
-        <w:jc w:val="left"/>
-      </w:pPr>
-      <w:r>
-        <w:rPr>
-          <w:rFonts w:ascii="Times New Roman" w:hAnsi="Times New Roman" w:cs="Times New Roman" w:eastAsia="Times New Roman"/>
-          <w:sz w:val="26"/>
-          <w:szCs w:val="26"/>
-        </w:rPr>
-        <w:t xml:space="preserve">7.2. Hệ thống cảnh báo sớm</w:t>
-        <w:tab/>
-        <w:t xml:space="preserve">29</w:t>
-      </w:r>
-    </w:p>
-    <w:p>
-      <w:pPr>
-        <w:tabs>
-          <w:tab w:val="right" w:leader="dot" w:pos="9360"/>
-        </w:tabs>
-        <w:spacing w:before="0" w:after="60" w:line="240" w:lineRule="auto"/>
-        <w:ind w:left="360" w:firstLine="0"/>
-        <w:jc w:val="left"/>
-      </w:pPr>
-      <w:r>
-        <w:rPr>
-          <w:rFonts w:ascii="Times New Roman" w:hAnsi="Times New Roman" w:cs="Times New Roman" w:eastAsia="Times New Roman"/>
-          <w:sz w:val="26"/>
-          <w:szCs w:val="26"/>
-        </w:rPr>
-        <w:t xml:space="preserve">7.3. Mục tiêu đề xuất</w:t>
-        <w:tab/>
-        <w:t xml:space="preserve">29</w:t>
-      </w:r>
-    </w:p>
-    <w:p>
-      <w:pPr>
-        <w:tabs>
-          <w:tab w:val="right" w:leader="dot" w:pos="9360"/>
-        </w:tabs>
-        <w:spacing w:before="60" w:after="80" w:line="240" w:lineRule="auto"/>
-        <w:ind w:left="0" w:firstLine="0"/>
-        <w:jc w:val="left"/>
-      </w:pPr>
-      <w:r>
-        <w:rPr>
-          <w:rFonts w:ascii="Times New Roman" w:hAnsi="Times New Roman" w:cs="Times New Roman" w:eastAsia="Times New Roman"/>
-          <w:b/>
-          <w:bCs/>
-          <w:sz w:val="26"/>
-          <w:szCs w:val="26"/>
-        </w:rPr>
-        <w:t xml:space="preserve">8. Kết luận, hạn chế và hướng phát triển</w:t>
-        <w:tab/>
-        <w:t xml:space="preserve">30</w:t>
-      </w:r>
-    </w:p>
-    <w:p>
-      <w:pPr>
-        <w:tabs>
-          <w:tab w:val="right" w:leader="dot" w:pos="9360"/>
-        </w:tabs>
-        <w:spacing w:before="0" w:after="60" w:line="240" w:lineRule="auto"/>
-        <w:ind w:left="360" w:firstLine="0"/>
-        <w:jc w:val="left"/>
-      </w:pPr>
-      <w:r>
-        <w:rPr>
-          <w:rFonts w:ascii="Times New Roman" w:hAnsi="Times New Roman" w:cs="Times New Roman" w:eastAsia="Times New Roman"/>
-          <w:sz w:val="26"/>
-          <w:szCs w:val="26"/>
-        </w:rPr>
-        <w:t xml:space="preserve">8.1. Kết luận</w:t>
-        <w:tab/>
-        <w:t xml:space="preserve">30</w:t>
-      </w:r>
-    </w:p>
-    <w:p>
-      <w:pPr>
-        <w:tabs>
-          <w:tab w:val="right" w:leader="dot" w:pos="9360"/>
-        </w:tabs>
-        <w:spacing w:before="0" w:after="60" w:line="240" w:lineRule="auto"/>
-        <w:ind w:left="360" w:firstLine="0"/>
-        <w:jc w:val="left"/>
-      </w:pPr>
-      <w:r>
-        <w:rPr>
-          <w:rFonts w:ascii="Times New Roman" w:hAnsi="Times New Roman" w:cs="Times New Roman" w:eastAsia="Times New Roman"/>
-          <w:sz w:val="26"/>
-          <w:szCs w:val="26"/>
-        </w:rPr>
-        <w:t xml:space="preserve">8.2. Hạn chế</w:t>
-        <w:tab/>
-        <w:t xml:space="preserve">30</w:t>
-      </w:r>
-    </w:p>
-    <w:p>
-      <w:pPr>
-        <w:tabs>
-          <w:tab w:val="right" w:leader="dot" w:pos="9360"/>
-        </w:tabs>
-        <w:spacing w:before="0" w:after="60" w:line="240" w:lineRule="auto"/>
-        <w:ind w:left="360" w:firstLine="0"/>
-        <w:jc w:val="left"/>
-      </w:pPr>
-      <w:r>
-        <w:rPr>
-          <w:rFonts w:ascii="Times New Roman" w:hAnsi="Times New Roman" w:cs="Times New Roman" w:eastAsia="Times New Roman"/>
-          <w:sz w:val="26"/>
-          <w:szCs w:val="26"/>
-        </w:rPr>
-        <w:t xml:space="preserve">8.3. Hướng phát triển</w:t>
-        <w:tab/>
-        <w:t xml:space="preserve">31</w:t>
-      </w:r>
-    </w:p>
-    <w:p>
-      <w:pPr>
-        <w:tabs>
-          <w:tab w:val="right" w:leader="dot" w:pos="9360"/>
-        </w:tabs>
-        <w:spacing w:before="60" w:after="80" w:line="240" w:lineRule="auto"/>
-        <w:ind w:left="0" w:firstLine="0"/>
-        <w:jc w:val="left"/>
-      </w:pPr>
-      <w:r>
-        <w:rPr>
-          <w:rFonts w:ascii="Times New Roman" w:hAnsi="Times New Roman" w:cs="Times New Roman" w:eastAsia="Times New Roman"/>
-          <w:b/>
-          <w:bCs/>
-          <w:sz w:val="26"/>
-          <w:szCs w:val="26"/>
-        </w:rPr>
-        <w:t xml:space="preserve">9. Tài liệu tham khảo</w:t>
-        <w:tab/>
-        <w:t xml:space="preserve">32</w:t>
       </w:r>
       <w:r>
         <w:fldChar w:fldCharType="end"/>
@@ -2001,7 +1961,7 @@
         </w:rPr>
         <w:t xml:space="preserve">Bảng 1.1. Các giả thuyết nghiên cứu</w:t>
         <w:tab/>
-        <w:t xml:space="preserve">7</w:t>
+        <w:t xml:space="preserve">6</w:t>
       </w:r>
     </w:p>
     <w:p>
@@ -2021,7 +1981,7 @@
         </w:rPr>
         <w:t xml:space="preserve">Bảng 2.1. Các nhóm biến chính trong bộ dữ liệu</w:t>
         <w:tab/>
-        <w:t xml:space="preserve">9</w:t>
+        <w:t xml:space="preserve">8</w:t>
       </w:r>
     </w:p>
     <w:p>
@@ -2041,7 +2001,7 @@
         </w:rPr>
         <w:t xml:space="preserve">Bảng 2.2. Thống kê mô tả: người nghỉ và người ở lại</w:t>
         <w:tab/>
-        <w:t xml:space="preserve">10</w:t>
+        <w:t xml:space="preserve">9</w:t>
       </w:r>
     </w:p>
     <w:p>
@@ -2061,7 +2021,7 @@
         </w:rPr>
         <w:t xml:space="preserve">Bảng 3.1. Kết quả kiểm tra chất lượng dữ liệu</w:t>
         <w:tab/>
-        <w:t xml:space="preserve">11</w:t>
+        <w:t xml:space="preserve">10</w:t>
       </w:r>
     </w:p>
     <w:p>
@@ -2081,7 +2041,7 @@
         </w:rPr>
         <w:t xml:space="preserve">Bảng 3.2. Các cột dẫn xuất được tạo trong quá trình tiền xử lý</w:t>
         <w:tab/>
-        <w:t xml:space="preserve">11</w:t>
+        <w:t xml:space="preserve">10</w:t>
       </w:r>
     </w:p>
     <w:p>
@@ -2101,7 +2061,7 @@
         </w:rPr>
         <w:t xml:space="preserve">Bảng 3.3. Các measure DAX chính trong mô hình</w:t>
         <w:tab/>
-        <w:t xml:space="preserve">13</w:t>
+        <w:t xml:space="preserve">12</w:t>
       </w:r>
     </w:p>
     <w:p>
@@ -2121,7 +2081,7 @@
         </w:rPr>
         <w:t xml:space="preserve">Bảng 4.1. Cấu trúc sáu trang dashboard</w:t>
         <w:tab/>
-        <w:t xml:space="preserve">15</w:t>
+        <w:t xml:space="preserve">13</w:t>
       </w:r>
     </w:p>
     <w:p>
@@ -2141,7 +2101,7 @@
         </w:rPr>
         <w:t xml:space="preserve">Bảng 5.1. Tỷ lệ nghỉ việc theo đặc điểm nhân khẩu học</w:t>
         <w:tab/>
-        <w:t xml:space="preserve">19</w:t>
+        <w:t xml:space="preserve">14</w:t>
       </w:r>
     </w:p>
     <w:p>
@@ -2161,7 +2121,7 @@
         </w:rPr>
         <w:t xml:space="preserve">Bảng 5.2. Tỷ lệ nghỉ việc theo các điều kiện làm việc khác</w:t>
         <w:tab/>
-        <w:t xml:space="preserve">21</w:t>
+        <w:t xml:space="preserve">16</w:t>
       </w:r>
     </w:p>
     <w:p>
@@ -2181,7 +2141,7 @@
         </w:rPr>
         <w:t xml:space="preserve">Bảng 5.3. Tỷ lệ nghỉ việc theo mức của năm thang hài lòng – gắn kết</w:t>
         <w:tab/>
-        <w:t xml:space="preserve">21</w:t>
+        <w:t xml:space="preserve">16</w:t>
       </w:r>
     </w:p>
     <w:p>
@@ -2201,7 +2161,7 @@
         </w:rPr>
         <w:t xml:space="preserve">Bảng 5.4. Tỷ lệ nghỉ việc theo nhóm rủi ro cộng dồn</w:t>
         <w:tab/>
-        <w:t xml:space="preserve">22</w:t>
+        <w:t xml:space="preserve">17</w:t>
       </w:r>
     </w:p>
     <w:p>
@@ -2221,7 +2181,7 @@
         </w:rPr>
         <w:t xml:space="preserve">Bảng 6.1. Tổng hợp kết quả kiểm định giả thuyết</w:t>
         <w:tab/>
-        <w:t xml:space="preserve">23</w:t>
+        <w:t xml:space="preserve">18</w:t>
       </w:r>
     </w:p>
     <w:p>
@@ -2241,7 +2201,7 @@
         </w:rPr>
         <w:t xml:space="preserve">Bảng 6.2. Kết quả đánh giá mô hình trên tập kiểm tra</w:t>
         <w:tab/>
-        <w:t xml:space="preserve">25</w:t>
+        <w:t xml:space="preserve">20</w:t>
       </w:r>
     </w:p>
     <w:p>
@@ -2261,7 +2221,7 @@
         </w:rPr>
         <w:t xml:space="preserve">Bảng 7.1. Kế hoạch hành động ưu tiên</w:t>
         <w:tab/>
-        <w:t xml:space="preserve">28</w:t>
+        <w:t xml:space="preserve">22</w:t>
       </w:r>
     </w:p>
     <w:p>
@@ -2318,7 +2278,7 @@
         </w:rPr>
         <w:t xml:space="preserve">Hình 3.1. Mô hình dữ liệu trong file Power BI</w:t>
         <w:tab/>
-        <w:t xml:space="preserve">13</w:t>
+        <w:t xml:space="preserve">11</w:t>
       </w:r>
     </w:p>
     <w:p>
@@ -2336,9 +2296,9 @@
           <w:sz w:val="26"/>
           <w:szCs w:val="26"/>
         </w:rPr>
-        <w:t xml:space="preserve">Hình 4.1. Dashboard Trang 1 – Tổng quan</w:t>
+        <w:t xml:space="preserve">Hình 5.1. Tỷ lệ nghỉ việc theo vị trí công việc</w:t>
         <w:tab/>
-        <w:t xml:space="preserve">16</w:t>
+        <w:t xml:space="preserve">14</w:t>
       </w:r>
     </w:p>
     <w:p>
@@ -2356,9 +2316,9 @@
           <w:sz w:val="26"/>
           <w:szCs w:val="26"/>
         </w:rPr>
-        <w:t xml:space="preserve">Hình 4.2. Dashboard Trang 2 – Chân dung người nghỉ việc</w:t>
+        <w:t xml:space="preserve">Hình 5.2. Tỷ lệ nghỉ việc theo cấp bậc và làm thêm giờ</w:t>
         <w:tab/>
-        <w:t xml:space="preserve">16</w:t>
+        <w:t xml:space="preserve">15</w:t>
       </w:r>
     </w:p>
     <w:p>
@@ -2376,9 +2336,9 @@
           <w:sz w:val="26"/>
           <w:szCs w:val="26"/>
         </w:rPr>
-        <w:t xml:space="preserve">Hình 4.3. Dashboard Trang 3 – Điều kiện làm việc</w:t>
+        <w:t xml:space="preserve">Hình 6.1. Odds ratio và khoảng tin cậy 95% của mô hình hồi quy logistic</w:t>
         <w:tab/>
-        <w:t xml:space="preserve">17</w:t>
+        <w:t xml:space="preserve">20</w:t>
       </w:r>
     </w:p>
     <w:p>
@@ -2396,129 +2356,9 @@
           <w:sz w:val="26"/>
           <w:szCs w:val="26"/>
         </w:rPr>
-        <w:t xml:space="preserve">Hình 4.4. Dashboard Trang 4 – Lương và đãi ngộ</w:t>
-        <w:tab/>
-        <w:t xml:space="preserve">17</w:t>
-      </w:r>
-    </w:p>
-    <w:p>
-      <w:pPr>
-        <w:tabs>
-          <w:tab w:val="right" w:leader="dot" w:pos="9360"/>
-        </w:tabs>
-        <w:spacing w:before="0" w:after="80" w:line="240" w:lineRule="auto"/>
-        <w:ind w:left="0" w:firstLine="0"/>
-        <w:jc w:val="left"/>
-      </w:pPr>
-      <w:r>
-        <w:rPr>
-          <w:rFonts w:ascii="Times New Roman" w:hAnsi="Times New Roman" w:cs="Times New Roman" w:eastAsia="Times New Roman"/>
-          <w:sz w:val="26"/>
-          <w:szCs w:val="26"/>
-        </w:rPr>
-        <w:t xml:space="preserve">Hình 4.5. Dashboard Trang 5 – Hài lòng và gắn kết</w:t>
-        <w:tab/>
-        <w:t xml:space="preserve">17</w:t>
-      </w:r>
-    </w:p>
-    <w:p>
-      <w:pPr>
-        <w:tabs>
-          <w:tab w:val="right" w:leader="dot" w:pos="9360"/>
-        </w:tabs>
-        <w:spacing w:before="0" w:after="80" w:line="240" w:lineRule="auto"/>
-        <w:ind w:left="0" w:firstLine="0"/>
-        <w:jc w:val="left"/>
-      </w:pPr>
-      <w:r>
-        <w:rPr>
-          <w:rFonts w:ascii="Times New Roman" w:hAnsi="Times New Roman" w:cs="Times New Roman" w:eastAsia="Times New Roman"/>
-          <w:sz w:val="26"/>
-          <w:szCs w:val="26"/>
-        </w:rPr>
-        <w:t xml:space="preserve">Hình 4.6. Dashboard Trang 6 – Rủi ro và hành động</w:t>
-        <w:tab/>
-        <w:t xml:space="preserve">18</w:t>
-      </w:r>
-    </w:p>
-    <w:p>
-      <w:pPr>
-        <w:tabs>
-          <w:tab w:val="right" w:leader="dot" w:pos="9360"/>
-        </w:tabs>
-        <w:spacing w:before="0" w:after="80" w:line="240" w:lineRule="auto"/>
-        <w:ind w:left="0" w:firstLine="0"/>
-        <w:jc w:val="left"/>
-      </w:pPr>
-      <w:r>
-        <w:rPr>
-          <w:rFonts w:ascii="Times New Roman" w:hAnsi="Times New Roman" w:cs="Times New Roman" w:eastAsia="Times New Roman"/>
-          <w:sz w:val="26"/>
-          <w:szCs w:val="26"/>
-        </w:rPr>
-        <w:t xml:space="preserve">Hình 5.1. Tỷ lệ nghỉ việc theo vị trí công việc</w:t>
-        <w:tab/>
-        <w:t xml:space="preserve">19</w:t>
-      </w:r>
-    </w:p>
-    <w:p>
-      <w:pPr>
-        <w:tabs>
-          <w:tab w:val="right" w:leader="dot" w:pos="9360"/>
-        </w:tabs>
-        <w:spacing w:before="0" w:after="80" w:line="240" w:lineRule="auto"/>
-        <w:ind w:left="0" w:firstLine="0"/>
-        <w:jc w:val="left"/>
-      </w:pPr>
-      <w:r>
-        <w:rPr>
-          <w:rFonts w:ascii="Times New Roman" w:hAnsi="Times New Roman" w:cs="Times New Roman" w:eastAsia="Times New Roman"/>
-          <w:sz w:val="26"/>
-          <w:szCs w:val="26"/>
-        </w:rPr>
-        <w:t xml:space="preserve">Hình 5.2. Tỷ lệ nghỉ việc theo cấp bậc và làm thêm giờ</w:t>
-        <w:tab/>
-        <w:t xml:space="preserve">20</w:t>
-      </w:r>
-    </w:p>
-    <w:p>
-      <w:pPr>
-        <w:tabs>
-          <w:tab w:val="right" w:leader="dot" w:pos="9360"/>
-        </w:tabs>
-        <w:spacing w:before="0" w:after="80" w:line="240" w:lineRule="auto"/>
-        <w:ind w:left="0" w:firstLine="0"/>
-        <w:jc w:val="left"/>
-      </w:pPr>
-      <w:r>
-        <w:rPr>
-          <w:rFonts w:ascii="Times New Roman" w:hAnsi="Times New Roman" w:cs="Times New Roman" w:eastAsia="Times New Roman"/>
-          <w:sz w:val="26"/>
-          <w:szCs w:val="26"/>
-        </w:rPr>
-        <w:t xml:space="preserve">Hình 6.1. Odds ratio và khoảng tin cậy 95% của mô hình hồi quy logistic</w:t>
-        <w:tab/>
-        <w:t xml:space="preserve">25</w:t>
-      </w:r>
-    </w:p>
-    <w:p>
-      <w:pPr>
-        <w:tabs>
-          <w:tab w:val="right" w:leader="dot" w:pos="9360"/>
-        </w:tabs>
-        <w:spacing w:before="0" w:after="80" w:line="240" w:lineRule="auto"/>
-        <w:ind w:left="0" w:firstLine="0"/>
-        <w:jc w:val="left"/>
-      </w:pPr>
-      <w:r>
-        <w:rPr>
-          <w:rFonts w:ascii="Times New Roman" w:hAnsi="Times New Roman" w:cs="Times New Roman" w:eastAsia="Times New Roman"/>
-          <w:sz w:val="26"/>
-          <w:szCs w:val="26"/>
-        </w:rPr>
         <w:t xml:space="preserve">Hình 6.2. Cây quyết định ba tầng dự báo nghỉ việc</w:t>
         <w:tab/>
-        <w:t xml:space="preserve">27</w:t>
+        <w:t xml:space="preserve">21</w:t>
       </w:r>
     </w:p>
     <w:p>
@@ -3587,7 +3427,7 @@
       <w:r>
         <w:drawing>
           <wp:inline>
-            <wp:extent cx="5760720" cy="2819721"/>
+            <wp:extent cx="5120640" cy="2506419"/>
             <wp:docPr id="1" name="Picture 1"/>
             <wp:cNvGraphicFramePr>
               <a:graphicFrameLocks noChangeAspect="1"/>
@@ -3608,7 +3448,7 @@
                   <pic:spPr>
                     <a:xfrm>
                       <a:off x="0" y="0"/>
-                      <a:ext cx="5760720" cy="2819721"/>
+                      <a:ext cx="5120640" cy="2506419"/>
                     </a:xfrm>
                     <a:prstGeom prst="rect"/>
                   </pic:spPr>
@@ -4395,7 +4235,7 @@
           <w:sz w:val="26"/>
           <w:szCs w:val="26"/>
         </w:rPr>
-        <w:t xml:space="preserve">Đối tượng nghiên cứu là hành vi nghỉ việc của nhân viên và các yếu tố về nhân khẩu học, điều kiện làm việc, lương – đãi ngộ và trải nghiệm làm việc có liên quan. Phạm vi nghiên cứu gồm 1.470 nhân viên thuộc ba phòng ban trong bộ dữ liệu IBM HR Analytics (IBM, 2017), tại một thời điểm quan sát.</w:t>
+        <w:t xml:space="preserve">Đối tượng nghiên cứu là hành vi nghỉ việc của nhân viên và các yếu tố về nhân khẩu học, điều kiện làm việc, lương – đãi ngộ và trải nghiệm làm việc có liên quan. Phạm vi gồm 1.470 nhân viên thuộc ba phòng ban trong bộ dữ liệu IBM HR Analytics (IBM, 2017), tại một thời điểm quan sát.</w:t>
       </w:r>
     </w:p>
     <w:p>
@@ -4410,162 +4250,7 @@
           <w:sz w:val="26"/>
           <w:szCs w:val="26"/>
         </w:rPr>
-        <w:t xml:space="preserve">Nhóm sử dụng kết hợp sáu phương pháp:</w:t>
-      </w:r>
-    </w:p>
-    <w:p>
-      <w:pPr>
-        <w:tabs>
-          <w:tab w:val="left" w:leader="none" w:pos="1080"/>
-        </w:tabs>
-        <w:spacing w:before="0" w:after="120" w:line="240" w:lineRule="auto"/>
-        <w:ind w:left="1080" w:hanging="360"/>
-        <w:jc w:val="both"/>
-      </w:pPr>
-      <w:r>
-        <w:rPr>
-          <w:rFonts w:ascii="Times New Roman" w:hAnsi="Times New Roman" w:cs="Times New Roman" w:eastAsia="Times New Roman"/>
-          <w:sz w:val="26"/>
-          <w:szCs w:val="26"/>
-        </w:rPr>
-        <w:t xml:space="preserve">1.</w:t>
-        <w:tab/>
-        <w:t xml:space="preserve">Nghiên cứu tài liệu để xây dựng khung khái niệm và giả thuyết.</w:t>
-      </w:r>
-    </w:p>
-    <w:p>
-      <w:pPr>
-        <w:tabs>
-          <w:tab w:val="left" w:leader="none" w:pos="1080"/>
-        </w:tabs>
-        <w:spacing w:before="0" w:after="120" w:line="240" w:lineRule="auto"/>
-        <w:ind w:left="1080" w:hanging="360"/>
-        <w:jc w:val="both"/>
-      </w:pPr>
-      <w:r>
-        <w:rPr>
-          <w:rFonts w:ascii="Times New Roman" w:hAnsi="Times New Roman" w:cs="Times New Roman" w:eastAsia="Times New Roman"/>
-          <w:sz w:val="26"/>
-          <w:szCs w:val="26"/>
-        </w:rPr>
-        <w:t xml:space="preserve">2.</w:t>
-        <w:tab/>
-        <w:t xml:space="preserve">Tiền xử lý và mô hình hóa dữ liệu bằng Power Query và DAX trong Power BI.</w:t>
-      </w:r>
-    </w:p>
-    <w:p>
-      <w:pPr>
-        <w:tabs>
-          <w:tab w:val="left" w:leader="none" w:pos="1080"/>
-        </w:tabs>
-        <w:spacing w:before="0" w:after="120" w:line="240" w:lineRule="auto"/>
-        <w:ind w:left="1080" w:hanging="360"/>
-        <w:jc w:val="both"/>
-      </w:pPr>
-      <w:r>
-        <w:rPr>
-          <w:rFonts w:ascii="Times New Roman" w:hAnsi="Times New Roman" w:cs="Times New Roman" w:eastAsia="Times New Roman"/>
-          <w:sz w:val="26"/>
-          <w:szCs w:val="26"/>
-        </w:rPr>
-        <w:t xml:space="preserve">3.</w:t>
-        <w:tab/>
-        <w:t xml:space="preserve">Thống kê mô tả và trực quan hóa qua dashboard Power BI gồm sáu trang.</w:t>
-      </w:r>
-    </w:p>
-    <w:p>
-      <w:pPr>
-        <w:tabs>
-          <w:tab w:val="left" w:leader="none" w:pos="1080"/>
-        </w:tabs>
-        <w:spacing w:before="0" w:after="120" w:line="240" w:lineRule="auto"/>
-        <w:ind w:left="1080" w:hanging="360"/>
-        <w:jc w:val="both"/>
-      </w:pPr>
-      <w:r>
-        <w:rPr>
-          <w:rFonts w:ascii="Times New Roman" w:hAnsi="Times New Roman" w:cs="Times New Roman" w:eastAsia="Times New Roman"/>
-          <w:sz w:val="26"/>
-          <w:szCs w:val="26"/>
-        </w:rPr>
-        <w:t xml:space="preserve">4.</w:t>
-        <w:tab/>
-        <w:t xml:space="preserve">Kiểm định giả thuyết bằng chi-square, Mann–Whitney U và Cochran–Mantel–Haenszel.</w:t>
-      </w:r>
-    </w:p>
-    <w:p>
-      <w:pPr>
-        <w:tabs>
-          <w:tab w:val="left" w:leader="none" w:pos="1080"/>
-        </w:tabs>
-        <w:spacing w:before="0" w:after="120" w:line="240" w:lineRule="auto"/>
-        <w:ind w:left="1080" w:hanging="360"/>
-        <w:jc w:val="both"/>
-      </w:pPr>
-      <w:r>
-        <w:rPr>
-          <w:rFonts w:ascii="Times New Roman" w:hAnsi="Times New Roman" w:cs="Times New Roman" w:eastAsia="Times New Roman"/>
-          <w:sz w:val="26"/>
-          <w:szCs w:val="26"/>
-        </w:rPr>
-        <w:t xml:space="preserve">5.</w:t>
-        <w:tab/>
-        <w:t xml:space="preserve">Xây dựng mô hình hồi quy logistic và cây quyết định bằng Python để xác định các yếu tố dự báo nghỉ việc.</w:t>
-      </w:r>
-    </w:p>
-    <w:p>
-      <w:pPr>
-        <w:tabs>
-          <w:tab w:val="left" w:leader="none" w:pos="1080"/>
-        </w:tabs>
-        <w:spacing w:before="0" w:after="240" w:line="240" w:lineRule="auto"/>
-        <w:ind w:left="1080" w:hanging="360"/>
-        <w:jc w:val="both"/>
-      </w:pPr>
-      <w:r>
-        <w:rPr>
-          <w:rFonts w:ascii="Times New Roman" w:hAnsi="Times New Roman" w:cs="Times New Roman" w:eastAsia="Times New Roman"/>
-          <w:sz w:val="26"/>
-          <w:szCs w:val="26"/>
-        </w:rPr>
-        <w:t xml:space="preserve">6.</w:t>
-        <w:tab/>
-        <w:t xml:space="preserve">Mô phỏng tác động của giải pháp giới hạn làm thêm giờ để ước tính số ca nghỉ và chi phí có thể tiết kiệm.</w:t>
-      </w:r>
-    </w:p>
-    <w:p>
-      <w:pPr>
-        <w:pStyle w:val="Heading2"/>
-        <w:keepNext/>
-        <w:keepLines/>
-        <w:spacing w:before="120" w:after="240" w:line="240" w:lineRule="auto"/>
-        <w:ind w:left="0" w:firstLine="0"/>
-        <w:jc w:val="left"/>
-      </w:pPr>
-      <w:r>
-        <w:rPr>
-          <w:rFonts w:ascii="Times New Roman" w:hAnsi="Times New Roman" w:cs="Times New Roman" w:eastAsia="Times New Roman"/>
-          <w:b/>
-          <w:bCs/>
-          <w:sz w:val="26"/>
-          <w:szCs w:val="26"/>
-        </w:rPr>
-        <w:t xml:space="preserve">1.6. Kết cấu báo cáo</w:t>
-      </w:r>
-    </w:p>
-    <w:p>
-      <w:pPr>
-        <w:spacing w:before="0" w:after="240" w:line="240" w:lineRule="auto"/>
-        <w:ind w:left="0" w:firstLine="720"/>
-        <w:jc w:val="both"/>
-      </w:pPr>
-      <w:r>
-        <w:rPr>
-          <w:rFonts w:ascii="Times New Roman" w:hAnsi="Times New Roman" w:cs="Times New Roman" w:eastAsia="Times New Roman"/>
-          <w:sz w:val="26"/>
-          <w:szCs w:val="26"/>
-        </w:rPr>
-        <w:t xml:space="preserve">Ngoài danh mục và tài liệu tham khảo, báo cáo gồm tám phần. Phần 1 trình bày bối cảnh, vấn đề và giả thuyết. Phần 2 mô tả dữ liệu. Phần 3 trình bày quá trình tiền xử lý và mô hình dữ liệu. Phần 4 mô tả thiết kế dashboard. Phần 5 trình bày kết quả phân tích khám phá. Phần 6 trình bày kiểm định giả thuyết và mô hình. Phần 7 đề xuất giải pháp. Phần 8 nêu kết luận, hạn chế và hướng phát triển.</w:t>
+        <w:t xml:space="preserve">Nhóm kết hợp nghiên cứu tài liệu để xây dựng khung khái niệm; Power Query và DAX trong Power BI để xử lý, mô hình hóa và trực quan hóa dữ liệu; các kiểm định chi-square, Mann–Whitney U và Cochran–Mantel–Haenszel; hồi quy logistic và cây quyết định bằng Python; và mô phỏng tác động của giải pháp giới hạn làm thêm giờ.</w:t>
       </w:r>
     </w:p>
     <w:p>
@@ -7356,7 +7041,7 @@
                 <w:sz w:val="22"/>
                 <w:szCs w:val="22"/>
               </w:rPr>
-              <w:t xml:space="preserve">Annual_Income</w:t>
+              <w:t xml:space="preserve">Satisfaction_Index</w:t>
             </w:r>
           </w:p>
         </w:tc>
@@ -7377,7 +7062,7 @@
                 <w:sz w:val="22"/>
                 <w:szCs w:val="22"/>
               </w:rPr>
-              <w:t xml:space="preserve">MonthlyIncome × 12</w:t>
+              <w:t xml:space="preserve">Trung bình 4 thang hài lòng (môi trường, công việc, quan hệ, cân bằng CV–CS)</w:t>
             </w:r>
           </w:p>
         </w:tc>
@@ -7398,7 +7083,7 @@
                 <w:sz w:val="22"/>
                 <w:szCs w:val="22"/>
               </w:rPr>
-              <w:t xml:space="preserve">Ước tính chi phí thay thế</w:t>
+              <w:t xml:space="preserve">H5</w:t>
             </w:r>
           </w:p>
         </w:tc>
@@ -7424,7 +7109,7 @@
                 <w:sz w:val="22"/>
                 <w:szCs w:val="22"/>
               </w:rPr>
-              <w:t xml:space="preserve">Distance_Group</w:t>
+              <w:t xml:space="preserve">Low_Satisfaction_Count</w:t>
             </w:r>
           </w:p>
         </w:tc>
@@ -7445,7 +7130,7 @@
                 <w:sz w:val="22"/>
                 <w:szCs w:val="22"/>
               </w:rPr>
-              <w:t xml:space="preserve">Gần ≤5, Trung bình 6–15, Xa &gt;15 dặm</w:t>
+              <w:t xml:space="preserve">Số thang trong 4 thang ở mức 1 (Thấp)</w:t>
             </w:r>
           </w:p>
         </w:tc>
@@ -7466,7 +7151,7 @@
                 <w:sz w:val="22"/>
                 <w:szCs w:val="22"/>
               </w:rPr>
-              <w:t xml:space="preserve">Kiểm soát</w:t>
+              <w:t xml:space="preserve">H5</w:t>
             </w:r>
           </w:p>
         </w:tc>
@@ -7492,7 +7177,7 @@
                 <w:sz w:val="22"/>
                 <w:szCs w:val="22"/>
               </w:rPr>
-              <w:t xml:space="preserve">Satisfaction_Index</w:t>
+              <w:t xml:space="preserve">Mgr_Change_Label</w:t>
             </w:r>
           </w:p>
         </w:tc>
@@ -7513,7 +7198,7 @@
                 <w:sz w:val="22"/>
                 <w:szCs w:val="22"/>
               </w:rPr>
-              <w:t xml:space="preserve">Trung bình 4 thang hài lòng (môi trường, công việc, quan hệ, cân bằng CV–CS)</w:t>
+              <w:t xml:space="preserve">NV ≥ 2 năm có YearsWithCurrManager = 0 → “Vừa đổi quản lý”; NV &lt; 2 năm tách riêng</w:t>
             </w:r>
           </w:p>
         </w:tc>
@@ -7534,7 +7219,7 @@
                 <w:sz w:val="22"/>
                 <w:szCs w:val="22"/>
               </w:rPr>
-              <w:t xml:space="preserve">H5</w:t>
+              <w:t xml:space="preserve">H7</w:t>
             </w:r>
           </w:p>
         </w:tc>
@@ -7560,7 +7245,7 @@
                 <w:sz w:val="22"/>
                 <w:szCs w:val="22"/>
               </w:rPr>
-              <w:t xml:space="preserve">Low_Satisfaction_Count</w:t>
+              <w:t xml:space="preserve">Promotion_Stagnation</w:t>
             </w:r>
           </w:p>
         </w:tc>
@@ -7581,7 +7266,7 @@
                 <w:sz w:val="22"/>
                 <w:szCs w:val="22"/>
               </w:rPr>
-              <w:t xml:space="preserve">Số thang trong 4 thang ở mức 1 (Thấp)</w:t>
+              <w:t xml:space="preserve">YearsSinceLastPromotion ≥ 5</w:t>
             </w:r>
           </w:p>
         </w:tc>
@@ -7602,7 +7287,7 @@
                 <w:sz w:val="22"/>
                 <w:szCs w:val="22"/>
               </w:rPr>
-              <w:t xml:space="preserve">H5</w:t>
+              <w:t xml:space="preserve">H7</w:t>
             </w:r>
           </w:p>
         </w:tc>
@@ -7628,7 +7313,7 @@
                 <w:sz w:val="22"/>
                 <w:szCs w:val="22"/>
               </w:rPr>
-              <w:t xml:space="preserve">Mgr_Change_Label</w:t>
+              <w:t xml:space="preserve">Risk_Flags, Risk_Group</w:t>
             </w:r>
           </w:p>
         </w:tc>
@@ -7649,7 +7334,7 @@
                 <w:sz w:val="22"/>
                 <w:szCs w:val="22"/>
               </w:rPr>
-              <w:t xml:space="preserve">NV ≥ 2 năm có YearsWithCurrManager = 0 → “Vừa đổi quản lý”; NV &lt; 2 năm tách riêng</w:t>
+              <w:t xml:space="preserve">Đếm 5 cờ: làm thêm giờ, Level 1, độc thân, công tác thường xuyên, ≥ 1 thang hài lòng mức Thấp; nhóm Thấp 0–1, Trung bình 2–3, Cao 4–5</w:t>
             </w:r>
           </w:p>
         </w:tc>
@@ -7670,279 +7355,7 @@
                 <w:sz w:val="22"/>
                 <w:szCs w:val="22"/>
               </w:rPr>
-              <w:t xml:space="preserve">H7</w:t>
-            </w:r>
-          </w:p>
-        </w:tc>
-      </w:tr>
-      <w:tr>
-        <w:trPr>
-          <w:cantSplit/>
-        </w:trPr>
-        <w:tc>
-          <w:tcPr>
-            <w:tcW w:w="2340" w:type="dxa"/>
-            <w:vAlign w:val="center"/>
-          </w:tcPr>
-          <w:p>
-            <w:pPr>
-              <w:spacing w:before="0" w:after="0" w:line="240" w:lineRule="auto"/>
-              <w:ind w:left="0" w:firstLine="0"/>
-              <w:jc w:val="left"/>
-            </w:pPr>
-            <w:r>
-              <w:rPr>
-                <w:rFonts w:ascii="Times New Roman" w:hAnsi="Times New Roman" w:cs="Times New Roman" w:eastAsia="Times New Roman"/>
-                <w:sz w:val="22"/>
-                <w:szCs w:val="22"/>
-              </w:rPr>
-              <w:t xml:space="preserve">Promotion_Stagnation</w:t>
-            </w:r>
-          </w:p>
-        </w:tc>
-        <w:tc>
-          <w:tcPr>
-            <w:tcW w:w="4212" w:type="dxa"/>
-            <w:vAlign w:val="center"/>
-          </w:tcPr>
-          <w:p>
-            <w:pPr>
-              <w:spacing w:before="0" w:after="0" w:line="240" w:lineRule="auto"/>
-              <w:ind w:left="0" w:firstLine="0"/>
-              <w:jc w:val="left"/>
-            </w:pPr>
-            <w:r>
-              <w:rPr>
-                <w:rFonts w:ascii="Times New Roman" w:hAnsi="Times New Roman" w:cs="Times New Roman" w:eastAsia="Times New Roman"/>
-                <w:sz w:val="22"/>
-                <w:szCs w:val="22"/>
-              </w:rPr>
-              <w:t xml:space="preserve">YearsSinceLastPromotion ≥ 5</w:t>
-            </w:r>
-          </w:p>
-        </w:tc>
-        <w:tc>
-          <w:tcPr>
-            <w:tcW w:w="2808" w:type="dxa"/>
-            <w:vAlign w:val="center"/>
-          </w:tcPr>
-          <w:p>
-            <w:pPr>
-              <w:spacing w:before="0" w:after="0" w:line="240" w:lineRule="auto"/>
-              <w:ind w:left="0" w:firstLine="0"/>
-              <w:jc w:val="left"/>
-            </w:pPr>
-            <w:r>
-              <w:rPr>
-                <w:rFonts w:ascii="Times New Roman" w:hAnsi="Times New Roman" w:cs="Times New Roman" w:eastAsia="Times New Roman"/>
-                <w:sz w:val="22"/>
-                <w:szCs w:val="22"/>
-              </w:rPr>
-              <w:t xml:space="preserve">H7</w:t>
-            </w:r>
-          </w:p>
-        </w:tc>
-      </w:tr>
-      <w:tr>
-        <w:trPr>
-          <w:cantSplit/>
-        </w:trPr>
-        <w:tc>
-          <w:tcPr>
-            <w:tcW w:w="2340" w:type="dxa"/>
-            <w:vAlign w:val="center"/>
-          </w:tcPr>
-          <w:p>
-            <w:pPr>
-              <w:spacing w:before="0" w:after="0" w:line="240" w:lineRule="auto"/>
-              <w:ind w:left="0" w:firstLine="0"/>
-              <w:jc w:val="left"/>
-            </w:pPr>
-            <w:r>
-              <w:rPr>
-                <w:rFonts w:ascii="Times New Roman" w:hAnsi="Times New Roman" w:cs="Times New Roman" w:eastAsia="Times New Roman"/>
-                <w:sz w:val="22"/>
-                <w:szCs w:val="22"/>
-              </w:rPr>
-              <w:t xml:space="preserve">Prior_Experience_Years</w:t>
-            </w:r>
-          </w:p>
-        </w:tc>
-        <w:tc>
-          <w:tcPr>
-            <w:tcW w:w="4212" w:type="dxa"/>
-            <w:vAlign w:val="center"/>
-          </w:tcPr>
-          <w:p>
-            <w:pPr>
-              <w:spacing w:before="0" w:after="0" w:line="240" w:lineRule="auto"/>
-              <w:ind w:left="0" w:firstLine="0"/>
-              <w:jc w:val="left"/>
-            </w:pPr>
-            <w:r>
-              <w:rPr>
-                <w:rFonts w:ascii="Times New Roman" w:hAnsi="Times New Roman" w:cs="Times New Roman" w:eastAsia="Times New Roman"/>
-                <w:sz w:val="22"/>
-                <w:szCs w:val="22"/>
-              </w:rPr>
-              <w:t xml:space="preserve">TotalWorkingYears − YearsAtCompany</w:t>
-            </w:r>
-          </w:p>
-        </w:tc>
-        <w:tc>
-          <w:tcPr>
-            <w:tcW w:w="2808" w:type="dxa"/>
-            <w:vAlign w:val="center"/>
-          </w:tcPr>
-          <w:p>
-            <w:pPr>
-              <w:spacing w:before="0" w:after="0" w:line="240" w:lineRule="auto"/>
-              <w:ind w:left="0" w:firstLine="0"/>
-              <w:jc w:val="left"/>
-            </w:pPr>
-            <w:r>
-              <w:rPr>
-                <w:rFonts w:ascii="Times New Roman" w:hAnsi="Times New Roman" w:cs="Times New Roman" w:eastAsia="Times New Roman"/>
-                <w:sz w:val="22"/>
-                <w:szCs w:val="22"/>
-              </w:rPr>
-              <w:t xml:space="preserve">Kiểm tra logic</w:t>
-            </w:r>
-          </w:p>
-        </w:tc>
-      </w:tr>
-      <w:tr>
-        <w:trPr>
-          <w:cantSplit/>
-        </w:trPr>
-        <w:tc>
-          <w:tcPr>
-            <w:tcW w:w="2340" w:type="dxa"/>
-            <w:vAlign w:val="center"/>
-          </w:tcPr>
-          <w:p>
-            <w:pPr>
-              <w:spacing w:before="0" w:after="0" w:line="240" w:lineRule="auto"/>
-              <w:ind w:left="0" w:firstLine="0"/>
-              <w:jc w:val="left"/>
-            </w:pPr>
-            <w:r>
-              <w:rPr>
-                <w:rFonts w:ascii="Times New Roman" w:hAnsi="Times New Roman" w:cs="Times New Roman" w:eastAsia="Times New Roman"/>
-                <w:sz w:val="22"/>
-                <w:szCs w:val="22"/>
-              </w:rPr>
-              <w:t xml:space="preserve">Risk_Flags, Risk_Group</w:t>
-            </w:r>
-          </w:p>
-        </w:tc>
-        <w:tc>
-          <w:tcPr>
-            <w:tcW w:w="4212" w:type="dxa"/>
-            <w:vAlign w:val="center"/>
-          </w:tcPr>
-          <w:p>
-            <w:pPr>
-              <w:spacing w:before="0" w:after="0" w:line="240" w:lineRule="auto"/>
-              <w:ind w:left="0" w:firstLine="0"/>
-              <w:jc w:val="left"/>
-            </w:pPr>
-            <w:r>
-              <w:rPr>
-                <w:rFonts w:ascii="Times New Roman" w:hAnsi="Times New Roman" w:cs="Times New Roman" w:eastAsia="Times New Roman"/>
-                <w:sz w:val="22"/>
-                <w:szCs w:val="22"/>
-              </w:rPr>
-              <w:t xml:space="preserve">Đếm 5 cờ: làm thêm giờ, Level 1, độc thân, công tác thường xuyên, ≥ 1 thang hài lòng mức Thấp; nhóm Thấp 0–1, Trung bình 2–3, Cao 4–5</w:t>
-            </w:r>
-          </w:p>
-        </w:tc>
-        <w:tc>
-          <w:tcPr>
-            <w:tcW w:w="2808" w:type="dxa"/>
-            <w:vAlign w:val="center"/>
-          </w:tcPr>
-          <w:p>
-            <w:pPr>
-              <w:spacing w:before="0" w:after="0" w:line="240" w:lineRule="auto"/>
-              <w:ind w:left="0" w:firstLine="0"/>
-              <w:jc w:val="left"/>
-            </w:pPr>
-            <w:r>
-              <w:rPr>
-                <w:rFonts w:ascii="Times New Roman" w:hAnsi="Times New Roman" w:cs="Times New Roman" w:eastAsia="Times New Roman"/>
-                <w:sz w:val="22"/>
-                <w:szCs w:val="22"/>
-              </w:rPr>
               <w:t xml:space="preserve">Chấm điểm rủi ro</w:t>
-            </w:r>
-          </w:p>
-        </w:tc>
-      </w:tr>
-      <w:tr>
-        <w:trPr>
-          <w:cantSplit/>
-        </w:trPr>
-        <w:tc>
-          <w:tcPr>
-            <w:tcW w:w="2340" w:type="dxa"/>
-            <w:vAlign w:val="center"/>
-          </w:tcPr>
-          <w:p>
-            <w:pPr>
-              <w:spacing w:before="0" w:after="0" w:line="240" w:lineRule="auto"/>
-              <w:ind w:left="0" w:firstLine="0"/>
-              <w:jc w:val="left"/>
-            </w:pPr>
-            <w:r>
-              <w:rPr>
-                <w:rFonts w:ascii="Times New Roman" w:hAnsi="Times New Roman" w:cs="Times New Roman" w:eastAsia="Times New Roman"/>
-                <w:sz w:val="22"/>
-                <w:szCs w:val="22"/>
-              </w:rPr>
-              <w:t xml:space="preserve">Các cột *_Label, *_Sort</w:t>
-            </w:r>
-          </w:p>
-        </w:tc>
-        <w:tc>
-          <w:tcPr>
-            <w:tcW w:w="4212" w:type="dxa"/>
-            <w:vAlign w:val="center"/>
-          </w:tcPr>
-          <w:p>
-            <w:pPr>
-              <w:spacing w:before="0" w:after="0" w:line="240" w:lineRule="auto"/>
-              <w:ind w:left="0" w:firstLine="0"/>
-              <w:jc w:val="left"/>
-            </w:pPr>
-            <w:r>
-              <w:rPr>
-                <w:rFonts w:ascii="Times New Roman" w:hAnsi="Times New Roman" w:cs="Times New Roman" w:eastAsia="Times New Roman"/>
-                <w:sz w:val="22"/>
-                <w:szCs w:val="22"/>
-              </w:rPr>
-              <w:t xml:space="preserve">Nhãn tiếng Việt và thứ tự sắp xếp</w:t>
-            </w:r>
-          </w:p>
-        </w:tc>
-        <w:tc>
-          <w:tcPr>
-            <w:tcW w:w="2808" w:type="dxa"/>
-            <w:vAlign w:val="center"/>
-          </w:tcPr>
-          <w:p>
-            <w:pPr>
-              <w:spacing w:before="0" w:after="0" w:line="240" w:lineRule="auto"/>
-              <w:ind w:left="0" w:firstLine="0"/>
-              <w:jc w:val="left"/>
-            </w:pPr>
-            <w:r>
-              <w:rPr>
-                <w:rFonts w:ascii="Times New Roman" w:hAnsi="Times New Roman" w:cs="Times New Roman" w:eastAsia="Times New Roman"/>
-                <w:sz w:val="22"/>
-                <w:szCs w:val="22"/>
-              </w:rPr>
-              <w:t xml:space="preserve">Hiển thị trên dashboard</w:t>
             </w:r>
           </w:p>
         </w:tc>
@@ -8087,7 +7500,7 @@
       <w:r>
         <w:drawing>
           <wp:inline>
-            <wp:extent cx="5760720" cy="3759628"/>
+            <wp:extent cx="4572000" cy="2983832"/>
             <wp:docPr id="2" name="Picture 2"/>
             <wp:cNvGraphicFramePr>
               <a:graphicFrameLocks noChangeAspect="1"/>
@@ -8108,7 +7521,7 @@
                   <pic:spPr>
                     <a:xfrm>
                       <a:off x="0" y="0"/>
-                      <a:ext cx="5760720" cy="3759628"/>
+                      <a:ext cx="4572000" cy="2983832"/>
                     </a:xfrm>
                     <a:prstGeom prst="rect"/>
                   </pic:spPr>
@@ -8541,7 +7954,7 @@
                 <w:sz w:val="22"/>
                 <w:szCs w:val="22"/>
               </w:rPr>
-              <w:t xml:space="preserve">Tỷ lệ nghỉ (mức chung)</w:t>
+              <w:t xml:space="preserve">Màu tỷ lệ nghỉ</w:t>
             </w:r>
           </w:p>
         </w:tc>
@@ -8562,7 +7975,7 @@
                 <w:sz w:val="22"/>
                 <w:szCs w:val="22"/>
               </w:rPr>
-              <w:t xml:space="preserve">CALCULATE([Tỷ lệ nghỉ việc], ALLSELECTED(Employees))</w:t>
+              <w:t xml:space="preserve">SWITCH(TRUE(), _r &gt;= 1.8 * _avg, "#E5484D", _r &gt; _avg, "#2A9D8F", "#9CC9E8")</w:t>
             </w:r>
           </w:p>
         </w:tc>
@@ -8583,7 +7996,7 @@
                 <w:sz w:val="22"/>
                 <w:szCs w:val="22"/>
               </w:rPr>
-              <w:t xml:space="preserve">Mốc so sánh trong bối cảnh lọc</w:t>
+              <w:t xml:space="preserve">Tô màu có điều kiện: đỏ = rất cao (≥ 1,8 lần), xanh lục = cao hơn, xanh nhạt = thấp hơn</w:t>
             </w:r>
           </w:p>
         </w:tc>
@@ -8609,7 +8022,7 @@
                 <w:sz w:val="22"/>
                 <w:szCs w:val="22"/>
               </w:rPr>
-              <w:t xml:space="preserve">Màu tỷ lệ nghỉ</w:t>
+              <w:t xml:space="preserve">Tỷ lệ nghỉ (thang hài lòng)</w:t>
             </w:r>
           </w:p>
         </w:tc>
@@ -8630,7 +8043,7 @@
                 <w:sz w:val="22"/>
                 <w:szCs w:val="22"/>
               </w:rPr>
-              <w:t xml:space="preserve">SWITCH(TRUE(), _r &gt;= 1.8 * _avg, "#E5484D", _r &gt; _avg, "#2A9D8F", "#9CC9E8")</w:t>
+              <w:t xml:space="preserve">AVERAGEX(Satisfaction_Long, RELATED(Employees[Attrition_Flag]))</w:t>
             </w:r>
           </w:p>
         </w:tc>
@@ -8651,7 +8064,7 @@
                 <w:sz w:val="22"/>
                 <w:szCs w:val="22"/>
               </w:rPr>
-              <w:t xml:space="preserve">Tô màu có điều kiện: đỏ = rất cao (≥ 1,8 lần), xanh lục = cao hơn, xanh nhạt = thấp hơn</w:t>
+              <w:t xml:space="preserve">Tỷ lệ nghỉ theo từng mức của 5 thang</w:t>
             </w:r>
           </w:p>
         </w:tc>
@@ -8677,7 +8090,7 @@
                 <w:sz w:val="22"/>
                 <w:szCs w:val="22"/>
               </w:rPr>
-              <w:t xml:space="preserve">Thu nhập trung vị</w:t>
+              <w:t xml:space="preserve">Chi phí thay thế ước tính</w:t>
             </w:r>
           </w:p>
         </w:tc>
@@ -8698,7 +8111,7 @@
                 <w:sz w:val="22"/>
                 <w:szCs w:val="22"/>
               </w:rPr>
-              <w:t xml:space="preserve">MEDIAN(Employees[MonthlyIncome])</w:t>
+              <w:t xml:space="preserve">[Tổng lương năm người nghỉ] * [Tỷ lệ chi phí thay thế]</w:t>
             </w:r>
           </w:p>
         </w:tc>
@@ -8719,7 +8132,7 @@
                 <w:sz w:val="22"/>
                 <w:szCs w:val="22"/>
               </w:rPr>
-              <w:t xml:space="preserve">Dùng trung vị vì thu nhập lệch phải</w:t>
+              <w:t xml:space="preserve">Mặc định 50% lương năm, điều chỉnh 25–150%</w:t>
             </w:r>
           </w:p>
         </w:tc>
@@ -8745,7 +8158,7 @@
                 <w:sz w:val="22"/>
                 <w:szCs w:val="22"/>
               </w:rPr>
-              <w:t xml:space="preserve">Tỷ lệ nghỉ (thang hài lòng)</w:t>
+              <w:t xml:space="preserve">Ca nghỉ tránh được (giới hạn OT)</w:t>
             </w:r>
           </w:p>
         </w:tc>
@@ -8766,7 +8179,7 @@
                 <w:sz w:val="22"/>
                 <w:szCs w:val="22"/>
               </w:rPr>
-              <w:t xml:space="preserve">AVERAGEX(Satisfaction_Long, RELATED(Employees[Attrition_Flag]))</w:t>
+              <w:t xml:space="preserve">SUMX(VALUES(Employees[JobLevel]), MAX(_left - _n * _noRate, 0))</w:t>
             </w:r>
           </w:p>
         </w:tc>
@@ -8787,211 +8200,7 @@
                 <w:sz w:val="22"/>
                 <w:szCs w:val="22"/>
               </w:rPr>
-              <w:t xml:space="preserve">Tỷ lệ nghỉ theo từng mức của 5 thang</w:t>
-            </w:r>
-          </w:p>
-        </w:tc>
-      </w:tr>
-      <w:tr>
-        <w:trPr>
-          <w:cantSplit/>
-        </w:trPr>
-        <w:tc>
-          <w:tcPr>
-            <w:tcW w:w="2059" w:type="dxa"/>
-            <w:vAlign w:val="center"/>
-          </w:tcPr>
-          <w:p>
-            <w:pPr>
-              <w:spacing w:before="0" w:after="0" w:line="240" w:lineRule="auto"/>
-              <w:ind w:left="0" w:firstLine="0"/>
-              <w:jc w:val="left"/>
-            </w:pPr>
-            <w:r>
-              <w:rPr>
-                <w:rFonts w:ascii="Times New Roman" w:hAnsi="Times New Roman" w:cs="Times New Roman" w:eastAsia="Times New Roman"/>
-                <w:sz w:val="22"/>
-                <w:szCs w:val="22"/>
-              </w:rPr>
-              <w:t xml:space="preserve">Chi phí thay thế ước tính</w:t>
-            </w:r>
-          </w:p>
-        </w:tc>
-        <w:tc>
-          <w:tcPr>
-            <w:tcW w:w="4212" w:type="dxa"/>
-            <w:vAlign w:val="center"/>
-          </w:tcPr>
-          <w:p>
-            <w:pPr>
-              <w:spacing w:before="0" w:after="0" w:line="240" w:lineRule="auto"/>
-              <w:ind w:left="0" w:firstLine="0"/>
-              <w:jc w:val="left"/>
-            </w:pPr>
-            <w:r>
-              <w:rPr>
-                <w:rFonts w:ascii="Times New Roman" w:hAnsi="Times New Roman" w:cs="Times New Roman" w:eastAsia="Times New Roman"/>
-                <w:sz w:val="22"/>
-                <w:szCs w:val="22"/>
-              </w:rPr>
-              <w:t xml:space="preserve">[Tổng lương năm người nghỉ] * [Tỷ lệ chi phí thay thế]</w:t>
-            </w:r>
-          </w:p>
-        </w:tc>
-        <w:tc>
-          <w:tcPr>
-            <w:tcW w:w="3089" w:type="dxa"/>
-            <w:vAlign w:val="center"/>
-          </w:tcPr>
-          <w:p>
-            <w:pPr>
-              <w:spacing w:before="0" w:after="0" w:line="240" w:lineRule="auto"/>
-              <w:ind w:left="0" w:firstLine="0"/>
-              <w:jc w:val="left"/>
-            </w:pPr>
-            <w:r>
-              <w:rPr>
-                <w:rFonts w:ascii="Times New Roman" w:hAnsi="Times New Roman" w:cs="Times New Roman" w:eastAsia="Times New Roman"/>
-                <w:sz w:val="22"/>
-                <w:szCs w:val="22"/>
-              </w:rPr>
-              <w:t xml:space="preserve">Mặc định 50% lương năm, điều chỉnh 25–150%</w:t>
-            </w:r>
-          </w:p>
-        </w:tc>
-      </w:tr>
-      <w:tr>
-        <w:trPr>
-          <w:cantSplit/>
-        </w:trPr>
-        <w:tc>
-          <w:tcPr>
-            <w:tcW w:w="2059" w:type="dxa"/>
-            <w:vAlign w:val="center"/>
-          </w:tcPr>
-          <w:p>
-            <w:pPr>
-              <w:spacing w:before="0" w:after="0" w:line="240" w:lineRule="auto"/>
-              <w:ind w:left="0" w:firstLine="0"/>
-              <w:jc w:val="left"/>
-            </w:pPr>
-            <w:r>
-              <w:rPr>
-                <w:rFonts w:ascii="Times New Roman" w:hAnsi="Times New Roman" w:cs="Times New Roman" w:eastAsia="Times New Roman"/>
-                <w:sz w:val="22"/>
-                <w:szCs w:val="22"/>
-              </w:rPr>
-              <w:t xml:space="preserve">Ca nghỉ tránh được (giới hạn OT)</w:t>
-            </w:r>
-          </w:p>
-        </w:tc>
-        <w:tc>
-          <w:tcPr>
-            <w:tcW w:w="4212" w:type="dxa"/>
-            <w:vAlign w:val="center"/>
-          </w:tcPr>
-          <w:p>
-            <w:pPr>
-              <w:spacing w:before="0" w:after="0" w:line="240" w:lineRule="auto"/>
-              <w:ind w:left="0" w:firstLine="0"/>
-              <w:jc w:val="left"/>
-            </w:pPr>
-            <w:r>
-              <w:rPr>
-                <w:rFonts w:ascii="Times New Roman" w:hAnsi="Times New Roman" w:cs="Times New Roman" w:eastAsia="Times New Roman"/>
-                <w:sz w:val="22"/>
-                <w:szCs w:val="22"/>
-              </w:rPr>
-              <w:t xml:space="preserve">SUMX(VALUES(Employees[JobLevel]), MAX(_left - _n * _noRate, 0))</w:t>
-            </w:r>
-          </w:p>
-        </w:tc>
-        <w:tc>
-          <w:tcPr>
-            <w:tcW w:w="3089" w:type="dxa"/>
-            <w:vAlign w:val="center"/>
-          </w:tcPr>
-          <w:p>
-            <w:pPr>
-              <w:spacing w:before="0" w:after="0" w:line="240" w:lineRule="auto"/>
-              <w:ind w:left="0" w:firstLine="0"/>
-              <w:jc w:val="left"/>
-            </w:pPr>
-            <w:r>
-              <w:rPr>
-                <w:rFonts w:ascii="Times New Roman" w:hAnsi="Times New Roman" w:cs="Times New Roman" w:eastAsia="Times New Roman"/>
-                <w:sz w:val="22"/>
-                <w:szCs w:val="22"/>
-              </w:rPr>
               <w:t xml:space="preserve">Mô phỏng: nếu người làm thêm giờ nghỉ theo tỷ lệ của người không làm thêm cùng cấp</w:t>
-            </w:r>
-          </w:p>
-        </w:tc>
-      </w:tr>
-      <w:tr>
-        <w:trPr>
-          <w:cantSplit/>
-        </w:trPr>
-        <w:tc>
-          <w:tcPr>
-            <w:tcW w:w="2059" w:type="dxa"/>
-            <w:vAlign w:val="center"/>
-          </w:tcPr>
-          <w:p>
-            <w:pPr>
-              <w:spacing w:before="0" w:after="0" w:line="240" w:lineRule="auto"/>
-              <w:ind w:left="0" w:firstLine="0"/>
-              <w:jc w:val="left"/>
-            </w:pPr>
-            <w:r>
-              <w:rPr>
-                <w:rFonts w:ascii="Times New Roman" w:hAnsi="Times New Roman" w:cs="Times New Roman" w:eastAsia="Times New Roman"/>
-                <w:sz w:val="22"/>
-                <w:szCs w:val="22"/>
-              </w:rPr>
-              <w:t xml:space="preserve">NV hiện tại rủi ro cao</w:t>
-            </w:r>
-          </w:p>
-        </w:tc>
-        <w:tc>
-          <w:tcPr>
-            <w:tcW w:w="4212" w:type="dxa"/>
-            <w:vAlign w:val="center"/>
-          </w:tcPr>
-          <w:p>
-            <w:pPr>
-              <w:spacing w:before="0" w:after="0" w:line="240" w:lineRule="auto"/>
-              <w:ind w:left="0" w:firstLine="0"/>
-              <w:jc w:val="left"/>
-            </w:pPr>
-            <w:r>
-              <w:rPr>
-                <w:rFonts w:ascii="Times New Roman" w:hAnsi="Times New Roman" w:cs="Times New Roman" w:eastAsia="Times New Roman"/>
-                <w:sz w:val="22"/>
-                <w:szCs w:val="22"/>
-              </w:rPr>
-              <w:t xml:space="preserve">CALCULATE([Tổng nhân viên], Employees[Attrition_Flag] = 0, Employees[Risk_Flags] &gt;= 4)</w:t>
-            </w:r>
-          </w:p>
-        </w:tc>
-        <w:tc>
-          <w:tcPr>
-            <w:tcW w:w="3089" w:type="dxa"/>
-            <w:vAlign w:val="center"/>
-          </w:tcPr>
-          <w:p>
-            <w:pPr>
-              <w:spacing w:before="0" w:after="0" w:line="240" w:lineRule="auto"/>
-              <w:ind w:left="0" w:firstLine="0"/>
-              <w:jc w:val="left"/>
-            </w:pPr>
-            <w:r>
-              <w:rPr>
-                <w:rFonts w:ascii="Times New Roman" w:hAnsi="Times New Roman" w:cs="Times New Roman" w:eastAsia="Times New Roman"/>
-                <w:sz w:val="22"/>
-                <w:szCs w:val="22"/>
-              </w:rPr>
-              <w:t xml:space="preserve">Danh sách cần can thiệp ngay</w:t>
             </w:r>
           </w:p>
         </w:tc>
@@ -9573,44 +8782,6 @@
           <w:sz w:val="26"/>
           <w:szCs w:val="26"/>
         </w:rPr>
-        <w:t xml:space="preserve">Tỷ lệ thay vì số đếm:</w:t>
-      </w:r>
-      <w:r>
-        <w:rPr>
-          <w:rFonts w:ascii="Times New Roman" w:hAnsi="Times New Roman" w:cs="Times New Roman" w:eastAsia="Times New Roman"/>
-          <w:sz w:val="26"/>
-          <w:szCs w:val="26"/>
-        </w:rPr>
-        <w:t xml:space="preserve"> so sánh nhóm có quy mô khác nhau bằng tỷ lệ. Trang 1 chủ động đặt thêm biểu đồ số đếm để chỉ ra nghịch lý: R&amp;D có tỷ lệ thấp nhất nhưng số người nghỉ nhiều nhất (133).</w:t>
-      </w:r>
-    </w:p>
-    <w:p>
-      <w:pPr>
-        <w:tabs>
-          <w:tab w:val="left" w:leader="none" w:pos="1080"/>
-        </w:tabs>
-        <w:spacing w:before="0" w:after="120" w:line="240" w:lineRule="auto"/>
-        <w:ind w:left="1080" w:hanging="360"/>
-        <w:jc w:val="both"/>
-      </w:pPr>
-      <w:r>
-        <w:rPr>
-          <w:rFonts w:ascii="Times New Roman" w:hAnsi="Times New Roman" w:cs="Times New Roman" w:eastAsia="Times New Roman"/>
-          <w:sz w:val="26"/>
-          <w:szCs w:val="26"/>
-        </w:rPr>
-        <w:t xml:space="preserve">•</w:t>
-        <w:tab/>
-        <w:t xml:space="preserve"/>
-      </w:r>
-      <w:r>
-        <w:rPr>
-          <w:rFonts w:ascii="Times New Roman" w:hAnsi="Times New Roman" w:cs="Times New Roman" w:eastAsia="Times New Roman"/>
-          <w:b/>
-          <w:bCs/>
-          <w:sz w:val="26"/>
-          <w:szCs w:val="26"/>
-        </w:rPr>
         <w:t xml:space="preserve">Bộ lọc đồng nhất:</w:t>
       </w:r>
       <w:r>
@@ -9620,44 +8791,6 @@
           <w:szCs w:val="26"/>
         </w:rPr>
         <w:t xml:space="preserve"> 4 slicer Department, JobLevel, Age_Group, OverTime ở cùng vị trí trên mọi trang. Chữ nhận định ghi rõ “số toàn công ty, không đổi theo bộ lọc” để tránh hiểu nhầm.</w:t>
-      </w:r>
-    </w:p>
-    <w:p>
-      <w:pPr>
-        <w:tabs>
-          <w:tab w:val="left" w:leader="none" w:pos="1080"/>
-        </w:tabs>
-        <w:spacing w:before="0" w:after="240" w:line="240" w:lineRule="auto"/>
-        <w:ind w:left="1080" w:hanging="360"/>
-        <w:jc w:val="both"/>
-      </w:pPr>
-      <w:r>
-        <w:rPr>
-          <w:rFonts w:ascii="Times New Roman" w:hAnsi="Times New Roman" w:cs="Times New Roman" w:eastAsia="Times New Roman"/>
-          <w:sz w:val="26"/>
-          <w:szCs w:val="26"/>
-        </w:rPr>
-        <w:t xml:space="preserve">•</w:t>
-        <w:tab/>
-        <w:t xml:space="preserve"/>
-      </w:r>
-      <w:r>
-        <w:rPr>
-          <w:rFonts w:ascii="Times New Roman" w:hAnsi="Times New Roman" w:cs="Times New Roman" w:eastAsia="Times New Roman"/>
-          <w:b/>
-          <w:bCs/>
-          <w:sz w:val="26"/>
-          <w:szCs w:val="26"/>
-        </w:rPr>
-        <w:t xml:space="preserve">Cảnh báo yếu tố gây nhiễu ngay trên biểu đồ:</w:t>
-      </w:r>
-      <w:r>
-        <w:rPr>
-          <w:rFonts w:ascii="Times New Roman" w:hAnsi="Times New Roman" w:cs="Times New Roman" w:eastAsia="Times New Roman"/>
-          <w:sz w:val="26"/>
-          <w:szCs w:val="26"/>
-        </w:rPr>
-        <w:t xml:space="preserve"> ví dụ biểu đồ cổ phiếu × hôn nhân ghi “Bẫy gây nhiễu: NV độc thân chỉ có cột mức 0”, và biểu đồ đổi quản lý ghi “không rõ ai rời trước”.</w:t>
       </w:r>
     </w:p>
     <w:p>
@@ -9728,9 +8861,9 @@
         </w:tblCellMar>
       </w:tblPr>
       <w:tblGrid>
-        <w:gridCol w:w="1404"/>
-        <w:gridCol w:w="1872"/>
-        <w:gridCol w:w="3463"/>
+        <w:gridCol w:w="1591"/>
+        <w:gridCol w:w="1966"/>
+        <w:gridCol w:w="3182"/>
         <w:gridCol w:w="2621"/>
       </w:tblGrid>
       <w:tr>
@@ -9740,7 +8873,7 @@
         </w:trPr>
         <w:tc>
           <w:tcPr>
-            <w:tcW w:w="1404" w:type="dxa"/>
+            <w:tcW w:w="1591" w:type="dxa"/>
             <w:shd w:val="clear" w:color="auto" w:fill="F2F2F2"/>
             <w:vAlign w:val="center"/>
           </w:tcPr>
@@ -9764,7 +8897,7 @@
         </w:tc>
         <w:tc>
           <w:tcPr>
-            <w:tcW w:w="1872" w:type="dxa"/>
+            <w:tcW w:w="1966" w:type="dxa"/>
             <w:shd w:val="clear" w:color="auto" w:fill="F2F2F2"/>
             <w:vAlign w:val="center"/>
           </w:tcPr>
@@ -9788,7 +8921,7 @@
         </w:tc>
         <w:tc>
           <w:tcPr>
-            <w:tcW w:w="3463" w:type="dxa"/>
+            <w:tcW w:w="3182" w:type="dxa"/>
             <w:shd w:val="clear" w:color="auto" w:fill="F2F2F2"/>
             <w:vAlign w:val="center"/>
           </w:tcPr>
@@ -9841,7 +8974,7 @@
         </w:trPr>
         <w:tc>
           <w:tcPr>
-            <w:tcW w:w="1404" w:type="dxa"/>
+            <w:tcW w:w="1591" w:type="dxa"/>
             <w:vAlign w:val="center"/>
           </w:tcPr>
           <w:p>
@@ -9862,7 +8995,7 @@
         </w:tc>
         <w:tc>
           <w:tcPr>
-            <w:tcW w:w="1872" w:type="dxa"/>
+            <w:tcW w:w="1966" w:type="dxa"/>
             <w:vAlign w:val="center"/>
           </w:tcPr>
           <w:p>
@@ -9883,22 +9016,22 @@
         </w:tc>
         <w:tc>
           <w:tcPr>
-            <w:tcW w:w="3463" w:type="dxa"/>
-            <w:vAlign w:val="center"/>
-          </w:tcPr>
-          <w:p>
-            <w:pPr>
-              <w:spacing w:before="0" w:after="0" w:line="240" w:lineRule="auto"/>
-              <w:ind w:left="0" w:firstLine="0"/>
-              <w:jc w:val="left"/>
-            </w:pPr>
-            <w:r>
-              <w:rPr>
-                <w:rFonts w:ascii="Times New Roman" w:hAnsi="Times New Roman" w:cs="Times New Roman" w:eastAsia="Times New Roman"/>
-                <w:sz w:val="22"/>
-                <w:szCs w:val="22"/>
-              </w:rPr>
-              <w:t xml:space="preserve">6 thẻ KPI (tổng NV, số nghỉ, tỷ lệ, thu nhập trung vị nghỉ/ở lại, chi phí thay thế); cột theo phòng ban; thanh ngang theo 9 vị trí; donut cơ cấu</w:t>
+            <w:tcW w:w="3182" w:type="dxa"/>
+            <w:vAlign w:val="center"/>
+          </w:tcPr>
+          <w:p>
+            <w:pPr>
+              <w:spacing w:before="0" w:after="0" w:line="240" w:lineRule="auto"/>
+              <w:ind w:left="0" w:firstLine="0"/>
+              <w:jc w:val="left"/>
+            </w:pPr>
+            <w:r>
+              <w:rPr>
+                <w:rFonts w:ascii="Times New Roman" w:hAnsi="Times New Roman" w:cs="Times New Roman" w:eastAsia="Times New Roman"/>
+                <w:sz w:val="22"/>
+                <w:szCs w:val="22"/>
+              </w:rPr>
+              <w:t xml:space="preserve">6 thẻ KPI; tỷ lệ nghỉ theo phòng ban và 9 vị trí; donut cơ cấu</w:t>
             </w:r>
           </w:p>
         </w:tc>
@@ -9919,7 +9052,7 @@
                 <w:sz w:val="22"/>
                 <w:szCs w:val="22"/>
               </w:rPr>
-              <w:t xml:space="preserve">Cứ 6 nhân viên có 1 người rời đi – và họ rời đi từ tuyến đầu</w:t>
+              <w:t xml:space="preserve">Cứ 6 nhân viên có 1 người rời đi – từ tuyến đầu</w:t>
             </w:r>
           </w:p>
         </w:tc>
@@ -9930,28 +9063,28 @@
         </w:trPr>
         <w:tc>
           <w:tcPr>
-            <w:tcW w:w="1404" w:type="dxa"/>
-            <w:vAlign w:val="center"/>
-          </w:tcPr>
-          <w:p>
-            <w:pPr>
-              <w:spacing w:before="0" w:after="0" w:line="240" w:lineRule="auto"/>
-              <w:ind w:left="0" w:firstLine="0"/>
-              <w:jc w:val="left"/>
-            </w:pPr>
-            <w:r>
-              <w:rPr>
-                <w:rFonts w:ascii="Times New Roman" w:hAnsi="Times New Roman" w:cs="Times New Roman" w:eastAsia="Times New Roman"/>
-                <w:sz w:val="22"/>
-                <w:szCs w:val="22"/>
-              </w:rPr>
-              <w:t xml:space="preserve">2. Chân dung người nghỉ việc</w:t>
-            </w:r>
-          </w:p>
-        </w:tc>
-        <w:tc>
-          <w:tcPr>
-            <w:tcW w:w="1872" w:type="dxa"/>
+            <w:tcW w:w="1591" w:type="dxa"/>
+            <w:vAlign w:val="center"/>
+          </w:tcPr>
+          <w:p>
+            <w:pPr>
+              <w:spacing w:before="0" w:after="0" w:line="240" w:lineRule="auto"/>
+              <w:ind w:left="0" w:firstLine="0"/>
+              <w:jc w:val="left"/>
+            </w:pPr>
+            <w:r>
+              <w:rPr>
+                <w:rFonts w:ascii="Times New Roman" w:hAnsi="Times New Roman" w:cs="Times New Roman" w:eastAsia="Times New Roman"/>
+                <w:sz w:val="22"/>
+                <w:szCs w:val="22"/>
+              </w:rPr>
+              <w:t xml:space="preserve">2. Chân dung người nghỉ</w:t>
+            </w:r>
+          </w:p>
+        </w:tc>
+        <w:tc>
+          <w:tcPr>
+            <w:tcW w:w="1966" w:type="dxa"/>
             <w:vAlign w:val="center"/>
           </w:tcPr>
           <w:p>
@@ -9972,22 +9105,22 @@
         </w:tc>
         <w:tc>
           <w:tcPr>
-            <w:tcW w:w="3463" w:type="dxa"/>
-            <w:vAlign w:val="center"/>
-          </w:tcPr>
-          <w:p>
-            <w:pPr>
-              <w:spacing w:before="0" w:after="0" w:line="240" w:lineRule="auto"/>
-              <w:ind w:left="0" w:firstLine="0"/>
-              <w:jc w:val="left"/>
-            </w:pPr>
-            <w:r>
-              <w:rPr>
-                <w:rFonts w:ascii="Times New Roman" w:hAnsi="Times New Roman" w:cs="Times New Roman" w:eastAsia="Times New Roman"/>
-                <w:sz w:val="22"/>
-                <w:szCs w:val="22"/>
-              </w:rPr>
-              <w:t xml:space="preserve">6 biểu đồ cột: tuổi, thâm niên, cấp bậc, hôn nhân, giới tính, học vấn; biểu đồ so sánh hồ sơ nghỉ vs ở lại</w:t>
+            <w:tcW w:w="3182" w:type="dxa"/>
+            <w:vAlign w:val="center"/>
+          </w:tcPr>
+          <w:p>
+            <w:pPr>
+              <w:spacing w:before="0" w:after="0" w:line="240" w:lineRule="auto"/>
+              <w:ind w:left="0" w:firstLine="0"/>
+              <w:jc w:val="left"/>
+            </w:pPr>
+            <w:r>
+              <w:rPr>
+                <w:rFonts w:ascii="Times New Roman" w:hAnsi="Times New Roman" w:cs="Times New Roman" w:eastAsia="Times New Roman"/>
+                <w:sz w:val="22"/>
+                <w:szCs w:val="22"/>
+              </w:rPr>
+              <w:t xml:space="preserve">Tỷ lệ nghỉ theo tuổi, thâm niên, cấp bậc, hôn nhân, giới tính, học vấn</w:t>
             </w:r>
           </w:p>
         </w:tc>
@@ -10019,7 +9152,7 @@
         </w:trPr>
         <w:tc>
           <w:tcPr>
-            <w:tcW w:w="1404" w:type="dxa"/>
+            <w:tcW w:w="1591" w:type="dxa"/>
             <w:vAlign w:val="center"/>
           </w:tcPr>
           <w:p>
@@ -10040,43 +9173,43 @@
         </w:tc>
         <w:tc>
           <w:tcPr>
-            <w:tcW w:w="1872" w:type="dxa"/>
-            <w:vAlign w:val="center"/>
-          </w:tcPr>
-          <w:p>
-            <w:pPr>
-              <w:spacing w:before="0" w:after="0" w:line="240" w:lineRule="auto"/>
-              <w:ind w:left="0" w:firstLine="0"/>
-              <w:jc w:val="left"/>
-            </w:pPr>
-            <w:r>
-              <w:rPr>
-                <w:rFonts w:ascii="Times New Roman" w:hAnsi="Times New Roman" w:cs="Times New Roman" w:eastAsia="Times New Roman"/>
-                <w:sz w:val="22"/>
-                <w:szCs w:val="22"/>
-              </w:rPr>
-              <w:t xml:space="preserve">Áp lực công việc đóng góp thế nào?</w:t>
-            </w:r>
-          </w:p>
-        </w:tc>
-        <w:tc>
-          <w:tcPr>
-            <w:tcW w:w="3463" w:type="dxa"/>
-            <w:vAlign w:val="center"/>
-          </w:tcPr>
-          <w:p>
-            <w:pPr>
-              <w:spacing w:before="0" w:after="0" w:line="240" w:lineRule="auto"/>
-              <w:ind w:left="0" w:firstLine="0"/>
-              <w:jc w:val="left"/>
-            </w:pPr>
-            <w:r>
-              <w:rPr>
-                <w:rFonts w:ascii="Times New Roman" w:hAnsi="Times New Roman" w:cs="Times New Roman" w:eastAsia="Times New Roman"/>
-                <w:sz w:val="22"/>
-                <w:szCs w:val="22"/>
-              </w:rPr>
-              <w:t xml:space="preserve">Làm thêm giờ; OT × cấp bậc; OT × thâm niên; công tác; cân bằng CV–CS; khoảng cách</w:t>
+            <w:tcW w:w="1966" w:type="dxa"/>
+            <w:vAlign w:val="center"/>
+          </w:tcPr>
+          <w:p>
+            <w:pPr>
+              <w:spacing w:before="0" w:after="0" w:line="240" w:lineRule="auto"/>
+              <w:ind w:left="0" w:firstLine="0"/>
+              <w:jc w:val="left"/>
+            </w:pPr>
+            <w:r>
+              <w:rPr>
+                <w:rFonts w:ascii="Times New Roman" w:hAnsi="Times New Roman" w:cs="Times New Roman" w:eastAsia="Times New Roman"/>
+                <w:sz w:val="22"/>
+                <w:szCs w:val="22"/>
+              </w:rPr>
+              <w:t xml:space="preserve">Áp lực công việc tác động thế nào?</w:t>
+            </w:r>
+          </w:p>
+        </w:tc>
+        <w:tc>
+          <w:tcPr>
+            <w:tcW w:w="3182" w:type="dxa"/>
+            <w:vAlign w:val="center"/>
+          </w:tcPr>
+          <w:p>
+            <w:pPr>
+              <w:spacing w:before="0" w:after="0" w:line="240" w:lineRule="auto"/>
+              <w:ind w:left="0" w:firstLine="0"/>
+              <w:jc w:val="left"/>
+            </w:pPr>
+            <w:r>
+              <w:rPr>
+                <w:rFonts w:ascii="Times New Roman" w:hAnsi="Times New Roman" w:cs="Times New Roman" w:eastAsia="Times New Roman"/>
+                <w:sz w:val="22"/>
+                <w:szCs w:val="22"/>
+              </w:rPr>
+              <w:t xml:space="preserve">OT; OT × cấp bậc; OT × thâm niên; công tác; CV–CS; khoảng cách</w:t>
             </w:r>
           </w:p>
         </w:tc>
@@ -10097,7 +9230,7 @@
                 <w:sz w:val="22"/>
                 <w:szCs w:val="22"/>
               </w:rPr>
-              <w:t xml:space="preserve">Làm thêm giờ là yếu tố nguy hiểm nhất – nhất là với người mới</w:t>
+              <w:t xml:space="preserve">Làm thêm giờ là yếu tố nguy hiểm nhất</w:t>
             </w:r>
           </w:p>
         </w:tc>
@@ -10108,28 +9241,28 @@
         </w:trPr>
         <w:tc>
           <w:tcPr>
-            <w:tcW w:w="1404" w:type="dxa"/>
-            <w:vAlign w:val="center"/>
-          </w:tcPr>
-          <w:p>
-            <w:pPr>
-              <w:spacing w:before="0" w:after="0" w:line="240" w:lineRule="auto"/>
-              <w:ind w:left="0" w:firstLine="0"/>
-              <w:jc w:val="left"/>
-            </w:pPr>
-            <w:r>
-              <w:rPr>
-                <w:rFonts w:ascii="Times New Roman" w:hAnsi="Times New Roman" w:cs="Times New Roman" w:eastAsia="Times New Roman"/>
-                <w:sz w:val="22"/>
-                <w:szCs w:val="22"/>
-              </w:rPr>
-              <w:t xml:space="preserve">4. Lương &amp; đãi ngộ</w:t>
-            </w:r>
-          </w:p>
-        </w:tc>
-        <w:tc>
-          <w:tcPr>
-            <w:tcW w:w="1872" w:type="dxa"/>
+            <w:tcW w:w="1591" w:type="dxa"/>
+            <w:vAlign w:val="center"/>
+          </w:tcPr>
+          <w:p>
+            <w:pPr>
+              <w:spacing w:before="0" w:after="0" w:line="240" w:lineRule="auto"/>
+              <w:ind w:left="0" w:firstLine="0"/>
+              <w:jc w:val="left"/>
+            </w:pPr>
+            <w:r>
+              <w:rPr>
+                <w:rFonts w:ascii="Times New Roman" w:hAnsi="Times New Roman" w:cs="Times New Roman" w:eastAsia="Times New Roman"/>
+                <w:sz w:val="22"/>
+                <w:szCs w:val="22"/>
+              </w:rPr>
+              <w:t xml:space="preserve">4. Lương và đãi ngộ</w:t>
+            </w:r>
+          </w:p>
+        </w:tc>
+        <w:tc>
+          <w:tcPr>
+            <w:tcW w:w="1966" w:type="dxa"/>
             <w:vAlign w:val="center"/>
           </w:tcPr>
           <w:p>
@@ -10150,22 +9283,22 @@
         </w:tc>
         <w:tc>
           <w:tcPr>
-            <w:tcW w:w="3463" w:type="dxa"/>
-            <w:vAlign w:val="center"/>
-          </w:tcPr>
-          <w:p>
-            <w:pPr>
-              <w:spacing w:before="0" w:after="0" w:line="240" w:lineRule="auto"/>
-              <w:ind w:left="0" w:firstLine="0"/>
-              <w:jc w:val="left"/>
-            </w:pPr>
-            <w:r>
-              <w:rPr>
-                <w:rFonts w:ascii="Times New Roman" w:hAnsi="Times New Roman" w:cs="Times New Roman" w:eastAsia="Times New Roman"/>
-                <w:sz w:val="22"/>
-                <w:szCs w:val="22"/>
-              </w:rPr>
-              <w:t xml:space="preserve">Thu nhập trong Level 1; cổ phiếu; cổ phiếu × hôn nhân; trung vị lương theo cấp; trả thấp hơn cùng cấp; hiệu suất</w:t>
+            <w:tcW w:w="3182" w:type="dxa"/>
+            <w:vAlign w:val="center"/>
+          </w:tcPr>
+          <w:p>
+            <w:pPr>
+              <w:spacing w:before="0" w:after="0" w:line="240" w:lineRule="auto"/>
+              <w:ind w:left="0" w:firstLine="0"/>
+              <w:jc w:val="left"/>
+            </w:pPr>
+            <w:r>
+              <w:rPr>
+                <w:rFonts w:ascii="Times New Roman" w:hAnsi="Times New Roman" w:cs="Times New Roman" w:eastAsia="Times New Roman"/>
+                <w:sz w:val="22"/>
+                <w:szCs w:val="22"/>
+              </w:rPr>
+              <w:t xml:space="preserve">Thu nhập trong Level 1; cổ phiếu (× hôn nhân); trả thấp hơn cùng cấp; hiệu suất</w:t>
             </w:r>
           </w:p>
         </w:tc>
@@ -10186,7 +9319,7 @@
                 <w:sz w:val="22"/>
                 <w:szCs w:val="22"/>
               </w:rPr>
-              <w:t xml:space="preserve">Tiền có quan trọng – nhưng không theo cách nhiều người nghĩ</w:t>
+              <w:t xml:space="preserve">Tiền quan trọng – nhưng không theo cách nhiều người nghĩ</w:t>
             </w:r>
           </w:p>
         </w:tc>
@@ -10197,28 +9330,28 @@
         </w:trPr>
         <w:tc>
           <w:tcPr>
-            <w:tcW w:w="1404" w:type="dxa"/>
-            <w:vAlign w:val="center"/>
-          </w:tcPr>
-          <w:p>
-            <w:pPr>
-              <w:spacing w:before="0" w:after="0" w:line="240" w:lineRule="auto"/>
-              <w:ind w:left="0" w:firstLine="0"/>
-              <w:jc w:val="left"/>
-            </w:pPr>
-            <w:r>
-              <w:rPr>
-                <w:rFonts w:ascii="Times New Roman" w:hAnsi="Times New Roman" w:cs="Times New Roman" w:eastAsia="Times New Roman"/>
-                <w:sz w:val="22"/>
-                <w:szCs w:val="22"/>
-              </w:rPr>
-              <w:t xml:space="preserve">5. Hài lòng &amp; gắn kết</w:t>
-            </w:r>
-          </w:p>
-        </w:tc>
-        <w:tc>
-          <w:tcPr>
-            <w:tcW w:w="1872" w:type="dxa"/>
+            <w:tcW w:w="1591" w:type="dxa"/>
+            <w:vAlign w:val="center"/>
+          </w:tcPr>
+          <w:p>
+            <w:pPr>
+              <w:spacing w:before="0" w:after="0" w:line="240" w:lineRule="auto"/>
+              <w:ind w:left="0" w:firstLine="0"/>
+              <w:jc w:val="left"/>
+            </w:pPr>
+            <w:r>
+              <w:rPr>
+                <w:rFonts w:ascii="Times New Roman" w:hAnsi="Times New Roman" w:cs="Times New Roman" w:eastAsia="Times New Roman"/>
+                <w:sz w:val="22"/>
+                <w:szCs w:val="22"/>
+              </w:rPr>
+              <w:t xml:space="preserve">5. Hài lòng và gắn kết</w:t>
+            </w:r>
+          </w:p>
+        </w:tc>
+        <w:tc>
+          <w:tcPr>
+            <w:tcW w:w="1966" w:type="dxa"/>
             <w:vAlign w:val="center"/>
           </w:tcPr>
           <w:p>
@@ -10239,22 +9372,22 @@
         </w:tc>
         <w:tc>
           <w:tcPr>
-            <w:tcW w:w="3463" w:type="dxa"/>
-            <w:vAlign w:val="center"/>
-          </w:tcPr>
-          <w:p>
-            <w:pPr>
-              <w:spacing w:before="0" w:after="0" w:line="240" w:lineRule="auto"/>
-              <w:ind w:left="0" w:firstLine="0"/>
-              <w:jc w:val="left"/>
-            </w:pPr>
-            <w:r>
-              <w:rPr>
-                <w:rFonts w:ascii="Times New Roman" w:hAnsi="Times New Roman" w:cs="Times New Roman" w:eastAsia="Times New Roman"/>
-                <w:sz w:val="22"/>
-                <w:szCs w:val="22"/>
-              </w:rPr>
-              <w:t xml:space="preserve">5 thang đo trên một biểu đồ (Satisfaction_Long); số thang Thấp; đổi quản lý; thăng chức; đào tạo</w:t>
+            <w:tcW w:w="3182" w:type="dxa"/>
+            <w:vAlign w:val="center"/>
+          </w:tcPr>
+          <w:p>
+            <w:pPr>
+              <w:spacing w:before="0" w:after="0" w:line="240" w:lineRule="auto"/>
+              <w:ind w:left="0" w:firstLine="0"/>
+              <w:jc w:val="left"/>
+            </w:pPr>
+            <w:r>
+              <w:rPr>
+                <w:rFonts w:ascii="Times New Roman" w:hAnsi="Times New Roman" w:cs="Times New Roman" w:eastAsia="Times New Roman"/>
+                <w:sz w:val="22"/>
+                <w:szCs w:val="22"/>
+              </w:rPr>
+              <w:t xml:space="preserve">5 thang đo; số thang Thấp; đổi quản lý; thăng chức; đào tạo</w:t>
             </w:r>
           </w:p>
         </w:tc>
@@ -10275,7 +9408,7 @@
                 <w:sz w:val="22"/>
                 <w:szCs w:val="22"/>
               </w:rPr>
-              <w:t xml:space="preserve">Đổi quản lý làm tỷ lệ nghỉ tăng gần gấp đôi; chậm thăng chức cũng đẩy người đi</w:t>
+              <w:t xml:space="preserve">Đổi quản lý làm tỷ lệ nghỉ tăng gần gấp đôi</w:t>
             </w:r>
           </w:p>
         </w:tc>
@@ -10286,64 +9419,64 @@
         </w:trPr>
         <w:tc>
           <w:tcPr>
-            <w:tcW w:w="1404" w:type="dxa"/>
-            <w:vAlign w:val="center"/>
-          </w:tcPr>
-          <w:p>
-            <w:pPr>
-              <w:spacing w:before="0" w:after="0" w:line="240" w:lineRule="auto"/>
-              <w:ind w:left="0" w:firstLine="0"/>
-              <w:jc w:val="left"/>
-            </w:pPr>
-            <w:r>
-              <w:rPr>
-                <w:rFonts w:ascii="Times New Roman" w:hAnsi="Times New Roman" w:cs="Times New Roman" w:eastAsia="Times New Roman"/>
-                <w:sz w:val="22"/>
-                <w:szCs w:val="22"/>
-              </w:rPr>
-              <w:t xml:space="preserve">6. Rủi ro &amp; hành động</w:t>
-            </w:r>
-          </w:p>
-        </w:tc>
-        <w:tc>
-          <w:tcPr>
-            <w:tcW w:w="1872" w:type="dxa"/>
-            <w:vAlign w:val="center"/>
-          </w:tcPr>
-          <w:p>
-            <w:pPr>
-              <w:spacing w:before="0" w:after="0" w:line="240" w:lineRule="auto"/>
-              <w:ind w:left="0" w:firstLine="0"/>
-              <w:jc w:val="left"/>
-            </w:pPr>
-            <w:r>
-              <w:rPr>
-                <w:rFonts w:ascii="Times New Roman" w:hAnsi="Times New Roman" w:cs="Times New Roman" w:eastAsia="Times New Roman"/>
-                <w:sz w:val="22"/>
-                <w:szCs w:val="22"/>
-              </w:rPr>
-              <w:t xml:space="preserve">Làm gì, cho ai, tiết kiệm bao nhiêu?</w:t>
-            </w:r>
-          </w:p>
-        </w:tc>
-        <w:tc>
-          <w:tcPr>
-            <w:tcW w:w="3463" w:type="dxa"/>
-            <w:vAlign w:val="center"/>
-          </w:tcPr>
-          <w:p>
-            <w:pPr>
-              <w:spacing w:before="0" w:after="0" w:line="240" w:lineRule="auto"/>
-              <w:ind w:left="0" w:firstLine="0"/>
-              <w:jc w:val="left"/>
-            </w:pPr>
-            <w:r>
-              <w:rPr>
-                <w:rFonts w:ascii="Times New Roman" w:hAnsi="Times New Roman" w:cs="Times New Roman" w:eastAsia="Times New Roman"/>
-                <w:sz w:val="22"/>
-                <w:szCs w:val="22"/>
-              </w:rPr>
-              <w:t xml:space="preserve">5 thẻ KPI mô phỏng; tỷ lệ nghỉ theo nhóm rủi ro; biểu đồ đòn bẩy (hệ số rủi ro 16 yếu tố); slicer chi phí thay thế; kế hoạch hành động</w:t>
+            <w:tcW w:w="1591" w:type="dxa"/>
+            <w:vAlign w:val="center"/>
+          </w:tcPr>
+          <w:p>
+            <w:pPr>
+              <w:spacing w:before="0" w:after="0" w:line="240" w:lineRule="auto"/>
+              <w:ind w:left="0" w:firstLine="0"/>
+              <w:jc w:val="left"/>
+            </w:pPr>
+            <w:r>
+              <w:rPr>
+                <w:rFonts w:ascii="Times New Roman" w:hAnsi="Times New Roman" w:cs="Times New Roman" w:eastAsia="Times New Roman"/>
+                <w:sz w:val="22"/>
+                <w:szCs w:val="22"/>
+              </w:rPr>
+              <w:t xml:space="preserve">6. Rủi ro và hành động</w:t>
+            </w:r>
+          </w:p>
+        </w:tc>
+        <w:tc>
+          <w:tcPr>
+            <w:tcW w:w="1966" w:type="dxa"/>
+            <w:vAlign w:val="center"/>
+          </w:tcPr>
+          <w:p>
+            <w:pPr>
+              <w:spacing w:before="0" w:after="0" w:line="240" w:lineRule="auto"/>
+              <w:ind w:left="0" w:firstLine="0"/>
+              <w:jc w:val="left"/>
+            </w:pPr>
+            <w:r>
+              <w:rPr>
+                <w:rFonts w:ascii="Times New Roman" w:hAnsi="Times New Roman" w:cs="Times New Roman" w:eastAsia="Times New Roman"/>
+                <w:sz w:val="22"/>
+                <w:szCs w:val="22"/>
+              </w:rPr>
+              <w:t xml:space="preserve">Làm gì, cho ai?</w:t>
+            </w:r>
+          </w:p>
+        </w:tc>
+        <w:tc>
+          <w:tcPr>
+            <w:tcW w:w="3182" w:type="dxa"/>
+            <w:vAlign w:val="center"/>
+          </w:tcPr>
+          <w:p>
+            <w:pPr>
+              <w:spacing w:before="0" w:after="0" w:line="240" w:lineRule="auto"/>
+              <w:ind w:left="0" w:firstLine="0"/>
+              <w:jc w:val="left"/>
+            </w:pPr>
+            <w:r>
+              <w:rPr>
+                <w:rFonts w:ascii="Times New Roman" w:hAnsi="Times New Roman" w:cs="Times New Roman" w:eastAsia="Times New Roman"/>
+                <w:sz w:val="22"/>
+                <w:szCs w:val="22"/>
+              </w:rPr>
+              <w:t xml:space="preserve">5 KPI mô phỏng; nhóm rủi ro; hệ số rủi ro 16 yếu tố; kế hoạch hành động</w:t>
             </w:r>
           </w:p>
         </w:tc>
@@ -10364,7 +9497,7 @@
                 <w:sz w:val="22"/>
                 <w:szCs w:val="22"/>
               </w:rPr>
-              <w:t xml:space="preserve">Giới hạn làm thêm giờ có thể giảm tới ~1/3 số ca nghỉ</w:t>
+              <w:t xml:space="preserve">Giới hạn OT có thể giảm ~1/3 ca nghỉ</w:t>
             </w:r>
           </w:p>
         </w:tc>
@@ -10385,602 +9518,6 @@
           <w:szCs w:val="22"/>
         </w:rPr>
         <w:t xml:space="preserve">Nguồn: Nhóm tác giả tổng hợp.</w:t>
-      </w:r>
-    </w:p>
-    <w:p>
-      <w:pPr>
-        <w:spacing w:before="0" w:after="240" w:line="240" w:lineRule="auto"/>
-        <w:ind w:left="0" w:firstLine="720"/>
-        <w:jc w:val="both"/>
-      </w:pPr>
-      <w:r>
-        <w:rPr>
-          <w:rFonts w:ascii="Times New Roman" w:hAnsi="Times New Roman" w:cs="Times New Roman" w:eastAsia="Times New Roman"/>
-          <w:sz w:val="26"/>
-          <w:szCs w:val="26"/>
-        </w:rPr>
-        <w:t xml:space="preserve">Hình 4.1 đến Hình 4.6 là ảnh chụp sáu trang của dashboard Power BI, theo đúng thứ tự trong Bảng 4.1.</w:t>
-      </w:r>
-    </w:p>
-    <w:p>
-      <w:pPr>
-        <w:keepNext/>
-        <w:keepLines/>
-        <w:spacing w:before="0" w:after="120" w:line="240" w:lineRule="auto"/>
-        <w:ind w:left="0" w:firstLine="0"/>
-        <w:jc w:val="center"/>
-      </w:pPr>
-      <w:r>
-        <w:rPr>
-          <w:rFonts w:ascii="Times New Roman" w:hAnsi="Times New Roman" w:cs="Times New Roman" w:eastAsia="Times New Roman"/>
-          <w:b/>
-          <w:bCs/>
-          <w:sz w:val="24"/>
-          <w:szCs w:val="24"/>
-        </w:rPr>
-        <w:t xml:space="preserve">Hình 4.1.</w:t>
-      </w:r>
-      <w:r>
-        <w:rPr>
-          <w:rFonts w:ascii="Times New Roman" w:hAnsi="Times New Roman" w:cs="Times New Roman" w:eastAsia="Times New Roman"/>
-          <w:sz w:val="24"/>
-          <w:szCs w:val="24"/>
-        </w:rPr>
-        <w:t xml:space="preserve"> Dashboard Trang 1 – Tổng quan</w:t>
-      </w:r>
-    </w:p>
-    <w:tbl>
-      <w:tblPr>
-        <w:tblW w:w="9360" w:type="dxa"/>
-        <w:jc w:val="center"/>
-        <w:tblBorders>
-          <w:top w:val="dashed" w:sz="6" w:space="0" w:color="808080"/>
-          <w:left w:val="dashed" w:sz="6" w:space="0" w:color="808080"/>
-          <w:bottom w:val="dashed" w:sz="6" w:space="0" w:color="808080"/>
-          <w:right w:val="dashed" w:sz="6" w:space="0" w:color="808080"/>
-        </w:tblBorders>
-      </w:tblPr>
-      <w:tblGrid>
-        <w:gridCol w:w="9360"/>
-      </w:tblGrid>
-      <w:tr>
-        <w:trPr>
-          <w:trHeight w:val="3400" w:hRule="exact"/>
-        </w:trPr>
-        <w:tc>
-          <w:tcPr>
-            <w:tcW w:w="9360" w:type="dxa"/>
-            <w:vAlign w:val="center"/>
-          </w:tcPr>
-          <w:p>
-            <w:pPr>
-              <w:spacing w:before="0" w:after="0" w:line="240" w:lineRule="auto"/>
-              <w:ind w:left="0" w:firstLine="0"/>
-              <w:jc w:val="center"/>
-            </w:pPr>
-            <w:r>
-              <w:rPr>
-                <w:rFonts w:ascii="Times New Roman" w:hAnsi="Times New Roman" w:cs="Times New Roman" w:eastAsia="Times New Roman"/>
-                <w:i/>
-                <w:iCs/>
-                <w:color w:val="7F7F7F"/>
-                <w:sz w:val="24"/>
-                <w:szCs w:val="24"/>
-              </w:rPr>
-              <w:t xml:space="preserve">[Chèn ảnh chụp Trang 1 – Tổng quan từ file Power BI (.pbix) vào đây]</w:t>
-            </w:r>
-          </w:p>
-        </w:tc>
-      </w:tr>
-    </w:tbl>
-    <w:p>
-      <w:pPr>
-        <w:spacing w:before="0" w:after="240" w:line="240" w:lineRule="auto"/>
-        <w:ind w:left="0" w:firstLine="0"/>
-        <w:jc w:val="left"/>
-      </w:pPr>
-      <w:r>
-        <w:rPr>
-          <w:rFonts w:ascii="Times New Roman" w:hAnsi="Times New Roman" w:cs="Times New Roman" w:eastAsia="Times New Roman"/>
-          <w:i/>
-          <w:iCs/>
-          <w:sz w:val="22"/>
-          <w:szCs w:val="22"/>
-        </w:rPr>
-        <w:t xml:space="preserve">Nguồn: Dashboard Power BI của nhóm.</w:t>
-      </w:r>
-    </w:p>
-    <w:p>
-      <w:pPr>
-        <w:keepNext/>
-        <w:keepLines/>
-        <w:spacing w:before="0" w:after="120" w:line="240" w:lineRule="auto"/>
-        <w:ind w:left="0" w:firstLine="0"/>
-        <w:jc w:val="center"/>
-      </w:pPr>
-      <w:r>
-        <w:rPr>
-          <w:rFonts w:ascii="Times New Roman" w:hAnsi="Times New Roman" w:cs="Times New Roman" w:eastAsia="Times New Roman"/>
-          <w:b/>
-          <w:bCs/>
-          <w:sz w:val="24"/>
-          <w:szCs w:val="24"/>
-        </w:rPr>
-        <w:t xml:space="preserve">Hình 4.2.</w:t>
-      </w:r>
-      <w:r>
-        <w:rPr>
-          <w:rFonts w:ascii="Times New Roman" w:hAnsi="Times New Roman" w:cs="Times New Roman" w:eastAsia="Times New Roman"/>
-          <w:sz w:val="24"/>
-          <w:szCs w:val="24"/>
-        </w:rPr>
-        <w:t xml:space="preserve"> Dashboard Trang 2 – Chân dung người nghỉ việc</w:t>
-      </w:r>
-    </w:p>
-    <w:tbl>
-      <w:tblPr>
-        <w:tblW w:w="9360" w:type="dxa"/>
-        <w:jc w:val="center"/>
-        <w:tblBorders>
-          <w:top w:val="dashed" w:sz="6" w:space="0" w:color="808080"/>
-          <w:left w:val="dashed" w:sz="6" w:space="0" w:color="808080"/>
-          <w:bottom w:val="dashed" w:sz="6" w:space="0" w:color="808080"/>
-          <w:right w:val="dashed" w:sz="6" w:space="0" w:color="808080"/>
-        </w:tblBorders>
-      </w:tblPr>
-      <w:tblGrid>
-        <w:gridCol w:w="9360"/>
-      </w:tblGrid>
-      <w:tr>
-        <w:trPr>
-          <w:trHeight w:val="3400" w:hRule="exact"/>
-        </w:trPr>
-        <w:tc>
-          <w:tcPr>
-            <w:tcW w:w="9360" w:type="dxa"/>
-            <w:vAlign w:val="center"/>
-          </w:tcPr>
-          <w:p>
-            <w:pPr>
-              <w:spacing w:before="0" w:after="0" w:line="240" w:lineRule="auto"/>
-              <w:ind w:left="0" w:firstLine="0"/>
-              <w:jc w:val="center"/>
-            </w:pPr>
-            <w:r>
-              <w:rPr>
-                <w:rFonts w:ascii="Times New Roman" w:hAnsi="Times New Roman" w:cs="Times New Roman" w:eastAsia="Times New Roman"/>
-                <w:i/>
-                <w:iCs/>
-                <w:color w:val="7F7F7F"/>
-                <w:sz w:val="24"/>
-                <w:szCs w:val="24"/>
-              </w:rPr>
-              <w:t xml:space="preserve">[Chèn ảnh chụp Trang 2 – Chân dung người nghỉ việc từ file Power BI (.pbix) vào đây]</w:t>
-            </w:r>
-          </w:p>
-        </w:tc>
-      </w:tr>
-    </w:tbl>
-    <w:p>
-      <w:pPr>
-        <w:spacing w:before="0" w:after="240" w:line="240" w:lineRule="auto"/>
-        <w:ind w:left="0" w:firstLine="0"/>
-        <w:jc w:val="left"/>
-      </w:pPr>
-      <w:r>
-        <w:rPr>
-          <w:rFonts w:ascii="Times New Roman" w:hAnsi="Times New Roman" w:cs="Times New Roman" w:eastAsia="Times New Roman"/>
-          <w:i/>
-          <w:iCs/>
-          <w:sz w:val="22"/>
-          <w:szCs w:val="22"/>
-        </w:rPr>
-        <w:t xml:space="preserve">Nguồn: Dashboard Power BI của nhóm.</w:t>
-      </w:r>
-    </w:p>
-    <w:p>
-      <w:pPr>
-        <w:keepNext/>
-        <w:keepLines/>
-        <w:spacing w:before="0" w:after="120" w:line="240" w:lineRule="auto"/>
-        <w:ind w:left="0" w:firstLine="0"/>
-        <w:jc w:val="center"/>
-      </w:pPr>
-      <w:r>
-        <w:rPr>
-          <w:rFonts w:ascii="Times New Roman" w:hAnsi="Times New Roman" w:cs="Times New Roman" w:eastAsia="Times New Roman"/>
-          <w:b/>
-          <w:bCs/>
-          <w:sz w:val="24"/>
-          <w:szCs w:val="24"/>
-        </w:rPr>
-        <w:t xml:space="preserve">Hình 4.3.</w:t>
-      </w:r>
-      <w:r>
-        <w:rPr>
-          <w:rFonts w:ascii="Times New Roman" w:hAnsi="Times New Roman" w:cs="Times New Roman" w:eastAsia="Times New Roman"/>
-          <w:sz w:val="24"/>
-          <w:szCs w:val="24"/>
-        </w:rPr>
-        <w:t xml:space="preserve"> Dashboard Trang 3 – Điều kiện làm việc</w:t>
-      </w:r>
-    </w:p>
-    <w:tbl>
-      <w:tblPr>
-        <w:tblW w:w="9360" w:type="dxa"/>
-        <w:jc w:val="center"/>
-        <w:tblBorders>
-          <w:top w:val="dashed" w:sz="6" w:space="0" w:color="808080"/>
-          <w:left w:val="dashed" w:sz="6" w:space="0" w:color="808080"/>
-          <w:bottom w:val="dashed" w:sz="6" w:space="0" w:color="808080"/>
-          <w:right w:val="dashed" w:sz="6" w:space="0" w:color="808080"/>
-        </w:tblBorders>
-      </w:tblPr>
-      <w:tblGrid>
-        <w:gridCol w:w="9360"/>
-      </w:tblGrid>
-      <w:tr>
-        <w:trPr>
-          <w:trHeight w:val="3400" w:hRule="exact"/>
-        </w:trPr>
-        <w:tc>
-          <w:tcPr>
-            <w:tcW w:w="9360" w:type="dxa"/>
-            <w:vAlign w:val="center"/>
-          </w:tcPr>
-          <w:p>
-            <w:pPr>
-              <w:spacing w:before="0" w:after="0" w:line="240" w:lineRule="auto"/>
-              <w:ind w:left="0" w:firstLine="0"/>
-              <w:jc w:val="center"/>
-            </w:pPr>
-            <w:r>
-              <w:rPr>
-                <w:rFonts w:ascii="Times New Roman" w:hAnsi="Times New Roman" w:cs="Times New Roman" w:eastAsia="Times New Roman"/>
-                <w:i/>
-                <w:iCs/>
-                <w:color w:val="7F7F7F"/>
-                <w:sz w:val="24"/>
-                <w:szCs w:val="24"/>
-              </w:rPr>
-              <w:t xml:space="preserve">[Chèn ảnh chụp Trang 3 – Điều kiện làm việc từ file Power BI (.pbix) vào đây]</w:t>
-            </w:r>
-          </w:p>
-        </w:tc>
-      </w:tr>
-    </w:tbl>
-    <w:p>
-      <w:pPr>
-        <w:spacing w:before="0" w:after="240" w:line="240" w:lineRule="auto"/>
-        <w:ind w:left="0" w:firstLine="0"/>
-        <w:jc w:val="left"/>
-      </w:pPr>
-      <w:r>
-        <w:rPr>
-          <w:rFonts w:ascii="Times New Roman" w:hAnsi="Times New Roman" w:cs="Times New Roman" w:eastAsia="Times New Roman"/>
-          <w:i/>
-          <w:iCs/>
-          <w:sz w:val="22"/>
-          <w:szCs w:val="22"/>
-        </w:rPr>
-        <w:t xml:space="preserve">Nguồn: Dashboard Power BI của nhóm.</w:t>
-      </w:r>
-    </w:p>
-    <w:p>
-      <w:pPr>
-        <w:keepNext/>
-        <w:keepLines/>
-        <w:spacing w:before="0" w:after="120" w:line="240" w:lineRule="auto"/>
-        <w:ind w:left="0" w:firstLine="0"/>
-        <w:jc w:val="center"/>
-      </w:pPr>
-      <w:r>
-        <w:rPr>
-          <w:rFonts w:ascii="Times New Roman" w:hAnsi="Times New Roman" w:cs="Times New Roman" w:eastAsia="Times New Roman"/>
-          <w:b/>
-          <w:bCs/>
-          <w:sz w:val="24"/>
-          <w:szCs w:val="24"/>
-        </w:rPr>
-        <w:t xml:space="preserve">Hình 4.4.</w:t>
-      </w:r>
-      <w:r>
-        <w:rPr>
-          <w:rFonts w:ascii="Times New Roman" w:hAnsi="Times New Roman" w:cs="Times New Roman" w:eastAsia="Times New Roman"/>
-          <w:sz w:val="24"/>
-          <w:szCs w:val="24"/>
-        </w:rPr>
-        <w:t xml:space="preserve"> Dashboard Trang 4 – Lương và đãi ngộ</w:t>
-      </w:r>
-    </w:p>
-    <w:tbl>
-      <w:tblPr>
-        <w:tblW w:w="9360" w:type="dxa"/>
-        <w:jc w:val="center"/>
-        <w:tblBorders>
-          <w:top w:val="dashed" w:sz="6" w:space="0" w:color="808080"/>
-          <w:left w:val="dashed" w:sz="6" w:space="0" w:color="808080"/>
-          <w:bottom w:val="dashed" w:sz="6" w:space="0" w:color="808080"/>
-          <w:right w:val="dashed" w:sz="6" w:space="0" w:color="808080"/>
-        </w:tblBorders>
-      </w:tblPr>
-      <w:tblGrid>
-        <w:gridCol w:w="9360"/>
-      </w:tblGrid>
-      <w:tr>
-        <w:trPr>
-          <w:trHeight w:val="3400" w:hRule="exact"/>
-        </w:trPr>
-        <w:tc>
-          <w:tcPr>
-            <w:tcW w:w="9360" w:type="dxa"/>
-            <w:vAlign w:val="center"/>
-          </w:tcPr>
-          <w:p>
-            <w:pPr>
-              <w:spacing w:before="0" w:after="0" w:line="240" w:lineRule="auto"/>
-              <w:ind w:left="0" w:firstLine="0"/>
-              <w:jc w:val="center"/>
-            </w:pPr>
-            <w:r>
-              <w:rPr>
-                <w:rFonts w:ascii="Times New Roman" w:hAnsi="Times New Roman" w:cs="Times New Roman" w:eastAsia="Times New Roman"/>
-                <w:i/>
-                <w:iCs/>
-                <w:color w:val="7F7F7F"/>
-                <w:sz w:val="24"/>
-                <w:szCs w:val="24"/>
-              </w:rPr>
-              <w:t xml:space="preserve">[Chèn ảnh chụp Trang 4 – Lương và đãi ngộ từ file Power BI (.pbix) vào đây]</w:t>
-            </w:r>
-          </w:p>
-        </w:tc>
-      </w:tr>
-    </w:tbl>
-    <w:p>
-      <w:pPr>
-        <w:spacing w:before="0" w:after="240" w:line="240" w:lineRule="auto"/>
-        <w:ind w:left="0" w:firstLine="0"/>
-        <w:jc w:val="left"/>
-      </w:pPr>
-      <w:r>
-        <w:rPr>
-          <w:rFonts w:ascii="Times New Roman" w:hAnsi="Times New Roman" w:cs="Times New Roman" w:eastAsia="Times New Roman"/>
-          <w:i/>
-          <w:iCs/>
-          <w:sz w:val="22"/>
-          <w:szCs w:val="22"/>
-        </w:rPr>
-        <w:t xml:space="preserve">Nguồn: Dashboard Power BI của nhóm.</w:t>
-      </w:r>
-    </w:p>
-    <w:p>
-      <w:pPr>
-        <w:keepNext/>
-        <w:keepLines/>
-        <w:spacing w:before="0" w:after="120" w:line="240" w:lineRule="auto"/>
-        <w:ind w:left="0" w:firstLine="0"/>
-        <w:jc w:val="center"/>
-      </w:pPr>
-      <w:r>
-        <w:rPr>
-          <w:rFonts w:ascii="Times New Roman" w:hAnsi="Times New Roman" w:cs="Times New Roman" w:eastAsia="Times New Roman"/>
-          <w:b/>
-          <w:bCs/>
-          <w:sz w:val="24"/>
-          <w:szCs w:val="24"/>
-        </w:rPr>
-        <w:t xml:space="preserve">Hình 4.5.</w:t>
-      </w:r>
-      <w:r>
-        <w:rPr>
-          <w:rFonts w:ascii="Times New Roman" w:hAnsi="Times New Roman" w:cs="Times New Roman" w:eastAsia="Times New Roman"/>
-          <w:sz w:val="24"/>
-          <w:szCs w:val="24"/>
-        </w:rPr>
-        <w:t xml:space="preserve"> Dashboard Trang 5 – Hài lòng và gắn kết</w:t>
-      </w:r>
-    </w:p>
-    <w:tbl>
-      <w:tblPr>
-        <w:tblW w:w="9360" w:type="dxa"/>
-        <w:jc w:val="center"/>
-        <w:tblBorders>
-          <w:top w:val="dashed" w:sz="6" w:space="0" w:color="808080"/>
-          <w:left w:val="dashed" w:sz="6" w:space="0" w:color="808080"/>
-          <w:bottom w:val="dashed" w:sz="6" w:space="0" w:color="808080"/>
-          <w:right w:val="dashed" w:sz="6" w:space="0" w:color="808080"/>
-        </w:tblBorders>
-      </w:tblPr>
-      <w:tblGrid>
-        <w:gridCol w:w="9360"/>
-      </w:tblGrid>
-      <w:tr>
-        <w:trPr>
-          <w:trHeight w:val="3400" w:hRule="exact"/>
-        </w:trPr>
-        <w:tc>
-          <w:tcPr>
-            <w:tcW w:w="9360" w:type="dxa"/>
-            <w:vAlign w:val="center"/>
-          </w:tcPr>
-          <w:p>
-            <w:pPr>
-              <w:spacing w:before="0" w:after="0" w:line="240" w:lineRule="auto"/>
-              <w:ind w:left="0" w:firstLine="0"/>
-              <w:jc w:val="center"/>
-            </w:pPr>
-            <w:r>
-              <w:rPr>
-                <w:rFonts w:ascii="Times New Roman" w:hAnsi="Times New Roman" w:cs="Times New Roman" w:eastAsia="Times New Roman"/>
-                <w:i/>
-                <w:iCs/>
-                <w:color w:val="7F7F7F"/>
-                <w:sz w:val="24"/>
-                <w:szCs w:val="24"/>
-              </w:rPr>
-              <w:t xml:space="preserve">[Chèn ảnh chụp Trang 5 – Hài lòng và gắn kết từ file Power BI (.pbix) vào đây]</w:t>
-            </w:r>
-          </w:p>
-        </w:tc>
-      </w:tr>
-    </w:tbl>
-    <w:p>
-      <w:pPr>
-        <w:spacing w:before="0" w:after="240" w:line="240" w:lineRule="auto"/>
-        <w:ind w:left="0" w:firstLine="0"/>
-        <w:jc w:val="left"/>
-      </w:pPr>
-      <w:r>
-        <w:rPr>
-          <w:rFonts w:ascii="Times New Roman" w:hAnsi="Times New Roman" w:cs="Times New Roman" w:eastAsia="Times New Roman"/>
-          <w:i/>
-          <w:iCs/>
-          <w:sz w:val="22"/>
-          <w:szCs w:val="22"/>
-        </w:rPr>
-        <w:t xml:space="preserve">Nguồn: Dashboard Power BI của nhóm.</w:t>
-      </w:r>
-    </w:p>
-    <w:p>
-      <w:pPr>
-        <w:keepNext/>
-        <w:keepLines/>
-        <w:spacing w:before="0" w:after="120" w:line="240" w:lineRule="auto"/>
-        <w:ind w:left="0" w:firstLine="0"/>
-        <w:jc w:val="center"/>
-      </w:pPr>
-      <w:r>
-        <w:rPr>
-          <w:rFonts w:ascii="Times New Roman" w:hAnsi="Times New Roman" w:cs="Times New Roman" w:eastAsia="Times New Roman"/>
-          <w:b/>
-          <w:bCs/>
-          <w:sz w:val="24"/>
-          <w:szCs w:val="24"/>
-        </w:rPr>
-        <w:t xml:space="preserve">Hình 4.6.</w:t>
-      </w:r>
-      <w:r>
-        <w:rPr>
-          <w:rFonts w:ascii="Times New Roman" w:hAnsi="Times New Roman" w:cs="Times New Roman" w:eastAsia="Times New Roman"/>
-          <w:sz w:val="24"/>
-          <w:szCs w:val="24"/>
-        </w:rPr>
-        <w:t xml:space="preserve"> Dashboard Trang 6 – Rủi ro và hành động</w:t>
-      </w:r>
-    </w:p>
-    <w:tbl>
-      <w:tblPr>
-        <w:tblW w:w="9360" w:type="dxa"/>
-        <w:jc w:val="center"/>
-        <w:tblBorders>
-          <w:top w:val="dashed" w:sz="6" w:space="0" w:color="808080"/>
-          <w:left w:val="dashed" w:sz="6" w:space="0" w:color="808080"/>
-          <w:bottom w:val="dashed" w:sz="6" w:space="0" w:color="808080"/>
-          <w:right w:val="dashed" w:sz="6" w:space="0" w:color="808080"/>
-        </w:tblBorders>
-      </w:tblPr>
-      <w:tblGrid>
-        <w:gridCol w:w="9360"/>
-      </w:tblGrid>
-      <w:tr>
-        <w:trPr>
-          <w:trHeight w:val="3400" w:hRule="exact"/>
-        </w:trPr>
-        <w:tc>
-          <w:tcPr>
-            <w:tcW w:w="9360" w:type="dxa"/>
-            <w:vAlign w:val="center"/>
-          </w:tcPr>
-          <w:p>
-            <w:pPr>
-              <w:spacing w:before="0" w:after="0" w:line="240" w:lineRule="auto"/>
-              <w:ind w:left="0" w:firstLine="0"/>
-              <w:jc w:val="center"/>
-            </w:pPr>
-            <w:r>
-              <w:rPr>
-                <w:rFonts w:ascii="Times New Roman" w:hAnsi="Times New Roman" w:cs="Times New Roman" w:eastAsia="Times New Roman"/>
-                <w:i/>
-                <w:iCs/>
-                <w:color w:val="7F7F7F"/>
-                <w:sz w:val="24"/>
-                <w:szCs w:val="24"/>
-              </w:rPr>
-              <w:t xml:space="preserve">[Chèn ảnh chụp Trang 6 – Rủi ro và hành động từ file Power BI (.pbix) vào đây]</w:t>
-            </w:r>
-          </w:p>
-        </w:tc>
-      </w:tr>
-    </w:tbl>
-    <w:p>
-      <w:pPr>
-        <w:spacing w:before="0" w:after="240" w:line="240" w:lineRule="auto"/>
-        <w:ind w:left="0" w:firstLine="0"/>
-        <w:jc w:val="left"/>
-      </w:pPr>
-      <w:r>
-        <w:rPr>
-          <w:rFonts w:ascii="Times New Roman" w:hAnsi="Times New Roman" w:cs="Times New Roman" w:eastAsia="Times New Roman"/>
-          <w:i/>
-          <w:iCs/>
-          <w:sz w:val="22"/>
-          <w:szCs w:val="22"/>
-        </w:rPr>
-        <w:t xml:space="preserve">Nguồn: Dashboard Power BI của nhóm.</w:t>
-      </w:r>
-    </w:p>
-    <w:p>
-      <w:pPr>
-        <w:pStyle w:val="Heading2"/>
-        <w:keepNext/>
-        <w:keepLines/>
-        <w:spacing w:before="120" w:after="240" w:line="240" w:lineRule="auto"/>
-        <w:ind w:left="0" w:firstLine="0"/>
-        <w:jc w:val="left"/>
-      </w:pPr>
-      <w:r>
-        <w:rPr>
-          <w:rFonts w:ascii="Times New Roman" w:hAnsi="Times New Roman" w:cs="Times New Roman" w:eastAsia="Times New Roman"/>
-          <w:b/>
-          <w:bCs/>
-          <w:sz w:val="26"/>
-          <w:szCs w:val="26"/>
-        </w:rPr>
-        <w:t xml:space="preserve">4.3. Tương tác</w:t>
-      </w:r>
-    </w:p>
-    <w:p>
-      <w:pPr>
-        <w:spacing w:before="0" w:after="240" w:line="240" w:lineRule="auto"/>
-        <w:ind w:left="0" w:firstLine="720"/>
-        <w:jc w:val="both"/>
-      </w:pPr>
-      <w:r>
-        <w:rPr>
-          <w:rFonts w:ascii="Times New Roman" w:hAnsi="Times New Roman" w:cs="Times New Roman" w:eastAsia="Times New Roman"/>
-          <w:sz w:val="26"/>
-          <w:szCs w:val="26"/>
-        </w:rPr>
-        <w:t xml:space="preserve">Bản Power BI cho phép người dùng HR tự đặt câu hỏi phụ. Ví dụ: chọn Department = Sales và OverTime = Yes để xem nhóm này nghỉ bao nhiêu; kéo slicer </w:t>
-      </w:r>
-      <w:r>
-        <w:rPr>
-          <w:rFonts w:ascii="Times New Roman" w:hAnsi="Times New Roman" w:cs="Times New Roman" w:eastAsia="Times New Roman"/>
-          <w:i/>
-          <w:iCs/>
-          <w:sz w:val="26"/>
-          <w:szCs w:val="26"/>
-        </w:rPr>
-        <w:t xml:space="preserve">Replacement Cost</w:t>
-      </w:r>
-      <w:r>
-        <w:rPr>
-          <w:rFonts w:ascii="Times New Roman" w:hAnsi="Times New Roman" w:cs="Times New Roman" w:eastAsia="Times New Roman"/>
-          <w:sz w:val="26"/>
-          <w:szCs w:val="26"/>
-        </w:rPr>
-        <w:t xml:space="preserve"> từ 25% lên 150% để thấy chi phí thay thế và khoản tiết kiệm thay đổi theo giả định. Các trang cùng kích thước 1280 × 720 và chế độ Fit to page để trình chiếu.</w:t>
       </w:r>
     </w:p>
     <w:p>
@@ -11106,7 +9643,7 @@
       <w:r>
         <w:drawing>
           <wp:inline>
-            <wp:extent cx="5760720" cy="2728762"/>
+            <wp:extent cx="4937760" cy="2338939"/>
             <wp:docPr id="3" name="Picture 3"/>
             <wp:cNvGraphicFramePr>
               <a:graphicFrameLocks noChangeAspect="1"/>
@@ -11127,7 +9664,7 @@
                   <pic:spPr>
                     <a:xfrm>
                       <a:off x="0" y="0"/>
-                      <a:ext cx="5760720" cy="2728762"/>
+                      <a:ext cx="4937760" cy="2338939"/>
                     </a:xfrm>
                     <a:prstGeom prst="rect"/>
                   </pic:spPr>
@@ -12168,7 +10705,7 @@
       <w:r>
         <w:drawing>
           <wp:inline>
-            <wp:extent cx="5760720" cy="2546845"/>
+            <wp:extent cx="4937760" cy="2183010"/>
             <wp:docPr id="4" name="Picture 4"/>
             <wp:cNvGraphicFramePr>
               <a:graphicFrameLocks noChangeAspect="1"/>
@@ -12189,7 +10726,7 @@
                   <pic:spPr>
                     <a:xfrm>
                       <a:off x="0" y="0"/>
-                      <a:ext cx="5760720" cy="2546845"/>
+                      <a:ext cx="4937760" cy="2183010"/>
                     </a:xfrm>
                     <a:prstGeom prst="rect"/>
                   </pic:spPr>
@@ -12784,44 +11321,6 @@
           <w:szCs w:val="26"/>
         </w:rPr>
         <w:t xml:space="preserve"> điểm 3 và 4 có tỷ lệ nghỉ gần như bằng nhau (16,1% và 16,4%). Thang hiệu suất chỉ có 2 mức nên không phân biệt được người giỏi rời đi.</w:t>
-      </w:r>
-    </w:p>
-    <w:p>
-      <w:pPr>
-        <w:tabs>
-          <w:tab w:val="left" w:leader="none" w:pos="1080"/>
-        </w:tabs>
-        <w:spacing w:before="0" w:after="240" w:line="240" w:lineRule="auto"/>
-        <w:ind w:left="1080" w:hanging="360"/>
-        <w:jc w:val="both"/>
-      </w:pPr>
-      <w:r>
-        <w:rPr>
-          <w:rFonts w:ascii="Times New Roman" w:hAnsi="Times New Roman" w:cs="Times New Roman" w:eastAsia="Times New Roman"/>
-          <w:sz w:val="26"/>
-          <w:szCs w:val="26"/>
-        </w:rPr>
-        <w:t xml:space="preserve">•</w:t>
-        <w:tab/>
-        <w:t xml:space="preserve"/>
-      </w:r>
-      <w:r>
-        <w:rPr>
-          <w:rFonts w:ascii="Times New Roman" w:hAnsi="Times New Roman" w:cs="Times New Roman" w:eastAsia="Times New Roman"/>
-          <w:b/>
-          <w:bCs/>
-          <w:sz w:val="26"/>
-          <w:szCs w:val="26"/>
-        </w:rPr>
-        <w:t xml:space="preserve">Tỷ lệ tăng lương (PercentSalaryHike):</w:t>
-      </w:r>
-      <w:r>
-        <w:rPr>
-          <w:rFonts w:ascii="Times New Roman" w:hAnsi="Times New Roman" w:cs="Times New Roman" w:eastAsia="Times New Roman"/>
-          <w:sz w:val="26"/>
-          <w:szCs w:val="26"/>
-        </w:rPr>
-        <w:t xml:space="preserve"> trung vị 14% ở cả hai nhóm, không khác biệt.</w:t>
       </w:r>
     </w:p>
     <w:p>
@@ -15655,7 +14154,7 @@
       <w:r>
         <w:drawing>
           <wp:inline>
-            <wp:extent cx="5760720" cy="5033050"/>
+            <wp:extent cx="3657600" cy="3195587"/>
             <wp:docPr id="5" name="Picture 5"/>
             <wp:cNvGraphicFramePr>
               <a:graphicFrameLocks noChangeAspect="1"/>
@@ -15676,7 +14175,7 @@
                   <pic:spPr>
                     <a:xfrm>
                       <a:off x="0" y="0"/>
-                      <a:ext cx="5760720" cy="5033050"/>
+                      <a:ext cx="3657600" cy="3195587"/>
                     </a:xfrm>
                     <a:prstGeom prst="rect"/>
                   </pic:spPr>
@@ -16347,7 +14846,7 @@
       <w:r>
         <w:drawing>
           <wp:inline>
-            <wp:extent cx="5760720" cy="3835427"/>
+            <wp:extent cx="4480560" cy="2983110"/>
             <wp:docPr id="6" name="Picture 6"/>
             <wp:cNvGraphicFramePr>
               <a:graphicFrameLocks noChangeAspect="1"/>
@@ -16368,7 +14867,7 @@
                   <pic:spPr>
                     <a:xfrm>
                       <a:off x="0" y="0"/>
-                      <a:ext cx="5760720" cy="3835427"/>
+                      <a:ext cx="4480560" cy="2983110"/>
                     </a:xfrm>
                     <a:prstGeom prst="rect"/>
                   </pic:spPr>
@@ -16394,21 +14893,6 @@
           <w:szCs w:val="22"/>
         </w:rPr>
         <w:t xml:space="preserve">Nguồn: Nhóm tác giả tính toán bằng Python (scikit-learn).</w:t>
-      </w:r>
-    </w:p>
-    <w:p>
-      <w:pPr>
-        <w:spacing w:before="0" w:after="240" w:line="240" w:lineRule="auto"/>
-        <w:ind w:left="0" w:firstLine="720"/>
-        <w:jc w:val="both"/>
-      </w:pPr>
-      <w:r>
-        <w:rPr>
-          <w:rFonts w:ascii="Times New Roman" w:hAnsi="Times New Roman" w:cs="Times New Roman" w:eastAsia="Times New Roman"/>
-          <w:sz w:val="26"/>
-          <w:szCs w:val="26"/>
-        </w:rPr>
-        <w:t xml:space="preserve">Cây đọc từ trái sang phải: mỗi nhánh là một câu hỏi có/không, mỗi lá là một nhóm nhân viên với tỷ lệ nghỉ thực tế. Ngưỡng 2.465 USD là điểm cắt do thuật toán chọn trên log thu nhập (e^7,81).</w:t>
       </w:r>
     </w:p>
     <w:p>
@@ -17761,137 +16245,7 @@
           <w:sz w:val="26"/>
           <w:szCs w:val="26"/>
         </w:rPr>
-        <w:t xml:space="preserve">HR có thể biến kết quả phân tích thành quy trình hàng quý:</w:t>
-      </w:r>
-    </w:p>
-    <w:p>
-      <w:pPr>
-        <w:tabs>
-          <w:tab w:val="left" w:leader="none" w:pos="1080"/>
-        </w:tabs>
-        <w:spacing w:before="0" w:after="120" w:line="240" w:lineRule="auto"/>
-        <w:ind w:left="1080" w:hanging="360"/>
-        <w:jc w:val="both"/>
-      </w:pPr>
-      <w:r>
-        <w:rPr>
-          <w:rFonts w:ascii="Times New Roman" w:hAnsi="Times New Roman" w:cs="Times New Roman" w:eastAsia="Times New Roman"/>
-          <w:sz w:val="26"/>
-          <w:szCs w:val="26"/>
-        </w:rPr>
-        <w:t xml:space="preserve">1.</w:t>
-        <w:tab/>
-        <w:t xml:space="preserve"/>
-      </w:r>
-      <w:r>
-        <w:rPr>
-          <w:rFonts w:ascii="Times New Roman" w:hAnsi="Times New Roman" w:cs="Times New Roman" w:eastAsia="Times New Roman"/>
-          <w:sz w:val="26"/>
-          <w:szCs w:val="26"/>
-        </w:rPr>
-        <w:t xml:space="preserve">Cập nhật dữ liệu nhân sự vào file Power BI, làm mới measure </w:t>
-      </w:r>
-      <w:r>
-        <w:rPr>
-          <w:rFonts w:ascii="Times New Roman" w:hAnsi="Times New Roman" w:cs="Times New Roman" w:eastAsia="Times New Roman"/>
-          <w:i/>
-          <w:iCs/>
-          <w:sz w:val="26"/>
-          <w:szCs w:val="26"/>
-        </w:rPr>
-        <w:t xml:space="preserve">NV hiện tại rủi ro cao</w:t>
-      </w:r>
-      <w:r>
-        <w:rPr>
-          <w:rFonts w:ascii="Times New Roman" w:hAnsi="Times New Roman" w:cs="Times New Roman" w:eastAsia="Times New Roman"/>
-          <w:sz w:val="26"/>
-          <w:szCs w:val="26"/>
-        </w:rPr>
-        <w:t xml:space="preserve">.</w:t>
-      </w:r>
-    </w:p>
-    <w:p>
-      <w:pPr>
-        <w:tabs>
-          <w:tab w:val="left" w:leader="none" w:pos="1080"/>
-        </w:tabs>
-        <w:spacing w:before="0" w:after="120" w:line="240" w:lineRule="auto"/>
-        <w:ind w:left="1080" w:hanging="360"/>
-        <w:jc w:val="both"/>
-      </w:pPr>
-      <w:r>
-        <w:rPr>
-          <w:rFonts w:ascii="Times New Roman" w:hAnsi="Times New Roman" w:cs="Times New Roman" w:eastAsia="Times New Roman"/>
-          <w:sz w:val="26"/>
-          <w:szCs w:val="26"/>
-        </w:rPr>
-        <w:t xml:space="preserve">2.</w:t>
-        <w:tab/>
-        <w:t xml:space="preserve"/>
-      </w:r>
-      <w:r>
-        <w:rPr>
-          <w:rFonts w:ascii="Times New Roman" w:hAnsi="Times New Roman" w:cs="Times New Roman" w:eastAsia="Times New Roman"/>
-          <w:sz w:val="26"/>
-          <w:szCs w:val="26"/>
-        </w:rPr>
-        <w:t xml:space="preserve">Chấm điểm xác suất nghỉ bằng mô hình logistic, cảnh báo nhân viên có xác suất ≥ 0,3.</w:t>
-      </w:r>
-    </w:p>
-    <w:p>
-      <w:pPr>
-        <w:tabs>
-          <w:tab w:val="left" w:leader="none" w:pos="1080"/>
-        </w:tabs>
-        <w:spacing w:before="0" w:after="120" w:line="240" w:lineRule="auto"/>
-        <w:ind w:left="1080" w:hanging="360"/>
-        <w:jc w:val="both"/>
-      </w:pPr>
-      <w:r>
-        <w:rPr>
-          <w:rFonts w:ascii="Times New Roman" w:hAnsi="Times New Roman" w:cs="Times New Roman" w:eastAsia="Times New Roman"/>
-          <w:sz w:val="26"/>
-          <w:szCs w:val="26"/>
-        </w:rPr>
-        <w:t xml:space="preserve">3.</w:t>
-        <w:tab/>
-        <w:t xml:space="preserve"/>
-      </w:r>
-      <w:r>
-        <w:rPr>
-          <w:rFonts w:ascii="Times New Roman" w:hAnsi="Times New Roman" w:cs="Times New Roman" w:eastAsia="Times New Roman"/>
-          <w:sz w:val="26"/>
-          <w:szCs w:val="26"/>
-        </w:rPr>
-        <w:t xml:space="preserve">Quản lý trực tiếp trao đổi 1:1 với nhân viên được cảnh báo trong 2 tuần, ghi lại nguyên nhân và hành động.</w:t>
-      </w:r>
-    </w:p>
-    <w:p>
-      <w:pPr>
-        <w:tabs>
-          <w:tab w:val="left" w:leader="none" w:pos="1080"/>
-        </w:tabs>
-        <w:spacing w:before="0" w:after="240" w:line="240" w:lineRule="auto"/>
-        <w:ind w:left="1080" w:hanging="360"/>
-        <w:jc w:val="both"/>
-      </w:pPr>
-      <w:r>
-        <w:rPr>
-          <w:rFonts w:ascii="Times New Roman" w:hAnsi="Times New Roman" w:cs="Times New Roman" w:eastAsia="Times New Roman"/>
-          <w:sz w:val="26"/>
-          <w:szCs w:val="26"/>
-        </w:rPr>
-        <w:t xml:space="preserve">4.</w:t>
-        <w:tab/>
-        <w:t xml:space="preserve"/>
-      </w:r>
-      <w:r>
-        <w:rPr>
-          <w:rFonts w:ascii="Times New Roman" w:hAnsi="Times New Roman" w:cs="Times New Roman" w:eastAsia="Times New Roman"/>
-          <w:sz w:val="26"/>
-          <w:szCs w:val="26"/>
-        </w:rPr>
-        <w:t xml:space="preserve">Bắt đầu ngay với 19 nhân viên đang làm thuộc nhóm rủi ro cao (4–5 cờ).</w:t>
+        <w:t xml:space="preserve">HR có thể biến kết quả phân tích thành quy trình hàng quý: cập nhật dữ liệu nhân sự vào file Power BI; chấm điểm xác suất nghỉ bằng mô hình logistic và cảnh báo nhân viên có xác suất từ 0,3 trở lên; quản lý trực tiếp trao đổi 1:1 với người được cảnh báo trong 2 tuần và ghi lại nguyên nhân. Bước đầu tiên là làm việc ngay với 19 nhân viên đang làm thuộc nhóm rủi ro cao (4–5 cờ).</w:t>
       </w:r>
     </w:p>
     <w:p>
@@ -18222,15 +16576,15 @@
           <w:sz w:val="26"/>
           <w:szCs w:val="26"/>
         </w:rPr>
-        <w:t xml:space="preserve">Không phân biệt loại nghỉ việc:</w:t>
-      </w:r>
-      <w:r>
-        <w:rPr>
-          <w:rFonts w:ascii="Times New Roman" w:hAnsi="Times New Roman" w:cs="Times New Roman" w:eastAsia="Times New Roman"/>
-          <w:sz w:val="26"/>
-          <w:szCs w:val="26"/>
-        </w:rPr>
-        <w:t xml:space="preserve"> dữ liệu không tách nghỉ tự nguyện, bị cho thôi việc hay nghỉ hưu (nhóm 56–60 tuổi nghỉ 17,0%).</w:t>
+        <w:t xml:space="preserve">Một số biến yếu:</w:t>
+      </w:r>
+      <w:r>
+        <w:rPr>
+          <w:rFonts w:ascii="Times New Roman" w:hAnsi="Times New Roman" w:cs="Times New Roman" w:eastAsia="Times New Roman"/>
+          <w:sz w:val="26"/>
+          <w:szCs w:val="26"/>
+        </w:rPr>
+        <w:t xml:space="preserve"> điểm hiệu suất chỉ có 2 mức; 197 hồ sơ có số công ty từng làm mâu thuẫn; ba cột đơn giá không dùng được.</w:t>
       </w:r>
     </w:p>
     <w:p>
@@ -18260,15 +16614,35 @@
           <w:sz w:val="26"/>
           <w:szCs w:val="26"/>
         </w:rPr>
-        <w:t xml:space="preserve">Một số biến yếu:</w:t>
-      </w:r>
-      <w:r>
-        <w:rPr>
-          <w:rFonts w:ascii="Times New Roman" w:hAnsi="Times New Roman" w:cs="Times New Roman" w:eastAsia="Times New Roman"/>
-          <w:sz w:val="26"/>
-          <w:szCs w:val="26"/>
-        </w:rPr>
-        <w:t xml:space="preserve"> điểm hiệu suất chỉ có 2 mức; 197 hồ sơ có số công ty từng làm mâu thuẫn; ba cột đơn giá không dùng được.</w:t>
+        <w:t xml:space="preserve">Mẫu nhỏ ở một số nhóm:</w:t>
+      </w:r>
+      <w:r>
+        <w:rPr>
+          <w:rFonts w:ascii="Times New Roman" w:hAnsi="Times New Roman" w:cs="Times New Roman" w:eastAsia="Times New Roman"/>
+          <w:sz w:val="26"/>
+          <w:szCs w:val="26"/>
+        </w:rPr>
+        <w:t xml:space="preserve"> vừa đổi quản lý (n = 61), không đào tạo (n = 54), 3–4 thang Thấp (n = 28) – tỷ lệ ở các nhóm này dao động lớn.</w:t>
+      </w:r>
+    </w:p>
+    <w:p>
+      <w:pPr>
+        <w:pStyle w:val="Heading2"/>
+        <w:keepNext/>
+        <w:keepLines/>
+        <w:spacing w:before="120" w:after="240" w:line="240" w:lineRule="auto"/>
+        <w:ind w:left="0" w:firstLine="0"/>
+        <w:jc w:val="left"/>
+      </w:pPr>
+      <w:r>
+        <w:rPr>
+          <w:rFonts w:ascii="Times New Roman" w:hAnsi="Times New Roman" w:cs="Times New Roman" w:eastAsia="Times New Roman"/>
+          <w:b/>
+          <w:bCs/>
+          <w:sz w:val="26"/>
+          <w:szCs w:val="26"/>
+        </w:rPr>
+        <w:t xml:space="preserve">8.3. Hướng phát triển</w:t>
       </w:r>
     </w:p>
     <w:p>
@@ -18293,20 +16667,10 @@
       <w:r>
         <w:rPr>
           <w:rFonts w:ascii="Times New Roman" w:hAnsi="Times New Roman" w:cs="Times New Roman" w:eastAsia="Times New Roman"/>
-          <w:b/>
-          <w:bCs/>
-          <w:sz w:val="26"/>
-          <w:szCs w:val="26"/>
-        </w:rPr>
-        <w:t xml:space="preserve">Mẫu nhỏ ở một số nhóm:</w:t>
-      </w:r>
-      <w:r>
-        <w:rPr>
-          <w:rFonts w:ascii="Times New Roman" w:hAnsi="Times New Roman" w:cs="Times New Roman" w:eastAsia="Times New Roman"/>
-          <w:sz w:val="26"/>
-          <w:szCs w:val="26"/>
-        </w:rPr>
-        <w:t xml:space="preserve"> vừa đổi quản lý (n = 61), không đào tạo (n = 54), 3–4 thang Thấp (n = 28) – tỷ lệ ở các nhóm này dao động lớn.</w:t>
+          <w:sz w:val="26"/>
+          <w:szCs w:val="26"/>
+        </w:rPr>
+        <w:t xml:space="preserve">Thu thập dữ liệu theo thời gian (ngày vào, ngày nghỉ, lý do nghỉ qua phỏng vấn thôi việc) để dùng phân tích sống còn (survival analysis) – trả lời câu hỏi “nghỉ khi nào”.</w:t>
       </w:r>
     </w:p>
     <w:p>
@@ -18331,190 +16695,10 @@
       <w:r>
         <w:rPr>
           <w:rFonts w:ascii="Times New Roman" w:hAnsi="Times New Roman" w:cs="Times New Roman" w:eastAsia="Times New Roman"/>
-          <w:b/>
-          <w:bCs/>
-          <w:sz w:val="26"/>
-          <w:szCs w:val="26"/>
-        </w:rPr>
-        <w:t xml:space="preserve">Hiệu chỉnh mô hình:</w:t>
-      </w:r>
-      <w:r>
-        <w:rPr>
-          <w:rFonts w:ascii="Times New Roman" w:hAnsi="Times New Roman" w:cs="Times New Roman" w:eastAsia="Times New Roman"/>
-          <w:sz w:val="26"/>
-          <w:szCs w:val="26"/>
-        </w:rPr>
-        <w:t xml:space="preserve"> kiểm định Hosmer–Lemeshow cho thấy xác suất dự báo chưa hoàn toàn khớp thực tế.</w:t>
-      </w:r>
-    </w:p>
-    <w:p>
-      <w:pPr>
-        <w:tabs>
-          <w:tab w:val="left" w:leader="none" w:pos="1080"/>
-        </w:tabs>
-        <w:spacing w:before="0" w:after="240" w:line="240" w:lineRule="auto"/>
-        <w:ind w:left="1080" w:hanging="360"/>
-        <w:jc w:val="both"/>
-      </w:pPr>
-      <w:r>
-        <w:rPr>
-          <w:rFonts w:ascii="Times New Roman" w:hAnsi="Times New Roman" w:cs="Times New Roman" w:eastAsia="Times New Roman"/>
-          <w:sz w:val="26"/>
-          <w:szCs w:val="26"/>
-        </w:rPr>
-        <w:t xml:space="preserve">•</w:t>
-        <w:tab/>
-        <w:t xml:space="preserve"/>
-      </w:r>
-      <w:r>
-        <w:rPr>
-          <w:rFonts w:ascii="Times New Roman" w:hAnsi="Times New Roman" w:cs="Times New Roman" w:eastAsia="Times New Roman"/>
-          <w:b/>
-          <w:bCs/>
-          <w:sz w:val="26"/>
-          <w:szCs w:val="26"/>
-        </w:rPr>
-        <w:t xml:space="preserve">Giả định chi phí:</w:t>
-      </w:r>
-      <w:r>
-        <w:rPr>
-          <w:rFonts w:ascii="Times New Roman" w:hAnsi="Times New Roman" w:cs="Times New Roman" w:eastAsia="Times New Roman"/>
-          <w:sz w:val="26"/>
-          <w:szCs w:val="26"/>
-        </w:rPr>
-        <w:t xml:space="preserve"> tỷ lệ chi phí thay thế 50% là giả định; dashboard cho phép thay đổi từ 25% đến 150%.</w:t>
-      </w:r>
-    </w:p>
-    <w:p>
-      <w:pPr>
-        <w:pStyle w:val="Heading2"/>
-        <w:keepNext/>
-        <w:keepLines/>
-        <w:spacing w:before="120" w:after="240" w:line="240" w:lineRule="auto"/>
-        <w:ind w:left="0" w:firstLine="0"/>
-        <w:jc w:val="left"/>
-      </w:pPr>
-      <w:r>
-        <w:rPr>
-          <w:rFonts w:ascii="Times New Roman" w:hAnsi="Times New Roman" w:cs="Times New Roman" w:eastAsia="Times New Roman"/>
-          <w:b/>
-          <w:bCs/>
-          <w:sz w:val="26"/>
-          <w:szCs w:val="26"/>
-        </w:rPr>
-        <w:t xml:space="preserve">8.3. Hướng phát triển</w:t>
-      </w:r>
-    </w:p>
-    <w:p>
-      <w:pPr>
-        <w:tabs>
-          <w:tab w:val="left" w:leader="none" w:pos="1080"/>
-        </w:tabs>
-        <w:spacing w:before="0" w:after="120" w:line="240" w:lineRule="auto"/>
-        <w:ind w:left="1080" w:hanging="360"/>
-        <w:jc w:val="both"/>
-      </w:pPr>
-      <w:r>
-        <w:rPr>
-          <w:rFonts w:ascii="Times New Roman" w:hAnsi="Times New Roman" w:cs="Times New Roman" w:eastAsia="Times New Roman"/>
-          <w:sz w:val="26"/>
-          <w:szCs w:val="26"/>
-        </w:rPr>
-        <w:t xml:space="preserve">•</w:t>
-        <w:tab/>
-        <w:t xml:space="preserve"/>
-      </w:r>
-      <w:r>
-        <w:rPr>
-          <w:rFonts w:ascii="Times New Roman" w:hAnsi="Times New Roman" w:cs="Times New Roman" w:eastAsia="Times New Roman"/>
-          <w:sz w:val="26"/>
-          <w:szCs w:val="26"/>
-        </w:rPr>
-        <w:t xml:space="preserve">Thu thập dữ liệu theo thời gian (ngày vào, ngày nghỉ, lý do nghỉ qua phỏng vấn thôi việc) để dùng phân tích sống còn (survival analysis) – trả lời câu hỏi “nghỉ khi nào”.</w:t>
-      </w:r>
-    </w:p>
-    <w:p>
-      <w:pPr>
-        <w:tabs>
-          <w:tab w:val="left" w:leader="none" w:pos="1080"/>
-        </w:tabs>
-        <w:spacing w:before="0" w:after="120" w:line="240" w:lineRule="auto"/>
-        <w:ind w:left="1080" w:hanging="360"/>
-        <w:jc w:val="both"/>
-      </w:pPr>
-      <w:r>
-        <w:rPr>
-          <w:rFonts w:ascii="Times New Roman" w:hAnsi="Times New Roman" w:cs="Times New Roman" w:eastAsia="Times New Roman"/>
-          <w:sz w:val="26"/>
-          <w:szCs w:val="26"/>
-        </w:rPr>
-        <w:t xml:space="preserve">•</w:t>
-        <w:tab/>
-        <w:t xml:space="preserve"/>
-      </w:r>
-      <w:r>
-        <w:rPr>
-          <w:rFonts w:ascii="Times New Roman" w:hAnsi="Times New Roman" w:cs="Times New Roman" w:eastAsia="Times New Roman"/>
-          <w:sz w:val="26"/>
-          <w:szCs w:val="26"/>
-        </w:rPr>
-        <w:t xml:space="preserve">Thử các mô hình phi tuyến (Random Forest, Gradient Boosting) kèm giải thích SHAP, so sánh với logistic.</w:t>
-      </w:r>
-    </w:p>
-    <w:p>
-      <w:pPr>
-        <w:tabs>
-          <w:tab w:val="left" w:leader="none" w:pos="1080"/>
-        </w:tabs>
-        <w:spacing w:before="0" w:after="120" w:line="240" w:lineRule="auto"/>
-        <w:ind w:left="1080" w:hanging="360"/>
-        <w:jc w:val="both"/>
-      </w:pPr>
-      <w:r>
-        <w:rPr>
-          <w:rFonts w:ascii="Times New Roman" w:hAnsi="Times New Roman" w:cs="Times New Roman" w:eastAsia="Times New Roman"/>
-          <w:sz w:val="26"/>
-          <w:szCs w:val="26"/>
-        </w:rPr>
-        <w:t xml:space="preserve">•</w:t>
-        <w:tab/>
-        <w:t xml:space="preserve"/>
-      </w:r>
-      <w:r>
-        <w:rPr>
-          <w:rFonts w:ascii="Times New Roman" w:hAnsi="Times New Roman" w:cs="Times New Roman" w:eastAsia="Times New Roman"/>
           <w:sz w:val="26"/>
           <w:szCs w:val="26"/>
         </w:rPr>
         <w:t xml:space="preserve">Đánh giá tác động thật của giải pháp bằng thí điểm có nhóm đối chứng (A/B), đặc biệt với giới hạn làm thêm giờ và cổ phiếu.</w:t>
-      </w:r>
-    </w:p>
-    <w:p>
-      <w:pPr>
-        <w:tabs>
-          <w:tab w:val="left" w:leader="none" w:pos="1080"/>
-        </w:tabs>
-        <w:spacing w:before="0" w:after="240" w:line="240" w:lineRule="auto"/>
-        <w:ind w:left="1080" w:hanging="360"/>
-        <w:jc w:val="both"/>
-      </w:pPr>
-      <w:r>
-        <w:rPr>
-          <w:rFonts w:ascii="Times New Roman" w:hAnsi="Times New Roman" w:cs="Times New Roman" w:eastAsia="Times New Roman"/>
-          <w:sz w:val="26"/>
-          <w:szCs w:val="26"/>
-        </w:rPr>
-        <w:t xml:space="preserve">•</w:t>
-        <w:tab/>
-        <w:t xml:space="preserve"/>
-      </w:r>
-      <w:r>
-        <w:rPr>
-          <w:rFonts w:ascii="Times New Roman" w:hAnsi="Times New Roman" w:cs="Times New Roman" w:eastAsia="Times New Roman"/>
-          <w:sz w:val="26"/>
-          <w:szCs w:val="26"/>
-        </w:rPr>
-        <w:t xml:space="preserve">Tích hợp điểm rủi ro của mô hình vào dashboard Power BI (qua Python visual hoặc cột điểm tính sẵn) và làm mới dữ liệu tự động hàng tháng.</w:t>
       </w:r>
     </w:p>
     <w:p>

</xml_diff>